<commit_message>
Sync ib2027 content with ib2026 main
</commit_message>
<xml_diff>
--- a/hw/P1.docx
+++ b/hw/P1.docx
@@ -22,9 +22,9 @@
             <w:shd w:fill="0F172A"/>
             <w:tcMar>
               <w:top w:w="190" w:type="dxa"/>
-              <w:start w:w="220" w:type="dxa"/>
+              <w:left w:w="220" w:type="dxa"/>
               <w:bottom w:w="190" w:type="dxa"/>
-              <w:end w:w="220" w:type="dxa"/>
+              <w:right w:w="220" w:type="dxa"/>
             </w:tcMar>
           </w:tcPr>
           <w:p>
@@ -49,7 +49,7 @@
               <w:rPr>
                 <w:rFonts w:ascii="Arial" w:hAnsi="Arial"/>
                 <w:color w:val="CBD5E1"/>
-                <w:sz w:val="19"/>
+                <w:sz w:val="20"/>
               </w:rPr>
               <w:t>Hardware A1–A14  ·  ca. 35–40 Minuten  ·  ohne Kursseiten</w:t>
             </w:r>
@@ -84,9 +84,9 @@
             <w:vAlign w:val="center"/>
             <w:tcMar>
               <w:top w:w="110" w:type="dxa"/>
-              <w:start w:w="120" w:type="dxa"/>
+              <w:left w:w="120" w:type="dxa"/>
               <w:bottom w:w="120" w:type="dxa"/>
-              <w:end w:w="120" w:type="dxa"/>
+              <w:right w:w="120" w:type="dxa"/>
             </w:tcMar>
             <w:tcBorders>
               <w:bottom w:val="single" w:sz="8" w:color="CBD5E1"/>
@@ -97,24 +97,18 @@
               <w:rPr>
                 <w:b/>
                 <w:color w:val="64748B"/>
-                <w:sz w:val="15"/>
+                <w:sz w:val="20"/>
               </w:rPr>
               <w:t>VORNAME / NAME</w:t>
             </w:r>
           </w:p>
           <w:p>
             <w:pPr>
-              <w:spacing w:before="100" w:after="0"/>
+              <w:spacing w:before="20" w:after="20" w:line="240" w:lineRule="auto"/>
               <w:pBdr>
-                <w:bottom w:val="single" w:sz="6" w:space="1" w:color="94A3B8"/>
+                <w:bottom w:val="single" w:sz="5" w:space="1" w:color="CBD5E1"/>
               </w:pBdr>
             </w:pPr>
-            <w:r>
-              <w:rPr>
-                <w:sz w:val="16"/>
-              </w:rPr>
-              <w:t xml:space="preserve"> </w:t>
-            </w:r>
           </w:p>
         </w:tc>
         <w:tc>
@@ -123,9 +117,9 @@
             <w:vAlign w:val="center"/>
             <w:tcMar>
               <w:top w:w="110" w:type="dxa"/>
-              <w:start w:w="120" w:type="dxa"/>
+              <w:left w:w="120" w:type="dxa"/>
               <w:bottom w:w="120" w:type="dxa"/>
-              <w:end w:w="120" w:type="dxa"/>
+              <w:right w:w="120" w:type="dxa"/>
             </w:tcMar>
             <w:tcBorders>
               <w:bottom w:val="single" w:sz="8" w:color="CBD5E1"/>
@@ -136,24 +130,18 @@
               <w:rPr>
                 <w:b/>
                 <w:color w:val="64748B"/>
-                <w:sz w:val="15"/>
+                <w:sz w:val="20"/>
               </w:rPr>
               <w:t>KLASSE</w:t>
             </w:r>
           </w:p>
           <w:p>
             <w:pPr>
-              <w:spacing w:before="100" w:after="0"/>
+              <w:spacing w:before="20" w:after="20" w:line="240" w:lineRule="auto"/>
               <w:pBdr>
-                <w:bottom w:val="single" w:sz="6" w:space="1" w:color="94A3B8"/>
+                <w:bottom w:val="single" w:sz="5" w:space="1" w:color="CBD5E1"/>
               </w:pBdr>
             </w:pPr>
-            <w:r>
-              <w:rPr>
-                <w:sz w:val="16"/>
-              </w:rPr>
-              <w:t xml:space="preserve"> </w:t>
-            </w:r>
           </w:p>
         </w:tc>
         <w:tc>
@@ -162,9 +150,9 @@
             <w:vAlign w:val="center"/>
             <w:tcMar>
               <w:top w:w="110" w:type="dxa"/>
-              <w:start w:w="120" w:type="dxa"/>
+              <w:left w:w="120" w:type="dxa"/>
               <w:bottom w:w="120" w:type="dxa"/>
-              <w:end w:w="120" w:type="dxa"/>
+              <w:right w:w="120" w:type="dxa"/>
             </w:tcMar>
             <w:tcBorders>
               <w:bottom w:val="single" w:sz="8" w:color="CBD5E1"/>
@@ -175,24 +163,18 @@
               <w:rPr>
                 <w:b/>
                 <w:color w:val="64748B"/>
-                <w:sz w:val="15"/>
+                <w:sz w:val="20"/>
               </w:rPr>
               <w:t>DATUM</w:t>
             </w:r>
           </w:p>
           <w:p>
             <w:pPr>
-              <w:spacing w:before="100" w:after="0"/>
+              <w:spacing w:before="20" w:after="20" w:line="240" w:lineRule="auto"/>
               <w:pBdr>
-                <w:bottom w:val="single" w:sz="6" w:space="1" w:color="94A3B8"/>
+                <w:bottom w:val="single" w:sz="5" w:space="1" w:color="CBD5E1"/>
               </w:pBdr>
             </w:pPr>
-            <w:r>
-              <w:rPr>
-                <w:sz w:val="16"/>
-              </w:rPr>
-              <w:t xml:space="preserve"> </w:t>
-            </w:r>
           </w:p>
         </w:tc>
       </w:tr>
@@ -219,9 +201,9 @@
             <w:shd w:fill="EFF6FF"/>
             <w:tcMar>
               <w:top w:w="120" w:type="dxa"/>
-              <w:start w:w="120" w:type="dxa"/>
+              <w:left w:w="120" w:type="dxa"/>
               <w:bottom w:w="120" w:type="dxa"/>
-              <w:end w:w="120" w:type="dxa"/>
+              <w:right w:w="120" w:type="dxa"/>
             </w:tcMar>
             <w:tcBorders>
               <w:top w:val="single" w:sz="5" w:color="BFDBFE"/>
@@ -238,7 +220,7 @@
               <w:rPr>
                 <w:b/>
                 <w:color w:val="64748B"/>
-                <w:sz w:val="15"/>
+                <w:sz w:val="20"/>
               </w:rPr>
               <w:t>ERREICHTE PUNKTE</w:t>
               <w:br/>
@@ -259,9 +241,9 @@
             <w:shd w:fill="EFF6FF"/>
             <w:tcMar>
               <w:top w:w="120" w:type="dxa"/>
-              <w:start w:w="120" w:type="dxa"/>
+              <w:left w:w="120" w:type="dxa"/>
               <w:bottom w:w="120" w:type="dxa"/>
-              <w:end w:w="120" w:type="dxa"/>
+              <w:right w:w="120" w:type="dxa"/>
             </w:tcMar>
             <w:tcBorders>
               <w:top w:val="single" w:sz="5" w:color="BFDBFE"/>
@@ -278,7 +260,7 @@
               <w:rPr>
                 <w:b/>
                 <w:color w:val="64748B"/>
-                <w:sz w:val="15"/>
+                <w:sz w:val="20"/>
               </w:rPr>
               <w:t>GESAMTPUNKTE</w:t>
               <w:br/>
@@ -299,9 +281,9 @@
             <w:shd w:fill="ECFDF5"/>
             <w:tcMar>
               <w:top w:w="120" w:type="dxa"/>
-              <w:start w:w="120" w:type="dxa"/>
+              <w:left w:w="120" w:type="dxa"/>
               <w:bottom w:w="120" w:type="dxa"/>
-              <w:end w:w="120" w:type="dxa"/>
+              <w:right w:w="120" w:type="dxa"/>
             </w:tcMar>
             <w:tcBorders>
               <w:top w:val="single" w:sz="5" w:color="BFDBFE"/>
@@ -318,7 +300,7 @@
               <w:rPr>
                 <w:b/>
                 <w:color w:val="64748B"/>
-                <w:sz w:val="15"/>
+                <w:sz w:val="20"/>
               </w:rPr>
               <w:t>NOTE</w:t>
               <w:br/>
@@ -343,7 +325,7 @@
         <w:rPr>
           <w:b/>
           <w:color w:val="64748B"/>
-          <w:sz w:val="16"/>
+          <w:sz w:val="20"/>
         </w:rPr>
         <w:t>NOTENSCHLÜSSEL</w:t>
       </w:r>
@@ -372,9 +354,9 @@
             <w:tcW w:type="dxa" w:w="1621"/>
             <w:tcMar>
               <w:top w:w="65" w:type="dxa"/>
-              <w:start w:w="50" w:type="dxa"/>
+              <w:left w:w="50" w:type="dxa"/>
               <w:bottom w:w="65" w:type="dxa"/>
-              <w:end w:w="50" w:type="dxa"/>
+              <w:right w:w="50" w:type="dxa"/>
             </w:tcMar>
             <w:vAlign w:val="center"/>
             <w:tcBorders>
@@ -393,7 +375,7 @@
               <w:rPr>
                 <w:b w:val="0"/>
                 <w:color w:val="64748B"/>
-                <w:sz w:val="17"/>
+                <w:sz w:val="20"/>
               </w:rPr>
               <w:t>41 P</w:t>
             </w:r>
@@ -404,9 +386,9 @@
             <w:tcW w:type="dxa" w:w="1621"/>
             <w:tcMar>
               <w:top w:w="65" w:type="dxa"/>
-              <w:start w:w="50" w:type="dxa"/>
+              <w:left w:w="50" w:type="dxa"/>
               <w:bottom w:w="65" w:type="dxa"/>
-              <w:end w:w="50" w:type="dxa"/>
+              <w:right w:w="50" w:type="dxa"/>
             </w:tcMar>
             <w:vAlign w:val="center"/>
             <w:tcBorders>
@@ -425,7 +407,7 @@
               <w:rPr>
                 <w:b w:val="0"/>
                 <w:color w:val="64748B"/>
-                <w:sz w:val="17"/>
+                <w:sz w:val="20"/>
               </w:rPr>
               <w:t>33 P</w:t>
             </w:r>
@@ -436,9 +418,9 @@
             <w:tcW w:type="dxa" w:w="1621"/>
             <w:tcMar>
               <w:top w:w="65" w:type="dxa"/>
-              <w:start w:w="50" w:type="dxa"/>
+              <w:left w:w="50" w:type="dxa"/>
               <w:bottom w:w="65" w:type="dxa"/>
-              <w:end w:w="50" w:type="dxa"/>
+              <w:right w:w="50" w:type="dxa"/>
             </w:tcMar>
             <w:vAlign w:val="center"/>
             <w:tcBorders>
@@ -457,7 +439,7 @@
               <w:rPr>
                 <w:b w:val="0"/>
                 <w:color w:val="64748B"/>
-                <w:sz w:val="17"/>
+                <w:sz w:val="20"/>
               </w:rPr>
               <w:t>25 P</w:t>
             </w:r>
@@ -468,9 +450,9 @@
             <w:tcW w:type="dxa" w:w="1621"/>
             <w:tcMar>
               <w:top w:w="65" w:type="dxa"/>
-              <w:start w:w="50" w:type="dxa"/>
+              <w:left w:w="50" w:type="dxa"/>
               <w:bottom w:w="65" w:type="dxa"/>
-              <w:end w:w="50" w:type="dxa"/>
+              <w:right w:w="50" w:type="dxa"/>
             </w:tcMar>
             <w:vAlign w:val="center"/>
             <w:tcBorders>
@@ -489,7 +471,7 @@
               <w:rPr>
                 <w:b w:val="0"/>
                 <w:color w:val="64748B"/>
-                <w:sz w:val="17"/>
+                <w:sz w:val="20"/>
               </w:rPr>
               <w:t>17 P</w:t>
             </w:r>
@@ -500,9 +482,9 @@
             <w:tcW w:type="dxa" w:w="1621"/>
             <w:tcMar>
               <w:top w:w="65" w:type="dxa"/>
-              <w:start w:w="50" w:type="dxa"/>
+              <w:left w:w="50" w:type="dxa"/>
               <w:bottom w:w="65" w:type="dxa"/>
-              <w:end w:w="50" w:type="dxa"/>
+              <w:right w:w="50" w:type="dxa"/>
             </w:tcMar>
             <w:vAlign w:val="center"/>
             <w:tcBorders>
@@ -521,7 +503,7 @@
               <w:rPr>
                 <w:b w:val="0"/>
                 <w:color w:val="64748B"/>
-                <w:sz w:val="17"/>
+                <w:sz w:val="20"/>
               </w:rPr>
               <w:t>9 P</w:t>
             </w:r>
@@ -532,9 +514,9 @@
             <w:tcW w:type="dxa" w:w="1621"/>
             <w:tcMar>
               <w:top w:w="65" w:type="dxa"/>
-              <w:start w:w="50" w:type="dxa"/>
+              <w:left w:w="50" w:type="dxa"/>
               <w:bottom w:w="65" w:type="dxa"/>
-              <w:end w:w="50" w:type="dxa"/>
+              <w:right w:w="50" w:type="dxa"/>
             </w:tcMar>
             <w:vAlign w:val="center"/>
             <w:tcBorders>
@@ -553,7 +535,7 @@
               <w:rPr>
                 <w:b w:val="0"/>
                 <w:color w:val="64748B"/>
-                <w:sz w:val="17"/>
+                <w:sz w:val="20"/>
               </w:rPr>
               <w:t>0 P</w:t>
             </w:r>
@@ -569,9 +551,9 @@
             <w:tcW w:type="dxa" w:w="1621"/>
             <w:tcMar>
               <w:top w:w="65" w:type="dxa"/>
-              <w:start w:w="50" w:type="dxa"/>
+              <w:left w:w="50" w:type="dxa"/>
               <w:bottom w:w="65" w:type="dxa"/>
-              <w:end w:w="50" w:type="dxa"/>
+              <w:right w:w="50" w:type="dxa"/>
             </w:tcMar>
             <w:vAlign w:val="center"/>
             <w:tcBorders>
@@ -589,7 +571,7 @@
               <w:rPr>
                 <w:b/>
                 <w:color w:val="0F172A"/>
-                <w:sz w:val="17"/>
+                <w:sz w:val="20"/>
               </w:rPr>
               <w:t>6.0</w:t>
             </w:r>
@@ -600,9 +582,9 @@
             <w:tcW w:type="dxa" w:w="1621"/>
             <w:tcMar>
               <w:top w:w="65" w:type="dxa"/>
-              <w:start w:w="50" w:type="dxa"/>
+              <w:left w:w="50" w:type="dxa"/>
               <w:bottom w:w="65" w:type="dxa"/>
-              <w:end w:w="50" w:type="dxa"/>
+              <w:right w:w="50" w:type="dxa"/>
             </w:tcMar>
             <w:vAlign w:val="center"/>
             <w:tcBorders>
@@ -620,7 +602,7 @@
               <w:rPr>
                 <w:b/>
                 <w:color w:val="0F172A"/>
-                <w:sz w:val="17"/>
+                <w:sz w:val="20"/>
               </w:rPr>
               <w:t>5.0</w:t>
             </w:r>
@@ -631,9 +613,9 @@
             <w:tcW w:type="dxa" w:w="1621"/>
             <w:tcMar>
               <w:top w:w="65" w:type="dxa"/>
-              <w:start w:w="50" w:type="dxa"/>
+              <w:left w:w="50" w:type="dxa"/>
               <w:bottom w:w="65" w:type="dxa"/>
-              <w:end w:w="50" w:type="dxa"/>
+              <w:right w:w="50" w:type="dxa"/>
             </w:tcMar>
             <w:vAlign w:val="center"/>
             <w:tcBorders>
@@ -651,7 +633,7 @@
               <w:rPr>
                 <w:b/>
                 <w:color w:val="0F172A"/>
-                <w:sz w:val="17"/>
+                <w:sz w:val="20"/>
               </w:rPr>
               <w:t>4.0</w:t>
             </w:r>
@@ -662,9 +644,9 @@
             <w:tcW w:type="dxa" w:w="1621"/>
             <w:tcMar>
               <w:top w:w="65" w:type="dxa"/>
-              <w:start w:w="50" w:type="dxa"/>
+              <w:left w:w="50" w:type="dxa"/>
               <w:bottom w:w="65" w:type="dxa"/>
-              <w:end w:w="50" w:type="dxa"/>
+              <w:right w:w="50" w:type="dxa"/>
             </w:tcMar>
             <w:vAlign w:val="center"/>
             <w:tcBorders>
@@ -682,7 +664,7 @@
               <w:rPr>
                 <w:b/>
                 <w:color w:val="0F172A"/>
-                <w:sz w:val="17"/>
+                <w:sz w:val="20"/>
               </w:rPr>
               <w:t>3.0</w:t>
             </w:r>
@@ -693,9 +675,9 @@
             <w:tcW w:type="dxa" w:w="1621"/>
             <w:tcMar>
               <w:top w:w="65" w:type="dxa"/>
-              <w:start w:w="50" w:type="dxa"/>
+              <w:left w:w="50" w:type="dxa"/>
               <w:bottom w:w="65" w:type="dxa"/>
-              <w:end w:w="50" w:type="dxa"/>
+              <w:right w:w="50" w:type="dxa"/>
             </w:tcMar>
             <w:vAlign w:val="center"/>
             <w:tcBorders>
@@ -713,7 +695,7 @@
               <w:rPr>
                 <w:b/>
                 <w:color w:val="0F172A"/>
-                <w:sz w:val="17"/>
+                <w:sz w:val="20"/>
               </w:rPr>
               <w:t>2.0</w:t>
             </w:r>
@@ -724,9 +706,9 @@
             <w:tcW w:type="dxa" w:w="1621"/>
             <w:tcMar>
               <w:top w:w="65" w:type="dxa"/>
-              <w:start w:w="50" w:type="dxa"/>
+              <w:left w:w="50" w:type="dxa"/>
               <w:bottom w:w="65" w:type="dxa"/>
-              <w:end w:w="50" w:type="dxa"/>
+              <w:right w:w="50" w:type="dxa"/>
             </w:tcMar>
             <w:vAlign w:val="center"/>
             <w:tcBorders>
@@ -744,7 +726,7 @@
               <w:rPr>
                 <w:b/>
                 <w:color w:val="0F172A"/>
-                <w:sz w:val="17"/>
+                <w:sz w:val="20"/>
               </w:rPr>
               <w:t>1.0</w:t>
             </w:r>
@@ -769,6 +751,7 @@
       <w:pPr>
         <w:pStyle w:val="Heading1"/>
         <w:keepNext w:val="1"/>
+        <w:spacing w:before="140" w:after="80"/>
       </w:pPr>
       <w:r>
         <w:rPr>
@@ -792,7 +775,7 @@
       <w:r>
         <w:rPr>
           <w:color w:val="64748B"/>
-          <w:sz w:val="19"/>
+          <w:sz w:val="20"/>
         </w:rPr>
         <w:t>Kreuze bei jeder Komponente die richtige Aussage an. Genau eine Aussage ist korrekt.</w:t>
       </w:r>
@@ -801,6 +784,7 @@
       <w:pPr>
         <w:pStyle w:val="Heading2"/>
         <w:keepNext w:val="1"/>
+        <w:spacing w:before="80" w:after="40"/>
       </w:pPr>
       <w:r>
         <w:t>CPU</w:t>
@@ -815,7 +799,7 @@
       <w:r>
         <w:rPr>
           <w:rFonts w:ascii="Arial" w:hAnsi="Arial"/>
-          <w:sz w:val="18"/>
+          <w:sz w:val="20"/>
         </w:rPr>
         <w:t>☐  Speichert Dateien auch ohne Strom dauerhaft.</w:t>
       </w:r>
@@ -829,7 +813,7 @@
       <w:r>
         <w:rPr>
           <w:rFonts w:ascii="Arial" w:hAnsi="Arial"/>
-          <w:sz w:val="18"/>
+          <w:sz w:val="20"/>
         </w:rPr>
         <w:t>☐  Führt Berechnungen aus und verarbeitet Befehle von Programmen.</w:t>
       </w:r>
@@ -843,7 +827,7 @@
       <w:r>
         <w:rPr>
           <w:rFonts w:ascii="Arial" w:hAnsi="Arial"/>
-          <w:sz w:val="18"/>
+          <w:sz w:val="20"/>
         </w:rPr>
         <w:t>☐  Liefert dem Computer die benötigte elektrische Energie.</w:t>
       </w:r>
@@ -857,7 +841,7 @@
       <w:r>
         <w:rPr>
           <w:rFonts w:ascii="Arial" w:hAnsi="Arial"/>
-          <w:sz w:val="18"/>
+          <w:sz w:val="20"/>
         </w:rPr>
         <w:t>☐  Ist hauptsächlich dafür zuständig, Bilder auf dem Bildschirm darzustellen.</w:t>
       </w:r>
@@ -866,6 +850,7 @@
       <w:pPr>
         <w:pStyle w:val="Heading2"/>
         <w:keepNext w:val="1"/>
+        <w:spacing w:before="80" w:after="40"/>
       </w:pPr>
       <w:r>
         <w:t>RAM</w:t>
@@ -880,7 +865,7 @@
       <w:r>
         <w:rPr>
           <w:rFonts w:ascii="Arial" w:hAnsi="Arial"/>
-          <w:sz w:val="18"/>
+          <w:sz w:val="20"/>
         </w:rPr>
         <w:t>☐  Speichert Fotos und Dokumente dauerhaft.</w:t>
       </w:r>
@@ -894,7 +879,7 @@
       <w:r>
         <w:rPr>
           <w:rFonts w:ascii="Arial" w:hAnsi="Arial"/>
-          <w:sz w:val="18"/>
+          <w:sz w:val="20"/>
         </w:rPr>
         <w:t>☐  Verbindet die verschiedenen Hardware-Komponenten miteinander.</w:t>
       </w:r>
@@ -908,7 +893,7 @@
       <w:r>
         <w:rPr>
           <w:rFonts w:ascii="Arial" w:hAnsi="Arial"/>
-          <w:sz w:val="18"/>
+          <w:sz w:val="20"/>
         </w:rPr>
         <w:t>☐  Hält aktuell benötigte Daten und Programme kurzfristig bereit.</w:t>
       </w:r>
@@ -922,7 +907,7 @@
       <w:r>
         <w:rPr>
           <w:rFonts w:ascii="Arial" w:hAnsi="Arial"/>
-          <w:sz w:val="18"/>
+          <w:sz w:val="20"/>
         </w:rPr>
         <w:t>☐  Wandelt den Strom aus der Steckdose für die PC-Komponenten um.</w:t>
       </w:r>
@@ -931,6 +916,7 @@
       <w:pPr>
         <w:pStyle w:val="Heading2"/>
         <w:keepNext w:val="1"/>
+        <w:spacing w:before="80" w:after="40"/>
       </w:pPr>
       <w:r>
         <w:t>SSD</w:t>
@@ -945,7 +931,7 @@
       <w:r>
         <w:rPr>
           <w:rFonts w:ascii="Arial" w:hAnsi="Arial"/>
-          <w:sz w:val="18"/>
+          <w:sz w:val="20"/>
         </w:rPr>
         <w:t>☐  Speichert Daten dauerhaft und verwendet keine beweglichen mechanischen Teile.</w:t>
       </w:r>
@@ -959,7 +945,7 @@
       <w:r>
         <w:rPr>
           <w:rFonts w:ascii="Arial" w:hAnsi="Arial"/>
-          <w:sz w:val="18"/>
+          <w:sz w:val="20"/>
         </w:rPr>
         <w:t>☐  Führt die eigentlichen Berechnungen eines Programms aus.</w:t>
       </w:r>
@@ -973,7 +959,7 @@
       <w:r>
         <w:rPr>
           <w:rFonts w:ascii="Arial" w:hAnsi="Arial"/>
-          <w:sz w:val="18"/>
+          <w:sz w:val="20"/>
         </w:rPr>
         <w:t>☐  Speichert Daten nur solange der Computer eingeschaltet ist.</w:t>
       </w:r>
@@ -987,7 +973,7 @@
       <w:r>
         <w:rPr>
           <w:rFonts w:ascii="Arial" w:hAnsi="Arial"/>
-          <w:sz w:val="18"/>
+          <w:sz w:val="20"/>
         </w:rPr>
         <w:t>☐  Ist eine langsamere Variante des Arbeitsspeichers.</w:t>
       </w:r>
@@ -996,6 +982,7 @@
       <w:pPr>
         <w:pStyle w:val="Heading2"/>
         <w:keepNext w:val="1"/>
+        <w:spacing w:before="80" w:after="40"/>
       </w:pPr>
       <w:r>
         <w:t>HDD</w:t>
@@ -1010,7 +997,7 @@
       <w:r>
         <w:rPr>
           <w:rFonts w:ascii="Arial" w:hAnsi="Arial"/>
-          <w:sz w:val="18"/>
+          <w:sz w:val="20"/>
         </w:rPr>
         <w:t>☐  Berechnet 3D-Grafiken für Spiele.</w:t>
       </w:r>
@@ -1024,7 +1011,7 @@
       <w:r>
         <w:rPr>
           <w:rFonts w:ascii="Arial" w:hAnsi="Arial"/>
-          <w:sz w:val="18"/>
+          <w:sz w:val="20"/>
         </w:rPr>
         <w:t>☐  Ist ein dauerhafter Speicher mit mechanisch beweglichen Teilen.</w:t>
       </w:r>
@@ -1038,7 +1025,7 @@
       <w:r>
         <w:rPr>
           <w:rFonts w:ascii="Arial" w:hAnsi="Arial"/>
-          <w:sz w:val="18"/>
+          <w:sz w:val="20"/>
         </w:rPr>
         <w:t>☐  Ist grundsätzlich schneller als eine SSD.</w:t>
       </w:r>
@@ -1052,7 +1039,7 @@
       <w:r>
         <w:rPr>
           <w:rFonts w:ascii="Arial" w:hAnsi="Arial"/>
-          <w:sz w:val="18"/>
+          <w:sz w:val="20"/>
         </w:rPr>
         <w:t>☐  Wird als kurzfristiger Arbeitsspeicher für geöffnete Programme verwendet.</w:t>
       </w:r>
@@ -1061,6 +1048,7 @@
       <w:pPr>
         <w:pStyle w:val="Heading2"/>
         <w:keepNext w:val="1"/>
+        <w:spacing w:before="80" w:after="40"/>
       </w:pPr>
       <w:r>
         <w:t>Mainboard</w:t>
@@ -1075,7 +1063,7 @@
       <w:r>
         <w:rPr>
           <w:rFonts w:ascii="Arial" w:hAnsi="Arial"/>
-          <w:sz w:val="18"/>
+          <w:sz w:val="20"/>
         </w:rPr>
         <w:t>☐  Speichert das Betriebssystem dauerhaft.</w:t>
       </w:r>
@@ -1089,7 +1077,7 @@
       <w:r>
         <w:rPr>
           <w:rFonts w:ascii="Arial" w:hAnsi="Arial"/>
-          <w:sz w:val="18"/>
+          <w:sz w:val="20"/>
         </w:rPr>
         <w:t>☐  Versorgt sämtliche Komponenten direkt mit Strom aus der Steckdose.</w:t>
       </w:r>
@@ -1103,7 +1091,7 @@
       <w:r>
         <w:rPr>
           <w:rFonts w:ascii="Arial" w:hAnsi="Arial"/>
-          <w:sz w:val="18"/>
+          <w:sz w:val="20"/>
         </w:rPr>
         <w:t>☐  Kühlt Prozessor und Grafikkarte.</w:t>
       </w:r>
@@ -1117,7 +1105,7 @@
       <w:r>
         <w:rPr>
           <w:rFonts w:ascii="Arial" w:hAnsi="Arial"/>
-          <w:sz w:val="18"/>
+          <w:sz w:val="20"/>
         </w:rPr>
         <w:t>☐  Verbindet zentrale Komponenten und ermöglicht deren Kommunikation untereinander.</w:t>
       </w:r>
@@ -1126,6 +1114,7 @@
       <w:pPr>
         <w:pStyle w:val="Heading2"/>
         <w:keepNext w:val="1"/>
+        <w:spacing w:before="80" w:after="40"/>
       </w:pPr>
       <w:r>
         <w:t>Netzteil</w:t>
@@ -1140,7 +1129,7 @@
       <w:r>
         <w:rPr>
           <w:rFonts w:ascii="Arial" w:hAnsi="Arial"/>
-          <w:sz w:val="18"/>
+          <w:sz w:val="20"/>
         </w:rPr>
         <w:t>☐  Wandelt Netzstrom um und versorgt die PC-Komponenten mit geeigneter elektrischer Energie.</w:t>
       </w:r>
@@ -1154,7 +1143,7 @@
       <w:r>
         <w:rPr>
           <w:rFonts w:ascii="Arial" w:hAnsi="Arial"/>
-          <w:sz w:val="18"/>
+          <w:sz w:val="20"/>
         </w:rPr>
         <w:t>☐  Speichert besonders grosse Dateien günstig.</w:t>
       </w:r>
@@ -1168,7 +1157,7 @@
       <w:r>
         <w:rPr>
           <w:rFonts w:ascii="Arial" w:hAnsi="Arial"/>
-          <w:sz w:val="18"/>
+          <w:sz w:val="20"/>
         </w:rPr>
         <w:t>☐  Verbindet CPU, RAM und Grafikkarte miteinander.</w:t>
       </w:r>
@@ -1182,7 +1171,7 @@
       <w:r>
         <w:rPr>
           <w:rFonts w:ascii="Arial" w:hAnsi="Arial"/>
-          <w:sz w:val="18"/>
+          <w:sz w:val="20"/>
         </w:rPr>
         <w:t>☐  Beschleunigt Programme, indem es häufig benötigte Daten zwischenspeichert.</w:t>
       </w:r>
@@ -1191,6 +1180,7 @@
       <w:pPr>
         <w:pStyle w:val="Heading2"/>
         <w:keepNext w:val="1"/>
+        <w:spacing w:before="80" w:after="40"/>
       </w:pPr>
       <w:r>
         <w:t>Grafikkarte</w:t>
@@ -1205,7 +1195,7 @@
       <w:r>
         <w:rPr>
           <w:rFonts w:ascii="Arial" w:hAnsi="Arial"/>
-          <w:sz w:val="18"/>
+          <w:sz w:val="20"/>
         </w:rPr>
         <w:t>☐  Speichert Dokumente dauerhaft auf dem Computer.</w:t>
       </w:r>
@@ -1219,7 +1209,7 @@
       <w:r>
         <w:rPr>
           <w:rFonts w:ascii="Arial" w:hAnsi="Arial"/>
-          <w:sz w:val="18"/>
+          <w:sz w:val="20"/>
         </w:rPr>
         <w:t>☐  Berechnet vor allem Grafiken und Bildinformationen für die Ausgabe.</w:t>
       </w:r>
@@ -1233,7 +1223,7 @@
       <w:r>
         <w:rPr>
           <w:rFonts w:ascii="Arial" w:hAnsi="Arial"/>
-          <w:sz w:val="18"/>
+          <w:sz w:val="20"/>
         </w:rPr>
         <w:t>☐  Verteilt den Strom an Mainboard und Laufwerke.</w:t>
       </w:r>
@@ -1247,7 +1237,7 @@
       <w:r>
         <w:rPr>
           <w:rFonts w:ascii="Arial" w:hAnsi="Arial"/>
-          <w:sz w:val="18"/>
+          <w:sz w:val="20"/>
         </w:rPr>
         <w:t>☐  Ist für die allgemeine Verarbeitung aller Programmbefehle verantwortlich.</w:t>
       </w:r>
@@ -1256,6 +1246,7 @@
       <w:pPr>
         <w:pStyle w:val="Heading1"/>
         <w:keepNext w:val="1"/>
+        <w:spacing w:before="140" w:after="80"/>
       </w:pPr>
       <w:r>
         <w:rPr>
@@ -1279,7 +1270,7 @@
       <w:r>
         <w:rPr>
           <w:color w:val="64748B"/>
-          <w:sz w:val="19"/>
+          <w:sz w:val="20"/>
         </w:rPr>
         <w:t>Ordne jeweils Eingabe, Verarbeitung oder Ausgabe zu.</w:t>
       </w:r>
@@ -1305,18 +1296,21 @@
             <w:tcW w:type="dxa" w:w="7767"/>
             <w:shd w:fill="0F172A"/>
             <w:tcMar>
-              <w:top w:w="90" w:type="dxa"/>
-              <w:start w:w="90" w:type="dxa"/>
-              <w:bottom w:w="90" w:type="dxa"/>
-              <w:end w:w="90" w:type="dxa"/>
+              <w:top w:w="35" w:type="dxa"/>
+              <w:left w:w="90" w:type="dxa"/>
+              <w:bottom w:w="35" w:type="dxa"/>
+              <w:right w:w="90" w:type="dxa"/>
             </w:tcMar>
           </w:tcPr>
           <w:p>
+            <w:pPr>
+              <w:spacing w:before="0" w:after="0" w:line="240" w:lineRule="auto"/>
+            </w:pPr>
             <w:r>
               <w:rPr>
                 <w:b/>
                 <w:color w:val="FFFFFF"/>
-                <w:sz w:val="17"/>
+                <w:sz w:val="20"/>
               </w:rPr>
               <w:t>Situation</w:t>
             </w:r>
@@ -1327,18 +1321,21 @@
             <w:tcW w:type="dxa" w:w="1984"/>
             <w:shd w:fill="0F172A"/>
             <w:tcMar>
-              <w:top w:w="90" w:type="dxa"/>
-              <w:start w:w="90" w:type="dxa"/>
-              <w:bottom w:w="90" w:type="dxa"/>
-              <w:end w:w="90" w:type="dxa"/>
+              <w:top w:w="35" w:type="dxa"/>
+              <w:left w:w="90" w:type="dxa"/>
+              <w:bottom w:w="35" w:type="dxa"/>
+              <w:right w:w="90" w:type="dxa"/>
             </w:tcMar>
           </w:tcPr>
           <w:p>
+            <w:pPr>
+              <w:spacing w:before="0" w:after="0" w:line="240" w:lineRule="auto"/>
+            </w:pPr>
             <w:r>
               <w:rPr>
                 <w:b/>
                 <w:color w:val="FFFFFF"/>
-                <w:sz w:val="17"/>
+                <w:sz w:val="20"/>
               </w:rPr>
               <w:t>Antwort (E / V / A)</w:t>
             </w:r>
@@ -1353,21 +1350,25 @@
           <w:tcPr>
             <w:tcW w:type="dxa" w:w="7767"/>
             <w:tcMar>
-              <w:top w:w="90" w:type="dxa"/>
-              <w:start w:w="90" w:type="dxa"/>
-              <w:bottom w:w="90" w:type="dxa"/>
-              <w:end w:w="90" w:type="dxa"/>
+              <w:top w:w="35" w:type="dxa"/>
+              <w:left w:w="90" w:type="dxa"/>
+              <w:bottom w:w="35" w:type="dxa"/>
+              <w:right w:w="90" w:type="dxa"/>
             </w:tcMar>
             <w:tcBorders>
               <w:bottom w:val="single" w:sz="4" w:color="CBD5E1"/>
             </w:tcBorders>
           </w:tcPr>
           <w:p>
+            <w:pPr>
+              <w:spacing w:before="0" w:after="0" w:line="240" w:lineRule="auto"/>
+            </w:pPr>
             <w:r>
               <w:rPr>
-                <w:sz w:val="18"/>
+                <w:rFonts w:ascii="Arial" w:hAnsi="Arial"/>
+                <w:sz w:val="20"/>
               </w:rPr>
-              <w:t>1. Du bewegst die Maus.</w:t>
+              <w:t>1. Der Preis erscheint auf dem Display.</w:t>
             </w:r>
           </w:p>
         </w:tc>
@@ -1375,10 +1376,10 @@
           <w:tcPr>
             <w:tcW w:type="dxa" w:w="1984"/>
             <w:tcMar>
-              <w:top w:w="90" w:type="dxa"/>
-              <w:start w:w="90" w:type="dxa"/>
-              <w:bottom w:w="90" w:type="dxa"/>
-              <w:end w:w="90" w:type="dxa"/>
+              <w:top w:w="35" w:type="dxa"/>
+              <w:left w:w="90" w:type="dxa"/>
+              <w:bottom w:w="35" w:type="dxa"/>
+              <w:right w:w="90" w:type="dxa"/>
             </w:tcMar>
             <w:tcBorders>
               <w:bottom w:val="single" w:sz="4" w:color="CBD5E1"/>
@@ -1386,14 +1387,12 @@
           </w:tcPr>
           <w:p>
             <w:pPr>
+              <w:spacing w:before="20" w:after="20" w:line="240" w:lineRule="auto"/>
               <w:jc w:val="center"/>
+              <w:pBdr>
+                <w:bottom w:val="single" w:sz="5" w:space="1" w:color="CBD5E1"/>
+              </w:pBdr>
             </w:pPr>
-            <w:r>
-              <w:rPr>
-                <w:sz w:val="20"/>
-              </w:rPr>
-              <w:t>________</w:t>
-            </w:r>
           </w:p>
         </w:tc>
       </w:tr>
@@ -1405,21 +1404,25 @@
           <w:tcPr>
             <w:tcW w:type="dxa" w:w="7767"/>
             <w:tcMar>
-              <w:top w:w="90" w:type="dxa"/>
-              <w:start w:w="90" w:type="dxa"/>
-              <w:bottom w:w="90" w:type="dxa"/>
-              <w:end w:w="90" w:type="dxa"/>
+              <w:top w:w="35" w:type="dxa"/>
+              <w:left w:w="90" w:type="dxa"/>
+              <w:bottom w:w="35" w:type="dxa"/>
+              <w:right w:w="90" w:type="dxa"/>
             </w:tcMar>
             <w:tcBorders>
               <w:bottom w:val="single" w:sz="4" w:color="CBD5E1"/>
             </w:tcBorders>
           </w:tcPr>
           <w:p>
+            <w:pPr>
+              <w:spacing w:before="0" w:after="0" w:line="240" w:lineRule="auto"/>
+            </w:pPr>
             <w:r>
               <w:rPr>
-                <w:sz w:val="18"/>
+                <w:rFonts w:ascii="Arial" w:hAnsi="Arial"/>
+                <w:sz w:val="20"/>
               </w:rPr>
-              <w:t>2. Der Computer berechnet die neue Position des Mauszeigers.</w:t>
+              <w:t>2. Du bewegst die Maus.</w:t>
             </w:r>
           </w:p>
         </w:tc>
@@ -1427,10 +1430,10 @@
           <w:tcPr>
             <w:tcW w:type="dxa" w:w="1984"/>
             <w:tcMar>
-              <w:top w:w="90" w:type="dxa"/>
-              <w:start w:w="90" w:type="dxa"/>
-              <w:bottom w:w="90" w:type="dxa"/>
-              <w:end w:w="90" w:type="dxa"/>
+              <w:top w:w="35" w:type="dxa"/>
+              <w:left w:w="90" w:type="dxa"/>
+              <w:bottom w:w="35" w:type="dxa"/>
+              <w:right w:w="90" w:type="dxa"/>
             </w:tcMar>
             <w:tcBorders>
               <w:bottom w:val="single" w:sz="4" w:color="CBD5E1"/>
@@ -1438,14 +1441,12 @@
           </w:tcPr>
           <w:p>
             <w:pPr>
+              <w:spacing w:before="20" w:after="20" w:line="240" w:lineRule="auto"/>
               <w:jc w:val="center"/>
+              <w:pBdr>
+                <w:bottom w:val="single" w:sz="5" w:space="1" w:color="CBD5E1"/>
+              </w:pBdr>
             </w:pPr>
-            <w:r>
-              <w:rPr>
-                <w:sz w:val="20"/>
-              </w:rPr>
-              <w:t>________</w:t>
-            </w:r>
           </w:p>
         </w:tc>
       </w:tr>
@@ -1457,21 +1458,25 @@
           <w:tcPr>
             <w:tcW w:type="dxa" w:w="7767"/>
             <w:tcMar>
-              <w:top w:w="90" w:type="dxa"/>
-              <w:start w:w="90" w:type="dxa"/>
-              <w:bottom w:w="90" w:type="dxa"/>
-              <w:end w:w="90" w:type="dxa"/>
+              <w:top w:w="35" w:type="dxa"/>
+              <w:left w:w="90" w:type="dxa"/>
+              <w:bottom w:w="35" w:type="dxa"/>
+              <w:right w:w="90" w:type="dxa"/>
             </w:tcMar>
             <w:tcBorders>
               <w:bottom w:val="single" w:sz="4" w:color="CBD5E1"/>
             </w:tcBorders>
           </w:tcPr>
           <w:p>
+            <w:pPr>
+              <w:spacing w:before="0" w:after="0" w:line="240" w:lineRule="auto"/>
+            </w:pPr>
             <w:r>
               <w:rPr>
-                <w:sz w:val="18"/>
+                <w:rFonts w:ascii="Arial" w:hAnsi="Arial"/>
+                <w:sz w:val="20"/>
               </w:rPr>
-              <w:t>3. Der Mauszeiger erscheint an einer neuen Stelle auf dem Bildschirm.</w:t>
+              <w:t>3. Das Kassensystem berechnet den Gesamtpreis.</w:t>
             </w:r>
           </w:p>
         </w:tc>
@@ -1479,10 +1484,10 @@
           <w:tcPr>
             <w:tcW w:type="dxa" w:w="1984"/>
             <w:tcMar>
-              <w:top w:w="90" w:type="dxa"/>
-              <w:start w:w="90" w:type="dxa"/>
-              <w:bottom w:w="90" w:type="dxa"/>
-              <w:end w:w="90" w:type="dxa"/>
+              <w:top w:w="35" w:type="dxa"/>
+              <w:left w:w="90" w:type="dxa"/>
+              <w:bottom w:w="35" w:type="dxa"/>
+              <w:right w:w="90" w:type="dxa"/>
             </w:tcMar>
             <w:tcBorders>
               <w:bottom w:val="single" w:sz="4" w:color="CBD5E1"/>
@@ -1490,14 +1495,12 @@
           </w:tcPr>
           <w:p>
             <w:pPr>
+              <w:spacing w:before="20" w:after="20" w:line="240" w:lineRule="auto"/>
               <w:jc w:val="center"/>
+              <w:pBdr>
+                <w:bottom w:val="single" w:sz="5" w:space="1" w:color="CBD5E1"/>
+              </w:pBdr>
             </w:pPr>
-            <w:r>
-              <w:rPr>
-                <w:sz w:val="20"/>
-              </w:rPr>
-              <w:t>________</w:t>
-            </w:r>
           </w:p>
         </w:tc>
       </w:tr>
@@ -1509,19 +1512,23 @@
           <w:tcPr>
             <w:tcW w:type="dxa" w:w="7767"/>
             <w:tcMar>
-              <w:top w:w="90" w:type="dxa"/>
-              <w:start w:w="90" w:type="dxa"/>
-              <w:bottom w:w="90" w:type="dxa"/>
-              <w:end w:w="90" w:type="dxa"/>
+              <w:top w:w="35" w:type="dxa"/>
+              <w:left w:w="90" w:type="dxa"/>
+              <w:bottom w:w="35" w:type="dxa"/>
+              <w:right w:w="90" w:type="dxa"/>
             </w:tcMar>
             <w:tcBorders>
               <w:bottom w:val="single" w:sz="4" w:color="CBD5E1"/>
             </w:tcBorders>
           </w:tcPr>
           <w:p>
+            <w:pPr>
+              <w:spacing w:before="0" w:after="0" w:line="240" w:lineRule="auto"/>
+            </w:pPr>
             <w:r>
               <w:rPr>
-                <w:sz w:val="18"/>
+                <w:rFonts w:ascii="Arial" w:hAnsi="Arial"/>
+                <w:sz w:val="20"/>
               </w:rPr>
               <w:t>4. Ein Barcode wird an der Kasse eingescannt.</w:t>
             </w:r>
@@ -1531,10 +1538,10 @@
           <w:tcPr>
             <w:tcW w:type="dxa" w:w="1984"/>
             <w:tcMar>
-              <w:top w:w="90" w:type="dxa"/>
-              <w:start w:w="90" w:type="dxa"/>
-              <w:bottom w:w="90" w:type="dxa"/>
-              <w:end w:w="90" w:type="dxa"/>
+              <w:top w:w="35" w:type="dxa"/>
+              <w:left w:w="90" w:type="dxa"/>
+              <w:bottom w:w="35" w:type="dxa"/>
+              <w:right w:w="90" w:type="dxa"/>
             </w:tcMar>
             <w:tcBorders>
               <w:bottom w:val="single" w:sz="4" w:color="CBD5E1"/>
@@ -1542,14 +1549,12 @@
           </w:tcPr>
           <w:p>
             <w:pPr>
+              <w:spacing w:before="20" w:after="20" w:line="240" w:lineRule="auto"/>
               <w:jc w:val="center"/>
+              <w:pBdr>
+                <w:bottom w:val="single" w:sz="5" w:space="1" w:color="CBD5E1"/>
+              </w:pBdr>
             </w:pPr>
-            <w:r>
-              <w:rPr>
-                <w:sz w:val="20"/>
-              </w:rPr>
-              <w:t>________</w:t>
-            </w:r>
           </w:p>
         </w:tc>
       </w:tr>
@@ -1561,21 +1566,25 @@
           <w:tcPr>
             <w:tcW w:type="dxa" w:w="7767"/>
             <w:tcMar>
-              <w:top w:w="90" w:type="dxa"/>
-              <w:start w:w="90" w:type="dxa"/>
-              <w:bottom w:w="90" w:type="dxa"/>
-              <w:end w:w="90" w:type="dxa"/>
+              <w:top w:w="35" w:type="dxa"/>
+              <w:left w:w="90" w:type="dxa"/>
+              <w:bottom w:w="35" w:type="dxa"/>
+              <w:right w:w="90" w:type="dxa"/>
             </w:tcMar>
             <w:tcBorders>
               <w:bottom w:val="single" w:sz="4" w:color="CBD5E1"/>
             </w:tcBorders>
           </w:tcPr>
           <w:p>
+            <w:pPr>
+              <w:spacing w:before="0" w:after="0" w:line="240" w:lineRule="auto"/>
+            </w:pPr>
             <w:r>
               <w:rPr>
-                <w:sz w:val="18"/>
+                <w:rFonts w:ascii="Arial" w:hAnsi="Arial"/>
+                <w:sz w:val="20"/>
               </w:rPr>
-              <w:t>5. Das Kassensystem berechnet den Gesamtpreis.</w:t>
+              <w:t>5. Der Mauszeiger erscheint an einer neuen Stelle auf dem Bildschirm.</w:t>
             </w:r>
           </w:p>
         </w:tc>
@@ -1583,10 +1592,10 @@
           <w:tcPr>
             <w:tcW w:type="dxa" w:w="1984"/>
             <w:tcMar>
-              <w:top w:w="90" w:type="dxa"/>
-              <w:start w:w="90" w:type="dxa"/>
-              <w:bottom w:w="90" w:type="dxa"/>
-              <w:end w:w="90" w:type="dxa"/>
+              <w:top w:w="35" w:type="dxa"/>
+              <w:left w:w="90" w:type="dxa"/>
+              <w:bottom w:w="35" w:type="dxa"/>
+              <w:right w:w="90" w:type="dxa"/>
             </w:tcMar>
             <w:tcBorders>
               <w:bottom w:val="single" w:sz="4" w:color="CBD5E1"/>
@@ -1594,14 +1603,12 @@
           </w:tcPr>
           <w:p>
             <w:pPr>
+              <w:spacing w:before="20" w:after="20" w:line="240" w:lineRule="auto"/>
               <w:jc w:val="center"/>
+              <w:pBdr>
+                <w:bottom w:val="single" w:sz="5" w:space="1" w:color="CBD5E1"/>
+              </w:pBdr>
             </w:pPr>
-            <w:r>
-              <w:rPr>
-                <w:sz w:val="20"/>
-              </w:rPr>
-              <w:t>________</w:t>
-            </w:r>
           </w:p>
         </w:tc>
       </w:tr>
@@ -1613,21 +1620,25 @@
           <w:tcPr>
             <w:tcW w:type="dxa" w:w="7767"/>
             <w:tcMar>
-              <w:top w:w="90" w:type="dxa"/>
-              <w:start w:w="90" w:type="dxa"/>
-              <w:bottom w:w="90" w:type="dxa"/>
-              <w:end w:w="90" w:type="dxa"/>
+              <w:top w:w="35" w:type="dxa"/>
+              <w:left w:w="90" w:type="dxa"/>
+              <w:bottom w:w="35" w:type="dxa"/>
+              <w:right w:w="90" w:type="dxa"/>
             </w:tcMar>
             <w:tcBorders>
               <w:bottom w:val="single" w:sz="4" w:color="CBD5E1"/>
             </w:tcBorders>
           </w:tcPr>
           <w:p>
+            <w:pPr>
+              <w:spacing w:before="0" w:after="0" w:line="240" w:lineRule="auto"/>
+            </w:pPr>
             <w:r>
               <w:rPr>
-                <w:sz w:val="18"/>
+                <w:rFonts w:ascii="Arial" w:hAnsi="Arial"/>
+                <w:sz w:val="20"/>
               </w:rPr>
-              <w:t>6. Der Preis erscheint auf dem Display.</w:t>
+              <w:t>6. Der Computer berechnet die neue Position des Mauszeigers.</w:t>
             </w:r>
           </w:p>
         </w:tc>
@@ -1635,10 +1646,10 @@
           <w:tcPr>
             <w:tcW w:type="dxa" w:w="1984"/>
             <w:tcMar>
-              <w:top w:w="90" w:type="dxa"/>
-              <w:start w:w="90" w:type="dxa"/>
-              <w:bottom w:w="90" w:type="dxa"/>
-              <w:end w:w="90" w:type="dxa"/>
+              <w:top w:w="35" w:type="dxa"/>
+              <w:left w:w="90" w:type="dxa"/>
+              <w:bottom w:w="35" w:type="dxa"/>
+              <w:right w:w="90" w:type="dxa"/>
             </w:tcMar>
             <w:tcBorders>
               <w:bottom w:val="single" w:sz="4" w:color="CBD5E1"/>
@@ -1646,14 +1657,12 @@
           </w:tcPr>
           <w:p>
             <w:pPr>
+              <w:spacing w:before="20" w:after="20" w:line="240" w:lineRule="auto"/>
               <w:jc w:val="center"/>
+              <w:pBdr>
+                <w:bottom w:val="single" w:sz="5" w:space="1" w:color="CBD5E1"/>
+              </w:pBdr>
             </w:pPr>
-            <w:r>
-              <w:rPr>
-                <w:sz w:val="20"/>
-              </w:rPr>
-              <w:t>________</w:t>
-            </w:r>
           </w:p>
         </w:tc>
       </w:tr>
@@ -1662,6 +1671,7 @@
       <w:pPr>
         <w:pStyle w:val="Heading1"/>
         <w:keepNext w:val="1"/>
+        <w:spacing w:before="140" w:after="80"/>
       </w:pPr>
       <w:r>
         <w:rPr>
@@ -1685,59 +1695,74 @@
       <w:r>
         <w:rPr>
           <w:color w:val="64748B"/>
-          <w:sz w:val="19"/>
+          <w:sz w:val="20"/>
         </w:rPr>
-        <w:t>Ein Schüler sagt: „Der Monitor verarbeitet die Daten, weil er das Bild erzeugt.“ Erkläre, warum diese Aussage nicht stimmt.</w:t>
+        <w:t>Ein Schüler sagt: „Der Monitor verarbeitet die Daten, weil er das Bild erzeugt.“ Beantworte die drei Teilfragen. Jede Teilfrage gibt 1 Punkt.</w:t>
       </w:r>
     </w:p>
     <w:p>
       <w:pPr>
-        <w:tabs>
-          <w:tab w:pos="9751" w:val="right" w:leader="underscore"/>
-        </w:tabs>
-        <w:spacing w:after="60"/>
+        <w:spacing w:after="20"/>
       </w:pPr>
       <w:r>
-        <w:tab/>
+        <w:rPr>
+          <w:sz w:val="20"/>
+        </w:rPr>
+        <w:t>1. Welche Rolle hat der Monitor im EVA-Prinzip: Eingabe, Verarbeitung oder Ausgabe?</w:t>
       </w:r>
     </w:p>
     <w:p>
       <w:pPr>
-        <w:tabs>
-          <w:tab w:pos="9751" w:val="right" w:leader="underscore"/>
-        </w:tabs>
-        <w:spacing w:after="60"/>
+        <w:spacing w:after="80" w:before="20" w:line="240" w:lineRule="auto"/>
+        <w:pBdr>
+          <w:bottom w:val="single" w:sz="5" w:space="1" w:color="94A3B8"/>
+        </w:pBdr>
+      </w:pPr>
+    </w:p>
+    <w:p>
+      <w:pPr>
+        <w:spacing w:after="20"/>
       </w:pPr>
       <w:r>
-        <w:tab/>
+        <w:rPr>
+          <w:sz w:val="20"/>
+        </w:rPr>
+        <w:t>2. Welche Komponente verarbeitet bzw. berechnet die Bildinformationen hauptsächlich?</w:t>
       </w:r>
     </w:p>
     <w:p>
       <w:pPr>
-        <w:tabs>
-          <w:tab w:pos="9751" w:val="right" w:leader="underscore"/>
-        </w:tabs>
-        <w:spacing w:after="60"/>
+        <w:spacing w:after="80" w:before="20" w:line="240" w:lineRule="auto"/>
+        <w:pBdr>
+          <w:bottom w:val="single" w:sz="5" w:space="1" w:color="94A3B8"/>
+        </w:pBdr>
+      </w:pPr>
+    </w:p>
+    <w:p>
+      <w:pPr>
+        <w:spacing w:after="20"/>
       </w:pPr>
       <w:r>
-        <w:tab/>
+        <w:rPr>
+          <w:rFonts w:ascii="Arial" w:hAnsi="Arial"/>
+          <w:sz w:val="20"/>
+        </w:rPr>
+        <w:t>3. Nenne ein passendes Beispiel für die Eingabe dieser EVA-Kette: Grafikkarte/CPU verarbeitet → Monitor zeigt das Ergebnis.</w:t>
       </w:r>
     </w:p>
     <w:p>
       <w:pPr>
-        <w:tabs>
-          <w:tab w:pos="9751" w:val="right" w:leader="underscore"/>
-        </w:tabs>
-        <w:spacing w:after="60"/>
+        <w:spacing w:after="80" w:before="20" w:line="240" w:lineRule="auto"/>
+        <w:pBdr>
+          <w:bottom w:val="single" w:sz="5" w:space="1" w:color="94A3B8"/>
+        </w:pBdr>
       </w:pPr>
-      <w:r>
-        <w:tab/>
-      </w:r>
     </w:p>
     <w:p>
       <w:pPr>
         <w:pStyle w:val="Heading1"/>
         <w:keepNext w:val="1"/>
+        <w:spacing w:before="140" w:after="80"/>
       </w:pPr>
       <w:r>
         <w:rPr>
@@ -1761,9 +1786,9 @@
       <w:r>
         <w:rPr>
           <w:color w:val="64748B"/>
-          <w:sz w:val="19"/>
+          <w:sz w:val="20"/>
         </w:rPr>
-        <w:t>Wähle den passendsten Anschluss aus der Auswahl und schreibe ihn hin.</w:t>
+        <w:t>Wähle den passendsten Anschluss aus der Auswahl und schreibe ihn hin. Jeder Anschluss wird genau einmal verwendet.</w:t>
       </w:r>
     </w:p>
     <w:p>
@@ -1773,7 +1798,7 @@
       <w:r>
         <w:rPr>
           <w:b/>
-          <w:sz w:val="18"/>
+          <w:sz w:val="20"/>
         </w:rPr>
         <w:t>Auswahl: HDMI · RJ45/Ethernet · 3,5-mm-Klinke · USB-C · VGA · M.2</w:t>
       </w:r>
@@ -1797,19 +1822,22 @@
           <w:tcPr>
             <w:tcW w:type="dxa" w:w="7710"/>
             <w:tcMar>
-              <w:top w:w="75" w:type="dxa"/>
-              <w:start w:w="90" w:type="dxa"/>
-              <w:bottom w:w="75" w:type="dxa"/>
-              <w:end w:w="90" w:type="dxa"/>
+              <w:top w:w="35" w:type="dxa"/>
+              <w:left w:w="90" w:type="dxa"/>
+              <w:bottom w:w="35" w:type="dxa"/>
+              <w:right w:w="90" w:type="dxa"/>
             </w:tcMar>
             <w:tcBorders>
               <w:bottom w:val="single" w:sz="4" w:color="CBD5E1"/>
             </w:tcBorders>
           </w:tcPr>
           <w:p>
+            <w:pPr>
+              <w:spacing w:before="0" w:after="0" w:line="240" w:lineRule="auto"/>
+            </w:pPr>
             <w:r>
               <w:rPr>
-                <w:sz w:val="18"/>
+                <w:sz w:val="20"/>
               </w:rPr>
               <w:t>1. Moderner Monitor oder Fernseher mit Bild und Ton</w:t>
             </w:r>
@@ -1819,10 +1847,10 @@
           <w:tcPr>
             <w:tcW w:type="dxa" w:w="2041"/>
             <w:tcMar>
-              <w:top w:w="75" w:type="dxa"/>
-              <w:start w:w="90" w:type="dxa"/>
-              <w:bottom w:w="75" w:type="dxa"/>
-              <w:end w:w="90" w:type="dxa"/>
+              <w:top w:w="35" w:type="dxa"/>
+              <w:left w:w="90" w:type="dxa"/>
+              <w:bottom w:w="35" w:type="dxa"/>
+              <w:right w:w="90" w:type="dxa"/>
             </w:tcMar>
             <w:tcBorders>
               <w:bottom w:val="single" w:sz="4" w:color="CBD5E1"/>
@@ -1830,16 +1858,11 @@
           </w:tcPr>
           <w:p>
             <w:pPr>
+              <w:spacing w:before="20" w:after="20" w:line="240" w:lineRule="auto"/>
               <w:pBdr>
-                <w:bottom w:val="single" w:sz="6" w:space="1" w:color="94A3B8"/>
+                <w:bottom w:val="single" w:sz="5" w:space="1" w:color="CBD5E1"/>
               </w:pBdr>
             </w:pPr>
-            <w:r>
-              <w:rPr>
-                <w:sz w:val="16"/>
-              </w:rPr>
-              <w:t xml:space="preserve"> </w:t>
-            </w:r>
           </w:p>
         </w:tc>
       </w:tr>
@@ -1851,19 +1874,22 @@
           <w:tcPr>
             <w:tcW w:type="dxa" w:w="7710"/>
             <w:tcMar>
-              <w:top w:w="75" w:type="dxa"/>
-              <w:start w:w="90" w:type="dxa"/>
-              <w:bottom w:w="75" w:type="dxa"/>
-              <w:end w:w="90" w:type="dxa"/>
+              <w:top w:w="35" w:type="dxa"/>
+              <w:left w:w="90" w:type="dxa"/>
+              <w:bottom w:w="35" w:type="dxa"/>
+              <w:right w:w="90" w:type="dxa"/>
             </w:tcMar>
             <w:tcBorders>
               <w:bottom w:val="single" w:sz="4" w:color="CBD5E1"/>
             </w:tcBorders>
           </w:tcPr>
           <w:p>
+            <w:pPr>
+              <w:spacing w:before="0" w:after="0" w:line="240" w:lineRule="auto"/>
+            </w:pPr>
             <w:r>
               <w:rPr>
-                <w:sz w:val="18"/>
+                <w:sz w:val="20"/>
               </w:rPr>
               <w:t>2. Netzwerkkabel zum Router</w:t>
             </w:r>
@@ -1873,10 +1899,10 @@
           <w:tcPr>
             <w:tcW w:type="dxa" w:w="2041"/>
             <w:tcMar>
-              <w:top w:w="75" w:type="dxa"/>
-              <w:start w:w="90" w:type="dxa"/>
-              <w:bottom w:w="75" w:type="dxa"/>
-              <w:end w:w="90" w:type="dxa"/>
+              <w:top w:w="35" w:type="dxa"/>
+              <w:left w:w="90" w:type="dxa"/>
+              <w:bottom w:w="35" w:type="dxa"/>
+              <w:right w:w="90" w:type="dxa"/>
             </w:tcMar>
             <w:tcBorders>
               <w:bottom w:val="single" w:sz="4" w:color="CBD5E1"/>
@@ -1884,16 +1910,11 @@
           </w:tcPr>
           <w:p>
             <w:pPr>
+              <w:spacing w:before="20" w:after="20" w:line="240" w:lineRule="auto"/>
               <w:pBdr>
-                <w:bottom w:val="single" w:sz="6" w:space="1" w:color="94A3B8"/>
+                <w:bottom w:val="single" w:sz="5" w:space="1" w:color="CBD5E1"/>
               </w:pBdr>
             </w:pPr>
-            <w:r>
-              <w:rPr>
-                <w:sz w:val="16"/>
-              </w:rPr>
-              <w:t xml:space="preserve"> </w:t>
-            </w:r>
           </w:p>
         </w:tc>
       </w:tr>
@@ -1905,19 +1926,22 @@
           <w:tcPr>
             <w:tcW w:type="dxa" w:w="7710"/>
             <w:tcMar>
-              <w:top w:w="75" w:type="dxa"/>
-              <w:start w:w="90" w:type="dxa"/>
-              <w:bottom w:w="75" w:type="dxa"/>
-              <w:end w:w="90" w:type="dxa"/>
+              <w:top w:w="35" w:type="dxa"/>
+              <w:left w:w="90" w:type="dxa"/>
+              <w:bottom w:w="35" w:type="dxa"/>
+              <w:right w:w="90" w:type="dxa"/>
             </w:tcMar>
             <w:tcBorders>
               <w:bottom w:val="single" w:sz="4" w:color="CBD5E1"/>
             </w:tcBorders>
           </w:tcPr>
           <w:p>
+            <w:pPr>
+              <w:spacing w:before="0" w:after="0" w:line="240" w:lineRule="auto"/>
+            </w:pPr>
             <w:r>
               <w:rPr>
-                <w:sz w:val="18"/>
+                <w:sz w:val="20"/>
               </w:rPr>
               <w:t>3. Kopfhörer mit klassischem Audiostecker</w:t>
             </w:r>
@@ -1927,10 +1951,10 @@
           <w:tcPr>
             <w:tcW w:type="dxa" w:w="2041"/>
             <w:tcMar>
-              <w:top w:w="75" w:type="dxa"/>
-              <w:start w:w="90" w:type="dxa"/>
-              <w:bottom w:w="75" w:type="dxa"/>
-              <w:end w:w="90" w:type="dxa"/>
+              <w:top w:w="35" w:type="dxa"/>
+              <w:left w:w="90" w:type="dxa"/>
+              <w:bottom w:w="35" w:type="dxa"/>
+              <w:right w:w="90" w:type="dxa"/>
             </w:tcMar>
             <w:tcBorders>
               <w:bottom w:val="single" w:sz="4" w:color="CBD5E1"/>
@@ -1938,16 +1962,11 @@
           </w:tcPr>
           <w:p>
             <w:pPr>
+              <w:spacing w:before="20" w:after="20" w:line="240" w:lineRule="auto"/>
               <w:pBdr>
-                <w:bottom w:val="single" w:sz="6" w:space="1" w:color="94A3B8"/>
+                <w:bottom w:val="single" w:sz="5" w:space="1" w:color="CBD5E1"/>
               </w:pBdr>
             </w:pPr>
-            <w:r>
-              <w:rPr>
-                <w:sz w:val="16"/>
-              </w:rPr>
-              <w:t xml:space="preserve"> </w:t>
-            </w:r>
           </w:p>
         </w:tc>
       </w:tr>
@@ -1959,21 +1978,24 @@
           <w:tcPr>
             <w:tcW w:type="dxa" w:w="7710"/>
             <w:tcMar>
-              <w:top w:w="75" w:type="dxa"/>
-              <w:start w:w="90" w:type="dxa"/>
-              <w:bottom w:w="75" w:type="dxa"/>
-              <w:end w:w="90" w:type="dxa"/>
+              <w:top w:w="35" w:type="dxa"/>
+              <w:left w:w="90" w:type="dxa"/>
+              <w:bottom w:w="35" w:type="dxa"/>
+              <w:right w:w="90" w:type="dxa"/>
             </w:tcMar>
             <w:tcBorders>
               <w:bottom w:val="single" w:sz="4" w:color="CBD5E1"/>
             </w:tcBorders>
           </w:tcPr>
           <w:p>
+            <w:pPr>
+              <w:spacing w:before="0" w:after="0" w:line="240" w:lineRule="auto"/>
+            </w:pPr>
             <w:r>
               <w:rPr>
-                <w:sz w:val="18"/>
+                <w:sz w:val="20"/>
               </w:rPr>
-              <w:t>4. Moderner USB-Stick oder Smartphone</w:t>
+              <w:t>4. Modernes Smartphone mit einem kleinen, beidseitig einsteckbaren Anschluss zum Laden und zur Datenübertragung</w:t>
             </w:r>
           </w:p>
         </w:tc>
@@ -1981,10 +2003,10 @@
           <w:tcPr>
             <w:tcW w:type="dxa" w:w="2041"/>
             <w:tcMar>
-              <w:top w:w="75" w:type="dxa"/>
-              <w:start w:w="90" w:type="dxa"/>
-              <w:bottom w:w="75" w:type="dxa"/>
-              <w:end w:w="90" w:type="dxa"/>
+              <w:top w:w="35" w:type="dxa"/>
+              <w:left w:w="90" w:type="dxa"/>
+              <w:bottom w:w="35" w:type="dxa"/>
+              <w:right w:w="90" w:type="dxa"/>
             </w:tcMar>
             <w:tcBorders>
               <w:bottom w:val="single" w:sz="4" w:color="CBD5E1"/>
@@ -1992,16 +2014,11 @@
           </w:tcPr>
           <w:p>
             <w:pPr>
+              <w:spacing w:before="20" w:after="20" w:line="240" w:lineRule="auto"/>
               <w:pBdr>
-                <w:bottom w:val="single" w:sz="6" w:space="1" w:color="94A3B8"/>
+                <w:bottom w:val="single" w:sz="5" w:space="1" w:color="CBD5E1"/>
               </w:pBdr>
             </w:pPr>
-            <w:r>
-              <w:rPr>
-                <w:sz w:val="16"/>
-              </w:rPr>
-              <w:t xml:space="preserve"> </w:t>
-            </w:r>
           </w:p>
         </w:tc>
       </w:tr>
@@ -2013,19 +2030,22 @@
           <w:tcPr>
             <w:tcW w:type="dxa" w:w="7710"/>
             <w:tcMar>
-              <w:top w:w="75" w:type="dxa"/>
-              <w:start w:w="90" w:type="dxa"/>
-              <w:bottom w:w="75" w:type="dxa"/>
-              <w:end w:w="90" w:type="dxa"/>
+              <w:top w:w="35" w:type="dxa"/>
+              <w:left w:w="90" w:type="dxa"/>
+              <w:bottom w:w="35" w:type="dxa"/>
+              <w:right w:w="90" w:type="dxa"/>
             </w:tcMar>
             <w:tcBorders>
               <w:bottom w:val="single" w:sz="4" w:color="CBD5E1"/>
             </w:tcBorders>
           </w:tcPr>
           <w:p>
+            <w:pPr>
+              <w:spacing w:before="0" w:after="0" w:line="240" w:lineRule="auto"/>
+            </w:pPr>
             <w:r>
               <w:rPr>
-                <w:sz w:val="18"/>
+                <w:sz w:val="20"/>
               </w:rPr>
               <w:t>5. Älterer Monitor mit analogem Bildsignal</w:t>
             </w:r>
@@ -2035,10 +2055,10 @@
           <w:tcPr>
             <w:tcW w:type="dxa" w:w="2041"/>
             <w:tcMar>
-              <w:top w:w="75" w:type="dxa"/>
-              <w:start w:w="90" w:type="dxa"/>
-              <w:bottom w:w="75" w:type="dxa"/>
-              <w:end w:w="90" w:type="dxa"/>
+              <w:top w:w="35" w:type="dxa"/>
+              <w:left w:w="90" w:type="dxa"/>
+              <w:bottom w:w="35" w:type="dxa"/>
+              <w:right w:w="90" w:type="dxa"/>
             </w:tcMar>
             <w:tcBorders>
               <w:bottom w:val="single" w:sz="4" w:color="CBD5E1"/>
@@ -2046,16 +2066,11 @@
           </w:tcPr>
           <w:p>
             <w:pPr>
+              <w:spacing w:before="20" w:after="20" w:line="240" w:lineRule="auto"/>
               <w:pBdr>
-                <w:bottom w:val="single" w:sz="6" w:space="1" w:color="94A3B8"/>
+                <w:bottom w:val="single" w:sz="5" w:space="1" w:color="CBD5E1"/>
               </w:pBdr>
             </w:pPr>
-            <w:r>
-              <w:rPr>
-                <w:sz w:val="16"/>
-              </w:rPr>
-              <w:t xml:space="preserve"> </w:t>
-            </w:r>
           </w:p>
         </w:tc>
       </w:tr>
@@ -2067,19 +2082,22 @@
           <w:tcPr>
             <w:tcW w:type="dxa" w:w="7710"/>
             <w:tcMar>
-              <w:top w:w="75" w:type="dxa"/>
-              <w:start w:w="90" w:type="dxa"/>
-              <w:bottom w:w="75" w:type="dxa"/>
-              <w:end w:w="90" w:type="dxa"/>
+              <w:top w:w="35" w:type="dxa"/>
+              <w:left w:w="90" w:type="dxa"/>
+              <w:bottom w:w="35" w:type="dxa"/>
+              <w:right w:w="90" w:type="dxa"/>
             </w:tcMar>
             <w:tcBorders>
               <w:bottom w:val="single" w:sz="4" w:color="CBD5E1"/>
             </w:tcBorders>
           </w:tcPr>
           <w:p>
+            <w:pPr>
+              <w:spacing w:before="0" w:after="0" w:line="240" w:lineRule="auto"/>
+            </w:pPr>
             <w:r>
               <w:rPr>
-                <w:sz w:val="18"/>
+                <w:sz w:val="20"/>
               </w:rPr>
               <w:t>6. Interne SSD direkt auf dem Mainboard</w:t>
             </w:r>
@@ -2089,10 +2107,10 @@
           <w:tcPr>
             <w:tcW w:type="dxa" w:w="2041"/>
             <w:tcMar>
-              <w:top w:w="75" w:type="dxa"/>
-              <w:start w:w="90" w:type="dxa"/>
-              <w:bottom w:w="75" w:type="dxa"/>
-              <w:end w:w="90" w:type="dxa"/>
+              <w:top w:w="35" w:type="dxa"/>
+              <w:left w:w="90" w:type="dxa"/>
+              <w:bottom w:w="35" w:type="dxa"/>
+              <w:right w:w="90" w:type="dxa"/>
             </w:tcMar>
             <w:tcBorders>
               <w:bottom w:val="single" w:sz="4" w:color="CBD5E1"/>
@@ -2100,16 +2118,11 @@
           </w:tcPr>
           <w:p>
             <w:pPr>
+              <w:spacing w:before="20" w:after="20" w:line="240" w:lineRule="auto"/>
               <w:pBdr>
-                <w:bottom w:val="single" w:sz="6" w:space="1" w:color="94A3B8"/>
+                <w:bottom w:val="single" w:sz="5" w:space="1" w:color="CBD5E1"/>
               </w:pBdr>
             </w:pPr>
-            <w:r>
-              <w:rPr>
-                <w:sz w:val="16"/>
-              </w:rPr>
-              <w:t xml:space="preserve"> </w:t>
-            </w:r>
           </w:p>
         </w:tc>
       </w:tr>
@@ -2118,6 +2131,8 @@
       <w:pPr>
         <w:pStyle w:val="Heading1"/>
         <w:keepNext w:val="1"/>
+        <w:pageBreakBefore/>
+        <w:spacing w:before="140" w:after="80"/>
       </w:pPr>
       <w:r>
         <w:rPr>
@@ -2141,7 +2156,7 @@
       <w:r>
         <w:rPr>
           <w:color w:val="64748B"/>
-          <w:sz w:val="19"/>
+          <w:sz w:val="20"/>
         </w:rPr>
         <w:t>Wähle jeweils die beste Lösung. Bei den offenen Fragen antworte kurz und präzise.</w:t>
       </w:r>
@@ -2152,7 +2167,7 @@
       </w:pPr>
       <w:r>
         <w:rPr>
-          <w:sz w:val="18"/>
+          <w:sz w:val="20"/>
         </w:rPr>
         <w:t>1. Ein PC soll schneller starten und Programme schneller öffnen.</w:t>
       </w:r>
@@ -2165,7 +2180,7 @@
       <w:r>
         <w:rPr>
           <w:b/>
-          <w:sz w:val="18"/>
+          <w:sz w:val="20"/>
         </w:rPr>
         <w:t>☐ RAM    ☐ HDD    ☐ SSD</w:t>
       </w:r>
@@ -2176,7 +2191,7 @@
       </w:pPr>
       <w:r>
         <w:rPr>
-          <w:sz w:val="18"/>
+          <w:sz w:val="20"/>
         </w:rPr>
         <w:t>2. 4 TB Fotos sollen möglichst günstig archiviert werden.</w:t>
       </w:r>
@@ -2189,7 +2204,7 @@
       <w:r>
         <w:rPr>
           <w:b/>
-          <w:sz w:val="18"/>
+          <w:sz w:val="20"/>
         </w:rPr>
         <w:t>☐ RAM    ☐ HDD    ☐ SSD</w:t>
       </w:r>
@@ -2200,9 +2215,9 @@
       </w:pPr>
       <w:r>
         <w:rPr>
-          <w:sz w:val="18"/>
+          <w:sz w:val="20"/>
         </w:rPr>
-        <w:t>3. Ein Schüler öffnet gleichzeitig Browser, Teams, PowerPoint und ein Bildbearbeitungsprogramm. Der PC wird dabei langsam.</w:t>
+        <w:t>3. Ein Schüler hat nur 4 GB RAM. Beim gleichzeitigen Arbeiten mit Browser, Teams, PowerPoint und Bildbearbeitung zeigt der Task-Manager 95 % RAM-Auslastung, während der Datenträger nur bei 20 % liegt. Welche Aufrüstung hilft hier am direktesten?</w:t>
       </w:r>
     </w:p>
     <w:p>
@@ -2213,7 +2228,7 @@
       <w:r>
         <w:rPr>
           <w:b/>
-          <w:sz w:val="18"/>
+          <w:sz w:val="20"/>
         </w:rPr>
         <w:t>☐ RAM    ☐ HDD    ☐ SSD</w:t>
       </w:r>
@@ -2221,45 +2236,40 @@
     <w:p>
       <w:r>
         <w:rPr>
-          <w:sz w:val="18"/>
+          <w:sz w:val="20"/>
         </w:rPr>
         <w:t>4. Was passiert mit den Daten im RAM, wenn der Strom ausgeschaltet wird?</w:t>
       </w:r>
     </w:p>
     <w:p>
       <w:pPr>
-        <w:tabs>
-          <w:tab w:pos="9751" w:val="right" w:leader="underscore"/>
-        </w:tabs>
-        <w:spacing w:after="60"/>
+        <w:spacing w:after="80" w:before="20" w:line="240" w:lineRule="auto"/>
+        <w:pBdr>
+          <w:bottom w:val="single" w:sz="5" w:space="1" w:color="94A3B8"/>
+        </w:pBdr>
       </w:pPr>
-      <w:r>
-        <w:tab/>
-      </w:r>
     </w:p>
     <w:p>
       <w:r>
         <w:rPr>
-          <w:sz w:val="18"/>
+          <w:sz w:val="20"/>
         </w:rPr>
         <w:t>5. Nenne einen Vorteil einer SSD gegenüber einer HDD.</w:t>
       </w:r>
     </w:p>
     <w:p>
       <w:pPr>
-        <w:tabs>
-          <w:tab w:pos="9751" w:val="right" w:leader="underscore"/>
-        </w:tabs>
-        <w:spacing w:after="60"/>
+        <w:spacing w:after="80" w:before="20" w:line="240" w:lineRule="auto"/>
+        <w:pBdr>
+          <w:bottom w:val="single" w:sz="5" w:space="1" w:color="94A3B8"/>
+        </w:pBdr>
       </w:pPr>
-      <w:r>
-        <w:tab/>
-      </w:r>
     </w:p>
     <w:p>
       <w:pPr>
         <w:pStyle w:val="Heading1"/>
         <w:keepNext w:val="1"/>
+        <w:spacing w:before="140" w:after="80"/>
       </w:pPr>
       <w:r>
         <w:rPr>
@@ -2283,7 +2293,7 @@
       <w:r>
         <w:rPr>
           <w:color w:val="64748B"/>
-          <w:sz w:val="19"/>
+          <w:sz w:val="20"/>
         </w:rPr>
         <w:t>Eine Kundin braucht einen Laptop für Word/PowerPoint, viele Browser-Tabs, Videokonferenzen und Schule. Anspruchsvolle Games spielt sie nicht.</w:t>
       </w:r>
@@ -2309,9 +2319,9 @@
             <w:shd w:fill="1D4ED8"/>
             <w:tcMar>
               <w:top w:w="90" w:type="dxa"/>
-              <w:start w:w="100" w:type="dxa"/>
+              <w:left w:w="100" w:type="dxa"/>
               <w:bottom w:w="90" w:type="dxa"/>
-              <w:end w:w="100" w:type="dxa"/>
+              <w:right w:w="100" w:type="dxa"/>
             </w:tcMar>
           </w:tcPr>
           <w:p>
@@ -2334,9 +2344,9 @@
             <w:shd w:fill="15803D"/>
             <w:tcMar>
               <w:top w:w="90" w:type="dxa"/>
-              <w:start w:w="100" w:type="dxa"/>
+              <w:left w:w="100" w:type="dxa"/>
               <w:bottom w:w="90" w:type="dxa"/>
-              <w:end w:w="100" w:type="dxa"/>
+              <w:right w:w="100" w:type="dxa"/>
             </w:tcMar>
           </w:tcPr>
           <w:p>
@@ -2364,9 +2374,9 @@
             <w:shd w:fill="F8FAFC"/>
             <w:tcMar>
               <w:top w:w="120" w:type="dxa"/>
-              <w:start w:w="140" w:type="dxa"/>
+              <w:left w:w="140" w:type="dxa"/>
               <w:bottom w:w="120" w:type="dxa"/>
-              <w:end w:w="140" w:type="dxa"/>
+              <w:right w:w="140" w:type="dxa"/>
             </w:tcMar>
           </w:tcPr>
           <w:p>
@@ -2376,7 +2386,7 @@
             <w:r>
               <w:rPr>
                 <w:b/>
-                <w:sz w:val="19"/>
+                <w:sz w:val="20"/>
               </w:rPr>
               <w:t>8 GB RAM</w:t>
               <w:br/>
@@ -2394,9 +2404,9 @@
             <w:shd w:fill="F8FAFC"/>
             <w:tcMar>
               <w:top w:w="120" w:type="dxa"/>
-              <w:start w:w="140" w:type="dxa"/>
+              <w:left w:w="140" w:type="dxa"/>
               <w:bottom w:w="120" w:type="dxa"/>
-              <w:end w:w="140" w:type="dxa"/>
+              <w:right w:w="140" w:type="dxa"/>
             </w:tcMar>
           </w:tcPr>
           <w:p>
@@ -2406,7 +2416,7 @@
             <w:r>
               <w:rPr>
                 <w:b/>
-                <w:sz w:val="19"/>
+                <w:sz w:val="20"/>
               </w:rPr>
               <w:t>16 GB RAM</w:t>
               <w:br/>
@@ -2428,68 +2438,39 @@
         <w:rPr>
           <w:b/>
         </w:rPr>
-        <w:t>Welchen Laptop würdest du empfehlen? Begründe mit mindestens zwei sinnvollen Argumenten.</w:t>
+        <w:t>Welchen Laptop würdest du empfehlen? Nenne drei kurze, sinnvolle Gründe für deine Entscheidung.</w:t>
+      </w:r>
+    </w:p>
+    <w:p>
+      <w:r>
+        <w:rPr>
+          <w:color w:val="64748B"/>
+          <w:sz w:val="20"/>
+        </w:rPr>
+        <w:t>Entscheidung: 1 P · Gründe: je 1 P, max. 3 P</w:t>
       </w:r>
     </w:p>
     <w:p>
       <w:pPr>
-        <w:tabs>
-          <w:tab w:pos="9751" w:val="right" w:leader="underscore"/>
-        </w:tabs>
-        <w:spacing w:after="60"/>
+        <w:spacing w:after="80" w:before="20" w:line="240" w:lineRule="auto"/>
+        <w:pBdr>
+          <w:bottom w:val="single" w:sz="5" w:space="1" w:color="94A3B8"/>
+        </w:pBdr>
       </w:pPr>
-      <w:r>
-        <w:tab/>
-      </w:r>
     </w:p>
     <w:p>
       <w:pPr>
-        <w:tabs>
-          <w:tab w:pos="9751" w:val="right" w:leader="underscore"/>
-        </w:tabs>
-        <w:spacing w:after="60"/>
+        <w:spacing w:after="80" w:before="20" w:line="240" w:lineRule="auto"/>
+        <w:pBdr>
+          <w:bottom w:val="single" w:sz="5" w:space="1" w:color="94A3B8"/>
+        </w:pBdr>
       </w:pPr>
-      <w:r>
-        <w:tab/>
-      </w:r>
-    </w:p>
-    <w:p>
-      <w:pPr>
-        <w:tabs>
-          <w:tab w:pos="9751" w:val="right" w:leader="underscore"/>
-        </w:tabs>
-        <w:spacing w:after="60"/>
-      </w:pPr>
-      <w:r>
-        <w:tab/>
-      </w:r>
-    </w:p>
-    <w:p>
-      <w:pPr>
-        <w:tabs>
-          <w:tab w:pos="9751" w:val="right" w:leader="underscore"/>
-        </w:tabs>
-        <w:spacing w:after="60"/>
-      </w:pPr>
-      <w:r>
-        <w:tab/>
-      </w:r>
-    </w:p>
-    <w:p>
-      <w:pPr>
-        <w:tabs>
-          <w:tab w:pos="9751" w:val="right" w:leader="underscore"/>
-        </w:tabs>
-        <w:spacing w:after="60"/>
-      </w:pPr>
-      <w:r>
-        <w:tab/>
-      </w:r>
     </w:p>
     <w:p>
       <w:pPr>
         <w:pStyle w:val="Heading1"/>
         <w:keepNext w:val="1"/>
+        <w:spacing w:before="140" w:after="80"/>
       </w:pPr>
       <w:r>
         <w:rPr>
@@ -2512,19 +2493,32 @@
       </w:pPr>
       <w:r>
         <w:rPr>
-          <w:color w:val="64748B"/>
-          <w:sz w:val="19"/>
+          <w:rFonts w:ascii="Arial" w:hAnsi="Arial"/>
+          <w:sz w:val="20"/>
         </w:rPr>
-        <w:t>Bei jedem Fall gehören zwei Aktionen nicht zu einem sinnvollen ersten Troubleshooting-Ablauf. Streiche diese zwei Aktionen.</w:t>
+        <w:t>Kreuze bei jedem Fall genau zwei sinnvolle erste Troubleshooting-Schritte an. Je korrekt gewähltem Schritt 1 P. Werden in einem Fall mehr als zwei Schritte angekreuzt, gibt dieser Fall 0 P.</w:t>
       </w:r>
     </w:p>
     <w:p>
       <w:pPr>
         <w:pStyle w:val="Heading2"/>
         <w:keepNext w:val="1"/>
+        <w:spacing w:before="80" w:after="40"/>
       </w:pPr>
       <w:r>
-        <w:t>A) PC startet nicht – 2 P</w:t>
+        <w:t>A) PC reagiert gar nicht – 2 P</w:t>
+      </w:r>
+    </w:p>
+    <w:p>
+      <w:pPr>
+        <w:spacing w:after="60"/>
+      </w:pPr>
+      <w:r>
+        <w:rPr>
+          <w:color w:val="64748B"/>
+          <w:sz w:val="20"/>
+        </w:rPr>
+        <w:t>Beim Drücken des Einschaltknopfs passiert nichts: keine LEDs, keine Lüfter, kein Geräusch.</w:t>
       </w:r>
     </w:p>
     <w:tbl>
@@ -2547,9 +2541,9 @@
             <w:tcW w:type="dxa" w:w="4876"/>
             <w:tcMar>
               <w:top w:w="55" w:type="dxa"/>
-              <w:start w:w="60" w:type="dxa"/>
+              <w:left w:w="60" w:type="dxa"/>
               <w:bottom w:w="55" w:type="dxa"/>
-              <w:end w:w="60" w:type="dxa"/>
+              <w:right w:w="60" w:type="dxa"/>
             </w:tcMar>
             <w:tcBorders>
               <w:bottom w:val="single" w:sz="3" w:color="E2E8F0"/>
@@ -2558,9 +2552,10 @@
           <w:p>
             <w:r>
               <w:rPr>
-                <w:sz w:val="17"/>
+                <w:rFonts w:ascii="Arial" w:hAnsi="Arial"/>
+                <w:sz w:val="20"/>
               </w:rPr>
-              <w:t>□  Steckdose prüfen</w:t>
+              <w:t>□  Prüfen, ob das Stromkabel fest am PC und an der Steckdose steckt</w:t>
             </w:r>
           </w:p>
         </w:tc>
@@ -2569,9 +2564,9 @@
             <w:tcW w:type="dxa" w:w="4876"/>
             <w:tcMar>
               <w:top w:w="55" w:type="dxa"/>
-              <w:start w:w="60" w:type="dxa"/>
+              <w:left w:w="60" w:type="dxa"/>
               <w:bottom w:w="55" w:type="dxa"/>
-              <w:end w:w="60" w:type="dxa"/>
+              <w:right w:w="60" w:type="dxa"/>
             </w:tcMar>
             <w:tcBorders>
               <w:bottom w:val="single" w:sz="3" w:color="E2E8F0"/>
@@ -2580,9 +2575,10 @@
           <w:p>
             <w:r>
               <w:rPr>
-                <w:sz w:val="17"/>
+                <w:rFonts w:ascii="Arial" w:hAnsi="Arial"/>
+                <w:sz w:val="20"/>
               </w:rPr>
-              <w:t>□  Stromkabel prüfen</w:t>
+              <w:t>□  Eine andere Steckdose testen</w:t>
             </w:r>
           </w:p>
         </w:tc>
@@ -2596,9 +2592,9 @@
             <w:tcW w:type="dxa" w:w="4876"/>
             <w:tcMar>
               <w:top w:w="55" w:type="dxa"/>
-              <w:start w:w="60" w:type="dxa"/>
+              <w:left w:w="60" w:type="dxa"/>
               <w:bottom w:w="55" w:type="dxa"/>
-              <w:end w:w="60" w:type="dxa"/>
+              <w:right w:w="60" w:type="dxa"/>
             </w:tcMar>
             <w:tcBorders>
               <w:bottom w:val="single" w:sz="3" w:color="E2E8F0"/>
@@ -2607,9 +2603,10 @@
           <w:p>
             <w:r>
               <w:rPr>
-                <w:sz w:val="17"/>
+                <w:rFonts w:ascii="Arial" w:hAnsi="Arial"/>
+                <w:sz w:val="20"/>
               </w:rPr>
-              <w:t>□  Netzschalter am Netzteil prüfen</w:t>
+              <w:t>□  HDMI-/DisplayPort-Kabel zum Monitor prüfen</w:t>
             </w:r>
           </w:p>
         </w:tc>
@@ -2618,9 +2615,9 @@
             <w:tcW w:type="dxa" w:w="4876"/>
             <w:tcMar>
               <w:top w:w="55" w:type="dxa"/>
-              <w:start w:w="60" w:type="dxa"/>
+              <w:left w:w="60" w:type="dxa"/>
               <w:bottom w:w="55" w:type="dxa"/>
-              <w:end w:w="60" w:type="dxa"/>
+              <w:right w:w="60" w:type="dxa"/>
             </w:tcMar>
             <w:tcBorders>
               <w:bottom w:val="single" w:sz="3" w:color="E2E8F0"/>
@@ -2629,9 +2626,10 @@
           <w:p>
             <w:r>
               <w:rPr>
-                <w:sz w:val="17"/>
+                <w:rFonts w:ascii="Arial" w:hAnsi="Arial"/>
+                <w:sz w:val="20"/>
               </w:rPr>
-              <w:t>□  Windows neu installieren</w:t>
+              <w:t>□  Maus an einem anderen USB-Anschluss testen</w:t>
             </w:r>
           </w:p>
         </w:tc>
@@ -2645,9 +2643,9 @@
             <w:tcW w:type="dxa" w:w="4876"/>
             <w:tcMar>
               <w:top w:w="55" w:type="dxa"/>
-              <w:start w:w="60" w:type="dxa"/>
+              <w:left w:w="60" w:type="dxa"/>
               <w:bottom w:w="55" w:type="dxa"/>
-              <w:end w:w="60" w:type="dxa"/>
+              <w:right w:w="60" w:type="dxa"/>
             </w:tcMar>
             <w:tcBorders>
               <w:bottom w:val="single" w:sz="3" w:color="E2E8F0"/>
@@ -2656,9 +2654,10 @@
           <w:p>
             <w:r>
               <w:rPr>
-                <w:sz w:val="17"/>
+                <w:rFonts w:ascii="Arial" w:hAnsi="Arial"/>
+                <w:sz w:val="20"/>
               </w:rPr>
-              <w:t>□  Monitor heller stellen</w:t>
+              <w:t>□  Netzwerkkabel austauschen</w:t>
             </w:r>
           </w:p>
         </w:tc>
@@ -2667,9 +2666,9 @@
             <w:tcW w:type="dxa" w:w="4876"/>
             <w:tcMar>
               <w:top w:w="55" w:type="dxa"/>
-              <w:start w:w="60" w:type="dxa"/>
+              <w:left w:w="60" w:type="dxa"/>
               <w:bottom w:w="55" w:type="dxa"/>
-              <w:end w:w="60" w:type="dxa"/>
+              <w:right w:w="60" w:type="dxa"/>
             </w:tcMar>
             <w:tcBorders>
               <w:bottom w:val="single" w:sz="3" w:color="E2E8F0"/>
@@ -2678,9 +2677,10 @@
           <w:p>
             <w:r>
               <w:rPr>
-                <w:sz w:val="17"/>
+                <w:rFonts w:ascii="Arial" w:hAnsi="Arial"/>
+                <w:sz w:val="20"/>
               </w:rPr>
-              <w:t>□  andere Steckdose testen</w:t>
+              <w:t>□  Browser neu öffnen</w:t>
             </w:r>
           </w:p>
         </w:tc>
@@ -2690,9 +2690,22 @@
       <w:pPr>
         <w:pStyle w:val="Heading2"/>
         <w:keepNext w:val="1"/>
+        <w:spacing w:before="80" w:after="40"/>
       </w:pPr>
       <w:r>
-        <w:t>B) Monitor zeigt kein Bild – 2 P</w:t>
+        <w:t>B) Monitor meldet „Kein Signal“ – 2 P</w:t>
+      </w:r>
+    </w:p>
+    <w:p>
+      <w:pPr>
+        <w:spacing w:after="60"/>
+      </w:pPr>
+      <w:r>
+        <w:rPr>
+          <w:color w:val="64748B"/>
+          <w:sz w:val="20"/>
+        </w:rPr>
+        <w:t>Der PC läuft: LEDs und Lüfter sind an, aber der Monitor meldet direkt beim Einschalten „Kein Signal“.</w:t>
       </w:r>
     </w:p>
     <w:tbl>
@@ -2715,9 +2728,9 @@
             <w:tcW w:type="dxa" w:w="4876"/>
             <w:tcMar>
               <w:top w:w="55" w:type="dxa"/>
-              <w:start w:w="60" w:type="dxa"/>
+              <w:left w:w="60" w:type="dxa"/>
               <w:bottom w:w="55" w:type="dxa"/>
-              <w:end w:w="60" w:type="dxa"/>
+              <w:right w:w="60" w:type="dxa"/>
             </w:tcMar>
             <w:tcBorders>
               <w:bottom w:val="single" w:sz="3" w:color="E2E8F0"/>
@@ -2726,9 +2739,10 @@
           <w:p>
             <w:r>
               <w:rPr>
-                <w:sz w:val="17"/>
+                <w:rFonts w:ascii="Arial" w:hAnsi="Arial"/>
+                <w:sz w:val="20"/>
               </w:rPr>
-              <w:t>□  Prüfen, ob der Monitor eingeschaltet ist</w:t>
+              <w:t>□  HDMI-/DisplayPort-Kabel prüfen</w:t>
             </w:r>
           </w:p>
         </w:tc>
@@ -2737,9 +2751,9 @@
             <w:tcW w:type="dxa" w:w="4876"/>
             <w:tcMar>
               <w:top w:w="55" w:type="dxa"/>
-              <w:start w:w="60" w:type="dxa"/>
+              <w:left w:w="60" w:type="dxa"/>
               <w:bottom w:w="55" w:type="dxa"/>
-              <w:end w:w="60" w:type="dxa"/>
+              <w:right w:w="60" w:type="dxa"/>
             </w:tcMar>
             <w:tcBorders>
               <w:bottom w:val="single" w:sz="3" w:color="E2E8F0"/>
@@ -2748,9 +2762,10 @@
           <w:p>
             <w:r>
               <w:rPr>
-                <w:sz w:val="17"/>
+                <w:rFonts w:ascii="Arial" w:hAnsi="Arial"/>
+                <w:sz w:val="20"/>
               </w:rPr>
-              <w:t>□  HDMI-/DisplayPort-Kabel prüfen</w:t>
+              <w:t>□  Richtigen Eingang am Monitor auswählen</w:t>
             </w:r>
           </w:p>
         </w:tc>
@@ -2764,9 +2779,9 @@
             <w:tcW w:type="dxa" w:w="4876"/>
             <w:tcMar>
               <w:top w:w="55" w:type="dxa"/>
-              <w:start w:w="60" w:type="dxa"/>
+              <w:left w:w="60" w:type="dxa"/>
               <w:bottom w:w="55" w:type="dxa"/>
-              <w:end w:w="60" w:type="dxa"/>
+              <w:right w:w="60" w:type="dxa"/>
             </w:tcMar>
             <w:tcBorders>
               <w:bottom w:val="single" w:sz="3" w:color="E2E8F0"/>
@@ -2775,9 +2790,10 @@
           <w:p>
             <w:r>
               <w:rPr>
-                <w:sz w:val="17"/>
+                <w:rFonts w:ascii="Arial" w:hAnsi="Arial"/>
+                <w:sz w:val="20"/>
               </w:rPr>
-              <w:t>□  richtigen Eingang am Monitor auswählen</w:t>
+              <w:t>□  Netzwerkkabel zum Router prüfen</w:t>
             </w:r>
           </w:p>
         </w:tc>
@@ -2786,9 +2802,9 @@
             <w:tcW w:type="dxa" w:w="4876"/>
             <w:tcMar>
               <w:top w:w="55" w:type="dxa"/>
-              <w:start w:w="60" w:type="dxa"/>
+              <w:left w:w="60" w:type="dxa"/>
               <w:bottom w:w="55" w:type="dxa"/>
-              <w:end w:w="60" w:type="dxa"/>
+              <w:right w:w="60" w:type="dxa"/>
             </w:tcMar>
             <w:tcBorders>
               <w:bottom w:val="single" w:sz="3" w:color="E2E8F0"/>
@@ -2797,9 +2813,10 @@
           <w:p>
             <w:r>
               <w:rPr>
-                <w:sz w:val="17"/>
+                <w:rFonts w:ascii="Arial" w:hAnsi="Arial"/>
+                <w:sz w:val="20"/>
               </w:rPr>
-              <w:t>□  Tastatur austauschen</w:t>
+              <w:t>□  Maus neu anschliessen</w:t>
             </w:r>
           </w:p>
         </w:tc>
@@ -2813,9 +2830,9 @@
             <w:tcW w:type="dxa" w:w="4876"/>
             <w:tcMar>
               <w:top w:w="55" w:type="dxa"/>
-              <w:start w:w="60" w:type="dxa"/>
+              <w:left w:w="60" w:type="dxa"/>
               <w:bottom w:w="55" w:type="dxa"/>
-              <w:end w:w="60" w:type="dxa"/>
+              <w:right w:w="60" w:type="dxa"/>
             </w:tcMar>
             <w:tcBorders>
               <w:bottom w:val="single" w:sz="3" w:color="E2E8F0"/>
@@ -2824,9 +2841,10 @@
           <w:p>
             <w:r>
               <w:rPr>
-                <w:sz w:val="17"/>
+                <w:rFonts w:ascii="Arial" w:hAnsi="Arial"/>
+                <w:sz w:val="20"/>
               </w:rPr>
-              <w:t>□  Druckertreiber installieren</w:t>
+              <w:t>□  Drucker aus- und einschalten</w:t>
             </w:r>
           </w:p>
         </w:tc>
@@ -2835,9 +2853,9 @@
             <w:tcW w:type="dxa" w:w="4876"/>
             <w:tcMar>
               <w:top w:w="55" w:type="dxa"/>
-              <w:start w:w="60" w:type="dxa"/>
+              <w:left w:w="60" w:type="dxa"/>
               <w:bottom w:w="55" w:type="dxa"/>
-              <w:end w:w="60" w:type="dxa"/>
+              <w:right w:w="60" w:type="dxa"/>
             </w:tcMar>
             <w:tcBorders>
               <w:bottom w:val="single" w:sz="3" w:color="E2E8F0"/>
@@ -2846,9 +2864,10 @@
           <w:p>
             <w:r>
               <w:rPr>
-                <w:sz w:val="17"/>
+                <w:rFonts w:ascii="Arial" w:hAnsi="Arial"/>
+                <w:sz w:val="20"/>
               </w:rPr>
-              <w:t>□  Kabel an einem anderen Anschluss testen</w:t>
+              <w:t>□  Eine andere Webseite öffnen</w:t>
             </w:r>
           </w:p>
         </w:tc>
@@ -2858,9 +2877,22 @@
       <w:pPr>
         <w:pStyle w:val="Heading2"/>
         <w:keepNext w:val="1"/>
+        <w:spacing w:before="80" w:after="40"/>
       </w:pPr>
       <w:r>
         <w:t>C) Kein Internet über Netzwerkkabel – 2 P</w:t>
+      </w:r>
+    </w:p>
+    <w:p>
+      <w:pPr>
+        <w:spacing w:after="60"/>
+      </w:pPr>
+      <w:r>
+        <w:rPr>
+          <w:color w:val="64748B"/>
+          <w:sz w:val="20"/>
+        </w:rPr>
+        <w:t>Am PC steht „Netzwerkkabel nicht angeschlossen“.</w:t>
       </w:r>
     </w:p>
     <w:tbl>
@@ -2883,9 +2915,9 @@
             <w:tcW w:type="dxa" w:w="4876"/>
             <w:tcMar>
               <w:top w:w="55" w:type="dxa"/>
-              <w:start w:w="60" w:type="dxa"/>
+              <w:left w:w="60" w:type="dxa"/>
               <w:bottom w:w="55" w:type="dxa"/>
-              <w:end w:w="60" w:type="dxa"/>
+              <w:right w:w="60" w:type="dxa"/>
             </w:tcMar>
             <w:tcBorders>
               <w:bottom w:val="single" w:sz="3" w:color="E2E8F0"/>
@@ -2894,9 +2926,10 @@
           <w:p>
             <w:r>
               <w:rPr>
-                <w:sz w:val="17"/>
+                <w:rFonts w:ascii="Arial" w:hAnsi="Arial"/>
+                <w:sz w:val="20"/>
               </w:rPr>
-              <w:t>□  RJ45-Kabel prüfen</w:t>
+              <w:t>□  Prüfen, ob das RJ45-Kabel am PC und am Router/Switch richtig steckt</w:t>
             </w:r>
           </w:p>
         </w:tc>
@@ -2905,9 +2938,9 @@
             <w:tcW w:type="dxa" w:w="4876"/>
             <w:tcMar>
               <w:top w:w="55" w:type="dxa"/>
-              <w:start w:w="60" w:type="dxa"/>
+              <w:left w:w="60" w:type="dxa"/>
               <w:bottom w:w="55" w:type="dxa"/>
-              <w:end w:w="60" w:type="dxa"/>
+              <w:right w:w="60" w:type="dxa"/>
             </w:tcMar>
             <w:tcBorders>
               <w:bottom w:val="single" w:sz="3" w:color="E2E8F0"/>
@@ -2916,9 +2949,10 @@
           <w:p>
             <w:r>
               <w:rPr>
-                <w:sz w:val="17"/>
+                <w:rFonts w:ascii="Arial" w:hAnsi="Arial"/>
+                <w:sz w:val="20"/>
               </w:rPr>
-              <w:t>□  prüfen, ob das Kabel am Router/Switch steckt</w:t>
+              <w:t>□  Ein anderes Netzwerkkabel testen</w:t>
             </w:r>
           </w:p>
         </w:tc>
@@ -2932,9 +2966,9 @@
             <w:tcW w:type="dxa" w:w="4876"/>
             <w:tcMar>
               <w:top w:w="55" w:type="dxa"/>
-              <w:start w:w="60" w:type="dxa"/>
+              <w:left w:w="60" w:type="dxa"/>
               <w:bottom w:w="55" w:type="dxa"/>
-              <w:end w:w="60" w:type="dxa"/>
+              <w:right w:w="60" w:type="dxa"/>
             </w:tcMar>
             <w:tcBorders>
               <w:bottom w:val="single" w:sz="3" w:color="E2E8F0"/>
@@ -2943,9 +2977,10 @@
           <w:p>
             <w:r>
               <w:rPr>
-                <w:sz w:val="17"/>
+                <w:rFonts w:ascii="Arial" w:hAnsi="Arial"/>
+                <w:sz w:val="20"/>
               </w:rPr>
-              <w:t>□  anderen Netzwerkanschluss testen</w:t>
+              <w:t>□  HDMI-/DisplayPort-Kabel zum Monitor prüfen</w:t>
             </w:r>
           </w:p>
         </w:tc>
@@ -2954,9 +2989,9 @@
             <w:tcW w:type="dxa" w:w="4876"/>
             <w:tcMar>
               <w:top w:w="55" w:type="dxa"/>
-              <w:start w:w="60" w:type="dxa"/>
+              <w:left w:w="60" w:type="dxa"/>
               <w:bottom w:w="55" w:type="dxa"/>
-              <w:end w:w="60" w:type="dxa"/>
+              <w:right w:w="60" w:type="dxa"/>
             </w:tcMar>
             <w:tcBorders>
               <w:bottom w:val="single" w:sz="3" w:color="E2E8F0"/>
@@ -2965,9 +3000,10 @@
           <w:p>
             <w:r>
               <w:rPr>
-                <w:sz w:val="17"/>
+                <w:rFonts w:ascii="Arial" w:hAnsi="Arial"/>
+                <w:sz w:val="20"/>
               </w:rPr>
-              <w:t>□  Grafikkarte ausbauen</w:t>
+              <w:t>□  WLAN-Passwort neu eingeben</w:t>
             </w:r>
           </w:p>
         </w:tc>
@@ -2981,9 +3017,9 @@
             <w:tcW w:type="dxa" w:w="4876"/>
             <w:tcMar>
               <w:top w:w="55" w:type="dxa"/>
-              <w:start w:w="60" w:type="dxa"/>
+              <w:left w:w="60" w:type="dxa"/>
               <w:bottom w:w="55" w:type="dxa"/>
-              <w:end w:w="60" w:type="dxa"/>
+              <w:right w:w="60" w:type="dxa"/>
             </w:tcMar>
             <w:tcBorders>
               <w:bottom w:val="single" w:sz="3" w:color="E2E8F0"/>
@@ -2992,9 +3028,10 @@
           <w:p>
             <w:r>
               <w:rPr>
-                <w:sz w:val="17"/>
+                <w:rFonts w:ascii="Arial" w:hAnsi="Arial"/>
+                <w:sz w:val="20"/>
               </w:rPr>
-              <w:t>□  Audiokabel ersetzen</w:t>
+              <w:t>□  Lautsprecher neu anschliessen</w:t>
             </w:r>
           </w:p>
         </w:tc>
@@ -3003,9 +3040,9 @@
             <w:tcW w:type="dxa" w:w="4876"/>
             <w:tcMar>
               <w:top w:w="55" w:type="dxa"/>
-              <w:start w:w="60" w:type="dxa"/>
+              <w:left w:w="60" w:type="dxa"/>
               <w:bottom w:w="55" w:type="dxa"/>
-              <w:end w:w="60" w:type="dxa"/>
+              <w:right w:w="60" w:type="dxa"/>
             </w:tcMar>
             <w:tcBorders>
               <w:bottom w:val="single" w:sz="3" w:color="E2E8F0"/>
@@ -3014,9 +3051,10 @@
           <w:p>
             <w:r>
               <w:rPr>
-                <w:sz w:val="17"/>
+                <w:rFonts w:ascii="Arial" w:hAnsi="Arial"/>
+                <w:sz w:val="20"/>
               </w:rPr>
-              <w:t>□  Router bzw. Netzwerkstatus prüfen</w:t>
+              <w:t>□  Bildschirmhelligkeit ändern</w:t>
             </w:r>
           </w:p>
         </w:tc>
@@ -3026,7 +3064,8 @@
       <w:pPr>
         <w:pStyle w:val="Heading1"/>
         <w:keepNext w:val="1"/>
-        <w:pageBreakBefore/>
+        <w:pageBreakBefore w:val="0"/>
+        <w:spacing w:before="140" w:after="80"/>
       </w:pPr>
       <w:r>
         <w:rPr>
@@ -3050,7 +3089,7 @@
       <w:r>
         <w:rPr>
           <w:color w:val="64748B"/>
-          <w:sz w:val="19"/>
+          <w:sz w:val="20"/>
         </w:rPr>
         <w:t>Beantworte die Fragen zur nachhaltigen Nutzung von Geräten.</w:t>
       </w:r>
@@ -3069,7 +3108,7 @@
       </w:pPr>
       <w:r>
         <w:rPr>
-          <w:sz w:val="18"/>
+          <w:sz w:val="20"/>
         </w:rPr>
         <w:t>☐ A: Neues Gerät kaufen      ☐ B: Akku ersetzen und Laptop weiterverwenden</w:t>
       </w:r>
@@ -3077,111 +3116,47 @@
     <w:p>
       <w:r>
         <w:rPr>
-          <w:sz w:val="18"/>
+          <w:sz w:val="20"/>
         </w:rPr>
         <w:t>Begründe deine Entscheidung. (2 P)</w:t>
       </w:r>
     </w:p>
     <w:p>
       <w:pPr>
-        <w:tabs>
-          <w:tab w:pos="9751" w:val="right" w:leader="underscore"/>
-        </w:tabs>
-        <w:spacing w:after="60"/>
+        <w:spacing w:after="80" w:before="20" w:line="240" w:lineRule="auto"/>
+        <w:pBdr>
+          <w:bottom w:val="single" w:sz="5" w:space="1" w:color="94A3B8"/>
+        </w:pBdr>
       </w:pPr>
-      <w:r>
-        <w:tab/>
-      </w:r>
     </w:p>
     <w:p>
       <w:pPr>
-        <w:tabs>
-          <w:tab w:pos="9751" w:val="right" w:leader="underscore"/>
-        </w:tabs>
-        <w:spacing w:after="60"/>
+        <w:spacing w:after="80" w:before="20" w:line="240" w:lineRule="auto"/>
+        <w:pBdr>
+          <w:bottom w:val="single" w:sz="5" w:space="1" w:color="94A3B8"/>
+        </w:pBdr>
       </w:pPr>
-      <w:r>
-        <w:tab/>
-      </w:r>
-    </w:p>
-    <w:p>
-      <w:pPr>
-        <w:tabs>
-          <w:tab w:pos="9751" w:val="right" w:leader="underscore"/>
-        </w:tabs>
-        <w:spacing w:after="60"/>
-      </w:pPr>
-      <w:r>
-        <w:tab/>
-      </w:r>
-    </w:p>
-    <w:p>
-      <w:pPr>
-        <w:tabs>
-          <w:tab w:pos="9751" w:val="right" w:leader="underscore"/>
-        </w:tabs>
-        <w:spacing w:after="60"/>
-      </w:pPr>
-      <w:r>
-        <w:tab/>
-      </w:r>
-    </w:p>
-    <w:p>
-      <w:pPr>
-        <w:tabs>
-          <w:tab w:pos="9751" w:val="right" w:leader="underscore"/>
-        </w:tabs>
-        <w:spacing w:after="60"/>
-      </w:pPr>
-      <w:r>
-        <w:tab/>
-      </w:r>
     </w:p>
     <w:p>
       <w:r>
         <w:rPr>
-          <w:sz w:val="18"/>
+          <w:sz w:val="20"/>
         </w:rPr>
         <w:t>2. Warum ist die Herstellung von Elektronik ökologisch relevant? Nenne einen Grund. (1 P)</w:t>
       </w:r>
     </w:p>
     <w:p>
       <w:pPr>
-        <w:tabs>
-          <w:tab w:pos="9751" w:val="right" w:leader="underscore"/>
-        </w:tabs>
-        <w:spacing w:after="60"/>
+        <w:spacing w:after="80" w:before="20" w:line="240" w:lineRule="auto"/>
+        <w:pBdr>
+          <w:bottom w:val="single" w:sz="5" w:space="1" w:color="94A3B8"/>
+        </w:pBdr>
       </w:pPr>
-      <w:r>
-        <w:tab/>
-      </w:r>
-    </w:p>
-    <w:p>
-      <w:pPr>
-        <w:tabs>
-          <w:tab w:pos="9751" w:val="right" w:leader="underscore"/>
-        </w:tabs>
-        <w:spacing w:after="60"/>
-      </w:pPr>
-      <w:r>
-        <w:tab/>
-      </w:r>
-    </w:p>
-    <w:p>
-      <w:pPr>
-        <w:tabs>
-          <w:tab w:pos="9751" w:val="right" w:leader="underscore"/>
-        </w:tabs>
-        <w:spacing w:after="60"/>
-      </w:pPr>
-      <w:r>
-        <w:tab/>
-      </w:r>
     </w:p>
     <w:p>
       <w:r>
         <w:rPr>
-          <w:sz w:val="18"/>
+          <w:sz w:val="20"/>
         </w:rPr>
         <w:t>3. Was sollte mit einem defekten Smartphone gemacht werden? (1 P)</w:t>
       </w:r>
@@ -3192,7 +3167,7 @@
       </w:pPr>
       <w:r>
         <w:rPr>
-          <w:sz w:val="18"/>
+          <w:sz w:val="20"/>
         </w:rPr>
         <w:t>☐ A: Hausmüll      ☐ B: Schublade      ☐ C: Fachgerecht zurückgeben/recyceln</w:t>
       </w:r>
@@ -3220,7 +3195,7 @@
           <w:rFonts w:ascii="Arial" w:hAnsi="Arial"/>
           <w:b w:val="0"/>
           <w:color w:val="64748B"/>
-          <w:sz w:val="19"/>
+          <w:sz w:val="20"/>
         </w:rPr>
         <w:t>Zwei freiwillige Transferfragen. Jede richtige Lösung gibt +1 Bonuspunkt.</w:t>
       </w:r>
@@ -3248,7 +3223,7 @@
           <w:rFonts w:ascii="Arial" w:hAnsi="Arial"/>
           <w:b w:val="0"/>
           <w:color w:val="0F172A"/>
-          <w:sz w:val="18"/>
+          <w:sz w:val="20"/>
         </w:rPr>
         <w:t>Ein Schüler sagt: „Mein PC ist langsam, also brauche ich sicher eine neue Grafikkarte.“</w:t>
       </w:r>
@@ -3262,7 +3237,7 @@
           <w:rFonts w:ascii="Arial" w:hAnsi="Arial"/>
           <w:b w:val="0"/>
           <w:color w:val="64748B"/>
-          <w:sz w:val="18"/>
+          <w:sz w:val="20"/>
         </w:rPr>
         <w:t>Der PC hat: 4 GB RAM · HDD · CPU 35 % · GPU 8 % · 17 Browser-Tabs geöffnet</w:t>
       </w:r>
@@ -3276,32 +3251,18 @@
           <w:rFonts w:ascii="Arial" w:hAnsi="Arial"/>
           <w:b/>
           <w:color w:val="0F172A"/>
-          <w:sz w:val="18"/>
+          <w:sz w:val="20"/>
         </w:rPr>
         <w:t>Was würdest du zuerst ändern – und warum?</w:t>
       </w:r>
     </w:p>
     <w:p>
       <w:pPr>
-        <w:tabs>
-          <w:tab w:pos="9751" w:val="right" w:leader="underscore"/>
-        </w:tabs>
-        <w:spacing w:before="0" w:after="60"/>
+        <w:spacing w:before="20" w:after="80" w:line="240" w:lineRule="auto"/>
+        <w:pBdr>
+          <w:bottom w:val="single" w:sz="5" w:space="1" w:color="94A3B8"/>
+        </w:pBdr>
       </w:pPr>
-      <w:r>
-        <w:tab/>
-      </w:r>
-    </w:p>
-    <w:p>
-      <w:pPr>
-        <w:tabs>
-          <w:tab w:pos="9751" w:val="right" w:leader="underscore"/>
-        </w:tabs>
-        <w:spacing w:before="0" w:after="60"/>
-      </w:pPr>
-      <w:r>
-        <w:tab/>
-      </w:r>
     </w:p>
     <w:p>
       <w:pPr>
@@ -3326,7 +3287,7 @@
           <w:rFonts w:ascii="Arial" w:hAnsi="Arial"/>
           <w:b w:val="0"/>
           <w:color w:val="0F172A"/>
-          <w:sz w:val="18"/>
+          <w:sz w:val="20"/>
         </w:rPr>
         <w:t>Ein PC hat: 32 GB RAM · starke CPU · starke Grafikkarte · 5400-rpm-HDD · Windows startet in 2 Minuten</w:t>
       </w:r>
@@ -3340,32 +3301,18 @@
           <w:rFonts w:ascii="Arial" w:hAnsi="Arial"/>
           <w:b/>
           <w:color w:val="0F172A"/>
-          <w:sz w:val="18"/>
+          <w:sz w:val="20"/>
         </w:rPr>
         <w:t>Welche Komponente ist der wahrscheinlichste Flaschenhals? Begründe kurz.</w:t>
       </w:r>
     </w:p>
     <w:p>
       <w:pPr>
-        <w:tabs>
-          <w:tab w:pos="9751" w:val="right" w:leader="underscore"/>
-        </w:tabs>
-        <w:spacing w:before="0" w:after="60"/>
+        <w:spacing w:before="20" w:after="80" w:line="240" w:lineRule="auto"/>
+        <w:pBdr>
+          <w:bottom w:val="single" w:sz="5" w:space="1" w:color="94A3B8"/>
+        </w:pBdr>
       </w:pPr>
-      <w:r>
-        <w:tab/>
-      </w:r>
-    </w:p>
-    <w:p>
-      <w:pPr>
-        <w:tabs>
-          <w:tab w:pos="9751" w:val="right" w:leader="underscore"/>
-        </w:tabs>
-        <w:spacing w:before="0" w:after="60"/>
-      </w:pPr>
-      <w:r>
-        <w:tab/>
-      </w:r>
     </w:p>
     <w:p>
       <w:pPr>
@@ -3376,7 +3323,7 @@
           <w:rFonts w:ascii="Arial" w:hAnsi="Arial"/>
           <w:b w:val="0"/>
           <w:color w:val="64748B"/>
-          <w:sz w:val="16"/>
+          <w:sz w:val="20"/>
         </w:rPr>
         <w:t>Bonuspunkte zählen zusätzlich zu den 41 regulären Punkten. Maximalnote: 6.0.</w:t>
       </w:r>
@@ -3397,6 +3344,11 @@
     </w:p>
     <w:sectPr>
       <w:footerReference w:type="default" r:id="rId9"/>
+      <w:headerReference w:type="default" r:id="rId10"/>
+      <w:headerReference w:type="first" r:id="rId11"/>
+      <w:headerReference w:type="even" r:id="rId12"/>
+      <w:footerReference w:type="first" r:id="rId13"/>
+      <w:footerReference w:type="even" r:id="rId14"/>
       <w:pgSz w:w="11906" w:h="16838"/>
       <w:pgMar w:top="709" w:right="879" w:bottom="709" w:left="879" w:header="720" w:footer="720" w:gutter="0"/>
       <w:cols w:space="720"/>
@@ -3417,14 +3369,14 @@
       <w:rPr>
         <w:rFonts w:ascii="Arial" w:hAnsi="Arial"/>
         <w:color w:val="64748B"/>
-        <w:sz w:val="16"/>
+        <w:sz w:val="20"/>
       </w:rPr>
       <w:t xml:space="preserve">P1 · Übungstest Hardware · </w:t>
     </w:r>
     <w:r>
       <w:rPr>
         <w:color w:val="64748B"/>
-        <w:sz w:val="16"/>
+        <w:sz w:val="20"/>
       </w:rPr>
       <w:t xml:space="preserve">Seite </w:t>
       <w:fldChar w:fldCharType="begin"/>
@@ -3433,6 +3385,56 @@
     </w:r>
   </w:p>
 </w:ftr>
+</file>
+
+<file path=word/footer2.xml><?xml version="1.0" encoding="utf-8"?>
+<w:ftr xmlns:m="http://schemas.openxmlformats.org/officeDocument/2006/math" xmlns:mc="http://schemas.openxmlformats.org/markup-compatibility/2006" xmlns:mo="http://schemas.microsoft.com/office/mac/office/2008/main" xmlns:mv="urn:schemas-microsoft-com:mac:vml" xmlns:o="urn:schemas-microsoft-com:office:office" xmlns:r="http://schemas.openxmlformats.org/officeDocument/2006/relationships" xmlns:v="urn:schemas-microsoft-com:vml" xmlns:w10="urn:schemas-microsoft-com:office:word" xmlns:w14="http://schemas.microsoft.com/office/word/2010/wordml" xmlns:w="http://schemas.openxmlformats.org/wordprocessingml/2006/main" xmlns:wne="http://schemas.microsoft.com/office/word/2006/wordml" xmlns:wp14="http://schemas.microsoft.com/office/word/2010/wordprocessingDrawing" xmlns:wp="http://schemas.openxmlformats.org/drawingml/2006/wordprocessingDrawing" xmlns:wpc="http://schemas.microsoft.com/office/word/2010/wordprocessingCanvas" xmlns:wpg="http://schemas.microsoft.com/office/word/2010/wordprocessingGroup" xmlns:wpi="http://schemas.microsoft.com/office/word/2010/wordprocessingInk" xmlns:wps="http://schemas.microsoft.com/office/word/2010/wordprocessingShape" mc:Ignorable="w14 wp14">
+  <w:p>
+    <w:pPr>
+      <w:pStyle w:val="Footer"/>
+    </w:pPr>
+  </w:p>
+</w:ftr>
+</file>
+
+<file path=word/footer3.xml><?xml version="1.0" encoding="utf-8"?>
+<w:ftr xmlns:m="http://schemas.openxmlformats.org/officeDocument/2006/math" xmlns:mc="http://schemas.openxmlformats.org/markup-compatibility/2006" xmlns:mo="http://schemas.microsoft.com/office/mac/office/2008/main" xmlns:mv="urn:schemas-microsoft-com:mac:vml" xmlns:o="urn:schemas-microsoft-com:office:office" xmlns:r="http://schemas.openxmlformats.org/officeDocument/2006/relationships" xmlns:v="urn:schemas-microsoft-com:vml" xmlns:w10="urn:schemas-microsoft-com:office:word" xmlns:w14="http://schemas.microsoft.com/office/word/2010/wordml" xmlns:w="http://schemas.openxmlformats.org/wordprocessingml/2006/main" xmlns:wne="http://schemas.microsoft.com/office/word/2006/wordml" xmlns:wp14="http://schemas.microsoft.com/office/word/2010/wordprocessingDrawing" xmlns:wp="http://schemas.openxmlformats.org/drawingml/2006/wordprocessingDrawing" xmlns:wpc="http://schemas.microsoft.com/office/word/2010/wordprocessingCanvas" xmlns:wpg="http://schemas.microsoft.com/office/word/2010/wordprocessingGroup" xmlns:wpi="http://schemas.microsoft.com/office/word/2010/wordprocessingInk" xmlns:wps="http://schemas.microsoft.com/office/word/2010/wordprocessingShape" mc:Ignorable="w14 wp14">
+  <w:p>
+    <w:pPr>
+      <w:pStyle w:val="Footer"/>
+    </w:pPr>
+  </w:p>
+</w:ftr>
+</file>
+
+<file path=word/header1.xml><?xml version="1.0" encoding="utf-8"?>
+<w:hdr xmlns:m="http://schemas.openxmlformats.org/officeDocument/2006/math" xmlns:mc="http://schemas.openxmlformats.org/markup-compatibility/2006" xmlns:mo="http://schemas.microsoft.com/office/mac/office/2008/main" xmlns:mv="urn:schemas-microsoft-com:mac:vml" xmlns:o="urn:schemas-microsoft-com:office:office" xmlns:r="http://schemas.openxmlformats.org/officeDocument/2006/relationships" xmlns:v="urn:schemas-microsoft-com:vml" xmlns:w10="urn:schemas-microsoft-com:office:word" xmlns:w14="http://schemas.microsoft.com/office/word/2010/wordml" xmlns:w="http://schemas.openxmlformats.org/wordprocessingml/2006/main" xmlns:wne="http://schemas.microsoft.com/office/word/2006/wordml" xmlns:wp14="http://schemas.microsoft.com/office/word/2010/wordprocessingDrawing" xmlns:wp="http://schemas.openxmlformats.org/drawingml/2006/wordprocessingDrawing" xmlns:wpc="http://schemas.microsoft.com/office/word/2010/wordprocessingCanvas" xmlns:wpg="http://schemas.microsoft.com/office/word/2010/wordprocessingGroup" xmlns:wpi="http://schemas.microsoft.com/office/word/2010/wordprocessingInk" xmlns:wps="http://schemas.microsoft.com/office/word/2010/wordprocessingShape" mc:Ignorable="w14 wp14">
+  <w:p>
+    <w:pPr>
+      <w:pStyle w:val="Header"/>
+    </w:pPr>
+  </w:p>
+</w:hdr>
+</file>
+
+<file path=word/header2.xml><?xml version="1.0" encoding="utf-8"?>
+<w:hdr xmlns:m="http://schemas.openxmlformats.org/officeDocument/2006/math" xmlns:mc="http://schemas.openxmlformats.org/markup-compatibility/2006" xmlns:mo="http://schemas.microsoft.com/office/mac/office/2008/main" xmlns:mv="urn:schemas-microsoft-com:mac:vml" xmlns:o="urn:schemas-microsoft-com:office:office" xmlns:r="http://schemas.openxmlformats.org/officeDocument/2006/relationships" xmlns:v="urn:schemas-microsoft-com:vml" xmlns:w10="urn:schemas-microsoft-com:office:word" xmlns:w14="http://schemas.microsoft.com/office/word/2010/wordml" xmlns:w="http://schemas.openxmlformats.org/wordprocessingml/2006/main" xmlns:wne="http://schemas.microsoft.com/office/word/2006/wordml" xmlns:wp14="http://schemas.microsoft.com/office/word/2010/wordprocessingDrawing" xmlns:wp="http://schemas.openxmlformats.org/drawingml/2006/wordprocessingDrawing" xmlns:wpc="http://schemas.microsoft.com/office/word/2010/wordprocessingCanvas" xmlns:wpg="http://schemas.microsoft.com/office/word/2010/wordprocessingGroup" xmlns:wpi="http://schemas.microsoft.com/office/word/2010/wordprocessingInk" xmlns:wps="http://schemas.microsoft.com/office/word/2010/wordprocessingShape" mc:Ignorable="w14 wp14">
+  <w:p>
+    <w:pPr>
+      <w:pStyle w:val="Header"/>
+    </w:pPr>
+  </w:p>
+</w:hdr>
+</file>
+
+<file path=word/header3.xml><?xml version="1.0" encoding="utf-8"?>
+<w:hdr xmlns:m="http://schemas.openxmlformats.org/officeDocument/2006/math" xmlns:mc="http://schemas.openxmlformats.org/markup-compatibility/2006" xmlns:mo="http://schemas.microsoft.com/office/mac/office/2008/main" xmlns:mv="urn:schemas-microsoft-com:mac:vml" xmlns:o="urn:schemas-microsoft-com:office:office" xmlns:r="http://schemas.openxmlformats.org/officeDocument/2006/relationships" xmlns:v="urn:schemas-microsoft-com:vml" xmlns:w10="urn:schemas-microsoft-com:office:word" xmlns:w14="http://schemas.microsoft.com/office/word/2010/wordml" xmlns:w="http://schemas.openxmlformats.org/wordprocessingml/2006/main" xmlns:wne="http://schemas.microsoft.com/office/word/2006/wordml" xmlns:wp14="http://schemas.microsoft.com/office/word/2010/wordprocessingDrawing" xmlns:wp="http://schemas.openxmlformats.org/drawingml/2006/wordprocessingDrawing" xmlns:wpc="http://schemas.microsoft.com/office/word/2010/wordprocessingCanvas" xmlns:wpg="http://schemas.microsoft.com/office/word/2010/wordprocessingGroup" xmlns:wpi="http://schemas.microsoft.com/office/word/2010/wordprocessingInk" xmlns:wps="http://schemas.microsoft.com/office/word/2010/wordprocessingShape" mc:Ignorable="w14 wp14">
+  <w:p>
+    <w:pPr>
+      <w:pStyle w:val="Header"/>
+    </w:pPr>
+  </w:p>
+</w:hdr>
 </file>
 
 <file path=word/numbering.xml><?xml version="1.0" encoding="utf-8"?>
@@ -4275,7 +4277,7 @@
       <w:spacing w:after="120"/>
     </w:pPr>
     <w:rPr>
-      <w:sz w:val="16"/>
+      <w:sz w:val="20"/>
       <w:szCs w:val="16"/>
     </w:rPr>
   </w:style>
@@ -4286,7 +4288,7 @@
     <w:uiPriority w:val="99"/>
     <w:rsid w:val="00AA1D8D"/>
     <w:rPr>
-      <w:sz w:val="16"/>
+      <w:sz w:val="20"/>
       <w:szCs w:val="16"/>
     </w:rPr>
   </w:style>
@@ -4600,7 +4602,7 @@
       <w:b/>
       <w:bCs/>
       <w:color w:val="4F81BD" w:themeColor="accent1"/>
-      <w:sz w:val="18"/>
+      <w:sz w:val="20"/>
       <w:szCs w:val="18"/>
     </w:rPr>
   </w:style>

</xml_diff>

<commit_message>
sync: mirror ib2026/dev into ib2027/dev
</commit_message>
<xml_diff>
--- a/hw/P1.docx
+++ b/hw/P1.docx
@@ -106,7 +106,7 @@
             <w:pPr>
               <w:spacing w:before="20" w:after="20" w:line="240" w:lineRule="auto"/>
               <w:pBdr>
-                <w:bottom w:val="single" w:sz="5" w:space="1" w:color="CBD5E1"/>
+                <w:bottom w:val="single" w:sz="10" w:space="1" w:color="0F172A"/>
               </w:pBdr>
             </w:pPr>
           </w:p>
@@ -139,7 +139,7 @@
             <w:pPr>
               <w:spacing w:before="20" w:after="20" w:line="240" w:lineRule="auto"/>
               <w:pBdr>
-                <w:bottom w:val="single" w:sz="5" w:space="1" w:color="CBD5E1"/>
+                <w:bottom w:val="single" w:sz="10" w:space="1" w:color="0F172A"/>
               </w:pBdr>
             </w:pPr>
           </w:p>
@@ -172,7 +172,7 @@
             <w:pPr>
               <w:spacing w:before="20" w:after="20" w:line="240" w:lineRule="auto"/>
               <w:pBdr>
-                <w:bottom w:val="single" w:sz="5" w:space="1" w:color="CBD5E1"/>
+                <w:bottom w:val="single" w:sz="10" w:space="1" w:color="0F172A"/>
               </w:pBdr>
             </w:pPr>
           </w:p>
@@ -206,10 +206,10 @@
               <w:right w:w="120" w:type="dxa"/>
             </w:tcMar>
             <w:tcBorders>
-              <w:top w:val="single" w:sz="5" w:color="BFDBFE"/>
-              <w:left w:val="single" w:sz="5" w:color="BFDBFE"/>
-              <w:bottom w:val="single" w:sz="5" w:color="BFDBFE"/>
-              <w:right w:val="single" w:sz="5" w:color="BFDBFE"/>
+              <w:top w:val="single" w:sz="8" w:color="0F172A" w:space="0"/>
+              <w:left w:val="single" w:sz="8" w:color="0F172A" w:space="0"/>
+              <w:bottom w:val="single" w:sz="8" w:color="0F172A" w:space="0"/>
+              <w:right w:val="single" w:sz="8" w:color="0F172A" w:space="0"/>
             </w:tcBorders>
           </w:tcPr>
           <w:p>
@@ -246,10 +246,10 @@
               <w:right w:w="120" w:type="dxa"/>
             </w:tcMar>
             <w:tcBorders>
-              <w:top w:val="single" w:sz="5" w:color="BFDBFE"/>
-              <w:left w:val="single" w:sz="5" w:color="BFDBFE"/>
-              <w:bottom w:val="single" w:sz="5" w:color="BFDBFE"/>
-              <w:right w:val="single" w:sz="5" w:color="BFDBFE"/>
+              <w:top w:val="single" w:sz="8" w:color="0F172A" w:space="0"/>
+              <w:left w:val="single" w:sz="8" w:color="0F172A" w:space="0"/>
+              <w:bottom w:val="single" w:sz="8" w:color="0F172A" w:space="0"/>
+              <w:right w:val="single" w:sz="8" w:color="0F172A" w:space="0"/>
             </w:tcBorders>
           </w:tcPr>
           <w:p>
@@ -286,10 +286,10 @@
               <w:right w:w="120" w:type="dxa"/>
             </w:tcMar>
             <w:tcBorders>
-              <w:top w:val="single" w:sz="5" w:color="BFDBFE"/>
-              <w:left w:val="single" w:sz="5" w:color="BFDBFE"/>
-              <w:bottom w:val="single" w:sz="5" w:color="BFDBFE"/>
-              <w:right w:val="single" w:sz="5" w:color="BFDBFE"/>
+              <w:top w:val="single" w:sz="8" w:color="0F172A" w:space="0"/>
+              <w:left w:val="single" w:sz="8" w:color="0F172A" w:space="0"/>
+              <w:bottom w:val="single" w:sz="8" w:color="0F172A" w:space="0"/>
+              <w:right w:val="single" w:sz="8" w:color="0F172A" w:space="0"/>
             </w:tcBorders>
           </w:tcPr>
           <w:p>
@@ -1301,6 +1301,12 @@
               <w:bottom w:w="35" w:type="dxa"/>
               <w:right w:w="90" w:type="dxa"/>
             </w:tcMar>
+            <w:tcBorders>
+              <w:top w:val="single" w:sz="8" w:space="0" w:color="0F172A"/>
+              <w:left w:val="single" w:sz="8" w:space="0" w:color="0F172A"/>
+              <w:bottom w:val="single" w:sz="8" w:space="0" w:color="0F172A"/>
+              <w:right w:val="single" w:sz="8" w:space="0" w:color="0F172A"/>
+            </w:tcBorders>
           </w:tcPr>
           <w:p>
             <w:pPr>
@@ -1326,6 +1332,12 @@
               <w:bottom w:w="35" w:type="dxa"/>
               <w:right w:w="90" w:type="dxa"/>
             </w:tcMar>
+            <w:tcBorders>
+              <w:top w:val="single" w:sz="8" w:space="0" w:color="0F172A"/>
+              <w:left w:val="single" w:sz="8" w:space="0" w:color="0F172A"/>
+              <w:bottom w:val="single" w:sz="8" w:space="0" w:color="0F172A"/>
+              <w:right w:val="single" w:sz="8" w:space="0" w:color="0F172A"/>
+            </w:tcBorders>
           </w:tcPr>
           <w:p>
             <w:pPr>
@@ -1356,7 +1368,10 @@
               <w:right w:w="90" w:type="dxa"/>
             </w:tcMar>
             <w:tcBorders>
-              <w:bottom w:val="single" w:sz="4" w:color="CBD5E1"/>
+              <w:bottom w:val="single" w:sz="8" w:color="334155" w:space="0"/>
+              <w:top w:val="single" w:sz="8" w:space="0" w:color="334155"/>
+              <w:left w:val="single" w:sz="8" w:space="0" w:color="334155"/>
+              <w:right w:val="single" w:sz="8" w:space="0" w:color="334155"/>
             </w:tcBorders>
           </w:tcPr>
           <w:p>
@@ -1382,7 +1397,10 @@
               <w:right w:w="90" w:type="dxa"/>
             </w:tcMar>
             <w:tcBorders>
-              <w:bottom w:val="single" w:sz="4" w:color="CBD5E1"/>
+              <w:bottom w:val="single" w:sz="14" w:color="0F172A" w:space="0"/>
+              <w:top w:val="single" w:sz="14" w:space="0" w:color="0F172A"/>
+              <w:left w:val="single" w:sz="14" w:space="0" w:color="0F172A"/>
+              <w:right w:val="single" w:sz="14" w:space="0" w:color="0F172A"/>
             </w:tcBorders>
           </w:tcPr>
           <w:p>
@@ -1390,7 +1408,7 @@
               <w:spacing w:before="20" w:after="20" w:line="240" w:lineRule="auto"/>
               <w:jc w:val="center"/>
               <w:pBdr>
-                <w:bottom w:val="single" w:sz="5" w:space="1" w:color="CBD5E1"/>
+                <w:bottom w:val="single" w:sz="10" w:space="1" w:color="0F172A"/>
               </w:pBdr>
             </w:pPr>
           </w:p>
@@ -1410,7 +1428,10 @@
               <w:right w:w="90" w:type="dxa"/>
             </w:tcMar>
             <w:tcBorders>
-              <w:bottom w:val="single" w:sz="4" w:color="CBD5E1"/>
+              <w:bottom w:val="single" w:sz="8" w:color="334155" w:space="0"/>
+              <w:top w:val="single" w:sz="8" w:space="0" w:color="334155"/>
+              <w:left w:val="single" w:sz="8" w:space="0" w:color="334155"/>
+              <w:right w:val="single" w:sz="8" w:space="0" w:color="334155"/>
             </w:tcBorders>
           </w:tcPr>
           <w:p>
@@ -1436,7 +1457,10 @@
               <w:right w:w="90" w:type="dxa"/>
             </w:tcMar>
             <w:tcBorders>
-              <w:bottom w:val="single" w:sz="4" w:color="CBD5E1"/>
+              <w:bottom w:val="single" w:sz="14" w:color="0F172A" w:space="0"/>
+              <w:top w:val="single" w:sz="14" w:space="0" w:color="0F172A"/>
+              <w:left w:val="single" w:sz="14" w:space="0" w:color="0F172A"/>
+              <w:right w:val="single" w:sz="14" w:space="0" w:color="0F172A"/>
             </w:tcBorders>
           </w:tcPr>
           <w:p>
@@ -1444,7 +1468,7 @@
               <w:spacing w:before="20" w:after="20" w:line="240" w:lineRule="auto"/>
               <w:jc w:val="center"/>
               <w:pBdr>
-                <w:bottom w:val="single" w:sz="5" w:space="1" w:color="CBD5E1"/>
+                <w:bottom w:val="single" w:sz="10" w:space="1" w:color="0F172A"/>
               </w:pBdr>
             </w:pPr>
           </w:p>
@@ -1464,7 +1488,10 @@
               <w:right w:w="90" w:type="dxa"/>
             </w:tcMar>
             <w:tcBorders>
-              <w:bottom w:val="single" w:sz="4" w:color="CBD5E1"/>
+              <w:bottom w:val="single" w:sz="8" w:color="334155" w:space="0"/>
+              <w:top w:val="single" w:sz="8" w:space="0" w:color="334155"/>
+              <w:left w:val="single" w:sz="8" w:space="0" w:color="334155"/>
+              <w:right w:val="single" w:sz="8" w:space="0" w:color="334155"/>
             </w:tcBorders>
           </w:tcPr>
           <w:p>
@@ -1490,7 +1517,10 @@
               <w:right w:w="90" w:type="dxa"/>
             </w:tcMar>
             <w:tcBorders>
-              <w:bottom w:val="single" w:sz="4" w:color="CBD5E1"/>
+              <w:bottom w:val="single" w:sz="14" w:color="0F172A" w:space="0"/>
+              <w:top w:val="single" w:sz="14" w:space="0" w:color="0F172A"/>
+              <w:left w:val="single" w:sz="14" w:space="0" w:color="0F172A"/>
+              <w:right w:val="single" w:sz="14" w:space="0" w:color="0F172A"/>
             </w:tcBorders>
           </w:tcPr>
           <w:p>
@@ -1498,7 +1528,7 @@
               <w:spacing w:before="20" w:after="20" w:line="240" w:lineRule="auto"/>
               <w:jc w:val="center"/>
               <w:pBdr>
-                <w:bottom w:val="single" w:sz="5" w:space="1" w:color="CBD5E1"/>
+                <w:bottom w:val="single" w:sz="10" w:space="1" w:color="0F172A"/>
               </w:pBdr>
             </w:pPr>
           </w:p>
@@ -1518,7 +1548,10 @@
               <w:right w:w="90" w:type="dxa"/>
             </w:tcMar>
             <w:tcBorders>
-              <w:bottom w:val="single" w:sz="4" w:color="CBD5E1"/>
+              <w:bottom w:val="single" w:sz="8" w:color="334155" w:space="0"/>
+              <w:top w:val="single" w:sz="8" w:space="0" w:color="334155"/>
+              <w:left w:val="single" w:sz="8" w:space="0" w:color="334155"/>
+              <w:right w:val="single" w:sz="8" w:space="0" w:color="334155"/>
             </w:tcBorders>
           </w:tcPr>
           <w:p>
@@ -1544,7 +1577,10 @@
               <w:right w:w="90" w:type="dxa"/>
             </w:tcMar>
             <w:tcBorders>
-              <w:bottom w:val="single" w:sz="4" w:color="CBD5E1"/>
+              <w:bottom w:val="single" w:sz="14" w:color="0F172A" w:space="0"/>
+              <w:top w:val="single" w:sz="14" w:space="0" w:color="0F172A"/>
+              <w:left w:val="single" w:sz="14" w:space="0" w:color="0F172A"/>
+              <w:right w:val="single" w:sz="14" w:space="0" w:color="0F172A"/>
             </w:tcBorders>
           </w:tcPr>
           <w:p>
@@ -1552,7 +1588,7 @@
               <w:spacing w:before="20" w:after="20" w:line="240" w:lineRule="auto"/>
               <w:jc w:val="center"/>
               <w:pBdr>
-                <w:bottom w:val="single" w:sz="5" w:space="1" w:color="CBD5E1"/>
+                <w:bottom w:val="single" w:sz="10" w:space="1" w:color="0F172A"/>
               </w:pBdr>
             </w:pPr>
           </w:p>
@@ -1572,7 +1608,10 @@
               <w:right w:w="90" w:type="dxa"/>
             </w:tcMar>
             <w:tcBorders>
-              <w:bottom w:val="single" w:sz="4" w:color="CBD5E1"/>
+              <w:bottom w:val="single" w:sz="8" w:color="334155" w:space="0"/>
+              <w:top w:val="single" w:sz="8" w:space="0" w:color="334155"/>
+              <w:left w:val="single" w:sz="8" w:space="0" w:color="334155"/>
+              <w:right w:val="single" w:sz="8" w:space="0" w:color="334155"/>
             </w:tcBorders>
           </w:tcPr>
           <w:p>
@@ -1598,7 +1637,10 @@
               <w:right w:w="90" w:type="dxa"/>
             </w:tcMar>
             <w:tcBorders>
-              <w:bottom w:val="single" w:sz="4" w:color="CBD5E1"/>
+              <w:bottom w:val="single" w:sz="14" w:color="0F172A" w:space="0"/>
+              <w:top w:val="single" w:sz="14" w:space="0" w:color="0F172A"/>
+              <w:left w:val="single" w:sz="14" w:space="0" w:color="0F172A"/>
+              <w:right w:val="single" w:sz="14" w:space="0" w:color="0F172A"/>
             </w:tcBorders>
           </w:tcPr>
           <w:p>
@@ -1606,7 +1648,7 @@
               <w:spacing w:before="20" w:after="20" w:line="240" w:lineRule="auto"/>
               <w:jc w:val="center"/>
               <w:pBdr>
-                <w:bottom w:val="single" w:sz="5" w:space="1" w:color="CBD5E1"/>
+                <w:bottom w:val="single" w:sz="10" w:space="1" w:color="0F172A"/>
               </w:pBdr>
             </w:pPr>
           </w:p>
@@ -1626,7 +1668,10 @@
               <w:right w:w="90" w:type="dxa"/>
             </w:tcMar>
             <w:tcBorders>
-              <w:bottom w:val="single" w:sz="4" w:color="CBD5E1"/>
+              <w:bottom w:val="single" w:sz="8" w:color="334155" w:space="0"/>
+              <w:top w:val="single" w:sz="8" w:space="0" w:color="334155"/>
+              <w:left w:val="single" w:sz="8" w:space="0" w:color="334155"/>
+              <w:right w:val="single" w:sz="8" w:space="0" w:color="334155"/>
             </w:tcBorders>
           </w:tcPr>
           <w:p>
@@ -1652,7 +1697,10 @@
               <w:right w:w="90" w:type="dxa"/>
             </w:tcMar>
             <w:tcBorders>
-              <w:bottom w:val="single" w:sz="4" w:color="CBD5E1"/>
+              <w:bottom w:val="single" w:sz="14" w:color="0F172A" w:space="0"/>
+              <w:top w:val="single" w:sz="14" w:space="0" w:color="0F172A"/>
+              <w:left w:val="single" w:sz="14" w:space="0" w:color="0F172A"/>
+              <w:right w:val="single" w:sz="14" w:space="0" w:color="0F172A"/>
             </w:tcBorders>
           </w:tcPr>
           <w:p>
@@ -1660,7 +1708,7 @@
               <w:spacing w:before="20" w:after="20" w:line="240" w:lineRule="auto"/>
               <w:jc w:val="center"/>
               <w:pBdr>
-                <w:bottom w:val="single" w:sz="5" w:space="1" w:color="CBD5E1"/>
+                <w:bottom w:val="single" w:sz="10" w:space="1" w:color="0F172A"/>
               </w:pBdr>
             </w:pPr>
           </w:p>
@@ -1715,7 +1763,7 @@
       <w:pPr>
         <w:spacing w:after="80" w:before="20" w:line="240" w:lineRule="auto"/>
         <w:pBdr>
-          <w:bottom w:val="single" w:sz="5" w:space="1" w:color="94A3B8"/>
+          <w:bottom w:val="single" w:sz="10" w:space="1" w:color="0F172A"/>
         </w:pBdr>
       </w:pPr>
     </w:p>
@@ -1734,7 +1782,7 @@
       <w:pPr>
         <w:spacing w:after="80" w:before="20" w:line="240" w:lineRule="auto"/>
         <w:pBdr>
-          <w:bottom w:val="single" w:sz="5" w:space="1" w:color="94A3B8"/>
+          <w:bottom w:val="single" w:sz="10" w:space="1" w:color="0F172A"/>
         </w:pBdr>
       </w:pPr>
     </w:p>
@@ -1754,7 +1802,7 @@
       <w:pPr>
         <w:spacing w:after="80" w:before="20" w:line="240" w:lineRule="auto"/>
         <w:pBdr>
-          <w:bottom w:val="single" w:sz="5" w:space="1" w:color="94A3B8"/>
+          <w:bottom w:val="single" w:sz="10" w:space="1" w:color="0F172A"/>
         </w:pBdr>
       </w:pPr>
     </w:p>
@@ -1828,7 +1876,10 @@
               <w:right w:w="90" w:type="dxa"/>
             </w:tcMar>
             <w:tcBorders>
-              <w:bottom w:val="single" w:sz="4" w:color="CBD5E1"/>
+              <w:bottom w:val="single" w:sz="8" w:color="334155" w:space="0"/>
+              <w:top w:val="single" w:sz="8" w:space="0" w:color="334155"/>
+              <w:left w:val="single" w:sz="8" w:space="0" w:color="334155"/>
+              <w:right w:val="single" w:sz="8" w:space="0" w:color="334155"/>
             </w:tcBorders>
           </w:tcPr>
           <w:p>
@@ -1853,14 +1904,17 @@
               <w:right w:w="90" w:type="dxa"/>
             </w:tcMar>
             <w:tcBorders>
-              <w:bottom w:val="single" w:sz="4" w:color="CBD5E1"/>
+              <w:bottom w:val="single" w:sz="14" w:color="0F172A" w:space="0"/>
+              <w:top w:val="single" w:sz="14" w:space="0" w:color="0F172A"/>
+              <w:left w:val="single" w:sz="14" w:space="0" w:color="0F172A"/>
+              <w:right w:val="single" w:sz="14" w:space="0" w:color="0F172A"/>
             </w:tcBorders>
           </w:tcPr>
           <w:p>
             <w:pPr>
               <w:spacing w:before="20" w:after="20" w:line="240" w:lineRule="auto"/>
               <w:pBdr>
-                <w:bottom w:val="single" w:sz="5" w:space="1" w:color="CBD5E1"/>
+                <w:bottom w:val="single" w:sz="10" w:space="1" w:color="0F172A"/>
               </w:pBdr>
             </w:pPr>
           </w:p>
@@ -1880,7 +1934,10 @@
               <w:right w:w="90" w:type="dxa"/>
             </w:tcMar>
             <w:tcBorders>
-              <w:bottom w:val="single" w:sz="4" w:color="CBD5E1"/>
+              <w:bottom w:val="single" w:sz="8" w:color="334155" w:space="0"/>
+              <w:top w:val="single" w:sz="8" w:space="0" w:color="334155"/>
+              <w:left w:val="single" w:sz="8" w:space="0" w:color="334155"/>
+              <w:right w:val="single" w:sz="8" w:space="0" w:color="334155"/>
             </w:tcBorders>
           </w:tcPr>
           <w:p>
@@ -1905,14 +1962,17 @@
               <w:right w:w="90" w:type="dxa"/>
             </w:tcMar>
             <w:tcBorders>
-              <w:bottom w:val="single" w:sz="4" w:color="CBD5E1"/>
+              <w:bottom w:val="single" w:sz="14" w:color="0F172A" w:space="0"/>
+              <w:top w:val="single" w:sz="14" w:space="0" w:color="0F172A"/>
+              <w:left w:val="single" w:sz="14" w:space="0" w:color="0F172A"/>
+              <w:right w:val="single" w:sz="14" w:space="0" w:color="0F172A"/>
             </w:tcBorders>
           </w:tcPr>
           <w:p>
             <w:pPr>
               <w:spacing w:before="20" w:after="20" w:line="240" w:lineRule="auto"/>
               <w:pBdr>
-                <w:bottom w:val="single" w:sz="5" w:space="1" w:color="CBD5E1"/>
+                <w:bottom w:val="single" w:sz="10" w:space="1" w:color="0F172A"/>
               </w:pBdr>
             </w:pPr>
           </w:p>
@@ -1932,7 +1992,10 @@
               <w:right w:w="90" w:type="dxa"/>
             </w:tcMar>
             <w:tcBorders>
-              <w:bottom w:val="single" w:sz="4" w:color="CBD5E1"/>
+              <w:bottom w:val="single" w:sz="8" w:color="334155" w:space="0"/>
+              <w:top w:val="single" w:sz="8" w:space="0" w:color="334155"/>
+              <w:left w:val="single" w:sz="8" w:space="0" w:color="334155"/>
+              <w:right w:val="single" w:sz="8" w:space="0" w:color="334155"/>
             </w:tcBorders>
           </w:tcPr>
           <w:p>
@@ -1957,14 +2020,17 @@
               <w:right w:w="90" w:type="dxa"/>
             </w:tcMar>
             <w:tcBorders>
-              <w:bottom w:val="single" w:sz="4" w:color="CBD5E1"/>
+              <w:bottom w:val="single" w:sz="14" w:color="0F172A" w:space="0"/>
+              <w:top w:val="single" w:sz="14" w:space="0" w:color="0F172A"/>
+              <w:left w:val="single" w:sz="14" w:space="0" w:color="0F172A"/>
+              <w:right w:val="single" w:sz="14" w:space="0" w:color="0F172A"/>
             </w:tcBorders>
           </w:tcPr>
           <w:p>
             <w:pPr>
               <w:spacing w:before="20" w:after="20" w:line="240" w:lineRule="auto"/>
               <w:pBdr>
-                <w:bottom w:val="single" w:sz="5" w:space="1" w:color="CBD5E1"/>
+                <w:bottom w:val="single" w:sz="10" w:space="1" w:color="0F172A"/>
               </w:pBdr>
             </w:pPr>
           </w:p>
@@ -1984,7 +2050,10 @@
               <w:right w:w="90" w:type="dxa"/>
             </w:tcMar>
             <w:tcBorders>
-              <w:bottom w:val="single" w:sz="4" w:color="CBD5E1"/>
+              <w:bottom w:val="single" w:sz="8" w:color="334155" w:space="0"/>
+              <w:top w:val="single" w:sz="8" w:space="0" w:color="334155"/>
+              <w:left w:val="single" w:sz="8" w:space="0" w:color="334155"/>
+              <w:right w:val="single" w:sz="8" w:space="0" w:color="334155"/>
             </w:tcBorders>
           </w:tcPr>
           <w:p>
@@ -2009,14 +2078,17 @@
               <w:right w:w="90" w:type="dxa"/>
             </w:tcMar>
             <w:tcBorders>
-              <w:bottom w:val="single" w:sz="4" w:color="CBD5E1"/>
+              <w:bottom w:val="single" w:sz="14" w:color="0F172A" w:space="0"/>
+              <w:top w:val="single" w:sz="14" w:space="0" w:color="0F172A"/>
+              <w:left w:val="single" w:sz="14" w:space="0" w:color="0F172A"/>
+              <w:right w:val="single" w:sz="14" w:space="0" w:color="0F172A"/>
             </w:tcBorders>
           </w:tcPr>
           <w:p>
             <w:pPr>
               <w:spacing w:before="20" w:after="20" w:line="240" w:lineRule="auto"/>
               <w:pBdr>
-                <w:bottom w:val="single" w:sz="5" w:space="1" w:color="CBD5E1"/>
+                <w:bottom w:val="single" w:sz="10" w:space="1" w:color="0F172A"/>
               </w:pBdr>
             </w:pPr>
           </w:p>
@@ -2036,7 +2108,10 @@
               <w:right w:w="90" w:type="dxa"/>
             </w:tcMar>
             <w:tcBorders>
-              <w:bottom w:val="single" w:sz="4" w:color="CBD5E1"/>
+              <w:bottom w:val="single" w:sz="8" w:color="334155" w:space="0"/>
+              <w:top w:val="single" w:sz="8" w:space="0" w:color="334155"/>
+              <w:left w:val="single" w:sz="8" w:space="0" w:color="334155"/>
+              <w:right w:val="single" w:sz="8" w:space="0" w:color="334155"/>
             </w:tcBorders>
           </w:tcPr>
           <w:p>
@@ -2061,14 +2136,17 @@
               <w:right w:w="90" w:type="dxa"/>
             </w:tcMar>
             <w:tcBorders>
-              <w:bottom w:val="single" w:sz="4" w:color="CBD5E1"/>
+              <w:bottom w:val="single" w:sz="14" w:color="0F172A" w:space="0"/>
+              <w:top w:val="single" w:sz="14" w:space="0" w:color="0F172A"/>
+              <w:left w:val="single" w:sz="14" w:space="0" w:color="0F172A"/>
+              <w:right w:val="single" w:sz="14" w:space="0" w:color="0F172A"/>
             </w:tcBorders>
           </w:tcPr>
           <w:p>
             <w:pPr>
               <w:spacing w:before="20" w:after="20" w:line="240" w:lineRule="auto"/>
               <w:pBdr>
-                <w:bottom w:val="single" w:sz="5" w:space="1" w:color="CBD5E1"/>
+                <w:bottom w:val="single" w:sz="10" w:space="1" w:color="0F172A"/>
               </w:pBdr>
             </w:pPr>
           </w:p>
@@ -2088,7 +2166,10 @@
               <w:right w:w="90" w:type="dxa"/>
             </w:tcMar>
             <w:tcBorders>
-              <w:bottom w:val="single" w:sz="4" w:color="CBD5E1"/>
+              <w:bottom w:val="single" w:sz="8" w:color="334155" w:space="0"/>
+              <w:top w:val="single" w:sz="8" w:space="0" w:color="334155"/>
+              <w:left w:val="single" w:sz="8" w:space="0" w:color="334155"/>
+              <w:right w:val="single" w:sz="8" w:space="0" w:color="334155"/>
             </w:tcBorders>
           </w:tcPr>
           <w:p>
@@ -2113,14 +2194,17 @@
               <w:right w:w="90" w:type="dxa"/>
             </w:tcMar>
             <w:tcBorders>
-              <w:bottom w:val="single" w:sz="4" w:color="CBD5E1"/>
+              <w:bottom w:val="single" w:sz="14" w:color="0F172A" w:space="0"/>
+              <w:top w:val="single" w:sz="14" w:space="0" w:color="0F172A"/>
+              <w:left w:val="single" w:sz="14" w:space="0" w:color="0F172A"/>
+              <w:right w:val="single" w:sz="14" w:space="0" w:color="0F172A"/>
             </w:tcBorders>
           </w:tcPr>
           <w:p>
             <w:pPr>
               <w:spacing w:before="20" w:after="20" w:line="240" w:lineRule="auto"/>
               <w:pBdr>
-                <w:bottom w:val="single" w:sz="5" w:space="1" w:color="CBD5E1"/>
+                <w:bottom w:val="single" w:sz="10" w:space="1" w:color="0F172A"/>
               </w:pBdr>
             </w:pPr>
           </w:p>
@@ -2245,7 +2329,7 @@
       <w:pPr>
         <w:spacing w:after="80" w:before="20" w:line="240" w:lineRule="auto"/>
         <w:pBdr>
-          <w:bottom w:val="single" w:sz="5" w:space="1" w:color="94A3B8"/>
+          <w:bottom w:val="single" w:sz="10" w:space="1" w:color="0F172A"/>
         </w:pBdr>
       </w:pPr>
     </w:p>
@@ -2261,7 +2345,7 @@
       <w:pPr>
         <w:spacing w:after="80" w:before="20" w:line="240" w:lineRule="auto"/>
         <w:pBdr>
-          <w:bottom w:val="single" w:sz="5" w:space="1" w:color="94A3B8"/>
+          <w:bottom w:val="single" w:sz="10" w:space="1" w:color="0F172A"/>
         </w:pBdr>
       </w:pPr>
     </w:p>
@@ -2323,6 +2407,12 @@
               <w:bottom w:w="90" w:type="dxa"/>
               <w:right w:w="100" w:type="dxa"/>
             </w:tcMar>
+            <w:tcBorders>
+              <w:top w:val="single" w:sz="8" w:space="0" w:color="0F172A"/>
+              <w:left w:val="single" w:sz="8" w:space="0" w:color="0F172A"/>
+              <w:bottom w:val="single" w:sz="8" w:space="0" w:color="0F172A"/>
+              <w:right w:val="single" w:sz="8" w:space="0" w:color="0F172A"/>
+            </w:tcBorders>
           </w:tcPr>
           <w:p>
             <w:pPr>
@@ -2348,6 +2438,12 @@
               <w:bottom w:w="90" w:type="dxa"/>
               <w:right w:w="100" w:type="dxa"/>
             </w:tcMar>
+            <w:tcBorders>
+              <w:top w:val="single" w:sz="8" w:space="0" w:color="0F172A"/>
+              <w:left w:val="single" w:sz="8" w:space="0" w:color="0F172A"/>
+              <w:bottom w:val="single" w:sz="8" w:space="0" w:color="0F172A"/>
+              <w:right w:val="single" w:sz="8" w:space="0" w:color="0F172A"/>
+            </w:tcBorders>
           </w:tcPr>
           <w:p>
             <w:pPr>
@@ -2378,6 +2474,12 @@
               <w:bottom w:w="120" w:type="dxa"/>
               <w:right w:w="140" w:type="dxa"/>
             </w:tcMar>
+            <w:tcBorders>
+              <w:top w:val="single" w:sz="8" w:space="0" w:color="0F172A"/>
+              <w:left w:val="single" w:sz="8" w:space="0" w:color="0F172A"/>
+              <w:bottom w:val="single" w:sz="8" w:space="0" w:color="0F172A"/>
+              <w:right w:val="single" w:sz="8" w:space="0" w:color="0F172A"/>
+            </w:tcBorders>
           </w:tcPr>
           <w:p>
             <w:pPr>
@@ -2408,6 +2510,12 @@
               <w:bottom w:w="120" w:type="dxa"/>
               <w:right w:w="140" w:type="dxa"/>
             </w:tcMar>
+            <w:tcBorders>
+              <w:top w:val="single" w:sz="8" w:space="0" w:color="0F172A"/>
+              <w:left w:val="single" w:sz="8" w:space="0" w:color="0F172A"/>
+              <w:bottom w:val="single" w:sz="8" w:space="0" w:color="0F172A"/>
+              <w:right w:val="single" w:sz="8" w:space="0" w:color="0F172A"/>
+            </w:tcBorders>
           </w:tcPr>
           <w:p>
             <w:pPr>
@@ -2454,7 +2562,7 @@
       <w:pPr>
         <w:spacing w:after="80" w:before="20" w:line="240" w:lineRule="auto"/>
         <w:pBdr>
-          <w:bottom w:val="single" w:sz="5" w:space="1" w:color="94A3B8"/>
+          <w:bottom w:val="single" w:sz="10" w:space="1" w:color="0F172A"/>
         </w:pBdr>
       </w:pPr>
     </w:p>
@@ -2462,7 +2570,7 @@
       <w:pPr>
         <w:spacing w:after="80" w:before="20" w:line="240" w:lineRule="auto"/>
         <w:pBdr>
-          <w:bottom w:val="single" w:sz="5" w:space="1" w:color="94A3B8"/>
+          <w:bottom w:val="single" w:sz="10" w:space="1" w:color="0F172A"/>
         </w:pBdr>
       </w:pPr>
     </w:p>
@@ -2546,7 +2654,10 @@
               <w:right w:w="60" w:type="dxa"/>
             </w:tcMar>
             <w:tcBorders>
-              <w:bottom w:val="single" w:sz="3" w:color="E2E8F0"/>
+              <w:bottom w:val="single" w:sz="8" w:color="334155" w:space="0"/>
+              <w:top w:val="single" w:sz="8" w:space="0" w:color="334155"/>
+              <w:left w:val="single" w:sz="8" w:space="0" w:color="334155"/>
+              <w:right w:val="single" w:sz="8" w:space="0" w:color="334155"/>
             </w:tcBorders>
           </w:tcPr>
           <w:p>
@@ -2569,7 +2680,10 @@
               <w:right w:w="60" w:type="dxa"/>
             </w:tcMar>
             <w:tcBorders>
-              <w:bottom w:val="single" w:sz="3" w:color="E2E8F0"/>
+              <w:bottom w:val="single" w:sz="8" w:color="334155" w:space="0"/>
+              <w:top w:val="single" w:sz="8" w:space="0" w:color="334155"/>
+              <w:left w:val="single" w:sz="8" w:space="0" w:color="334155"/>
+              <w:right w:val="single" w:sz="8" w:space="0" w:color="334155"/>
             </w:tcBorders>
           </w:tcPr>
           <w:p>
@@ -2597,7 +2711,10 @@
               <w:right w:w="60" w:type="dxa"/>
             </w:tcMar>
             <w:tcBorders>
-              <w:bottom w:val="single" w:sz="3" w:color="E2E8F0"/>
+              <w:bottom w:val="single" w:sz="8" w:color="334155" w:space="0"/>
+              <w:top w:val="single" w:sz="8" w:space="0" w:color="334155"/>
+              <w:left w:val="single" w:sz="8" w:space="0" w:color="334155"/>
+              <w:right w:val="single" w:sz="8" w:space="0" w:color="334155"/>
             </w:tcBorders>
           </w:tcPr>
           <w:p>
@@ -2620,7 +2737,10 @@
               <w:right w:w="60" w:type="dxa"/>
             </w:tcMar>
             <w:tcBorders>
-              <w:bottom w:val="single" w:sz="3" w:color="E2E8F0"/>
+              <w:bottom w:val="single" w:sz="8" w:color="334155" w:space="0"/>
+              <w:top w:val="single" w:sz="8" w:space="0" w:color="334155"/>
+              <w:left w:val="single" w:sz="8" w:space="0" w:color="334155"/>
+              <w:right w:val="single" w:sz="8" w:space="0" w:color="334155"/>
             </w:tcBorders>
           </w:tcPr>
           <w:p>
@@ -2648,7 +2768,10 @@
               <w:right w:w="60" w:type="dxa"/>
             </w:tcMar>
             <w:tcBorders>
-              <w:bottom w:val="single" w:sz="3" w:color="E2E8F0"/>
+              <w:bottom w:val="single" w:sz="8" w:color="334155" w:space="0"/>
+              <w:top w:val="single" w:sz="8" w:space="0" w:color="334155"/>
+              <w:left w:val="single" w:sz="8" w:space="0" w:color="334155"/>
+              <w:right w:val="single" w:sz="8" w:space="0" w:color="334155"/>
             </w:tcBorders>
           </w:tcPr>
           <w:p>
@@ -2671,7 +2794,10 @@
               <w:right w:w="60" w:type="dxa"/>
             </w:tcMar>
             <w:tcBorders>
-              <w:bottom w:val="single" w:sz="3" w:color="E2E8F0"/>
+              <w:bottom w:val="single" w:sz="8" w:color="334155" w:space="0"/>
+              <w:top w:val="single" w:sz="8" w:space="0" w:color="334155"/>
+              <w:left w:val="single" w:sz="8" w:space="0" w:color="334155"/>
+              <w:right w:val="single" w:sz="8" w:space="0" w:color="334155"/>
             </w:tcBorders>
           </w:tcPr>
           <w:p>
@@ -2733,7 +2859,10 @@
               <w:right w:w="60" w:type="dxa"/>
             </w:tcMar>
             <w:tcBorders>
-              <w:bottom w:val="single" w:sz="3" w:color="E2E8F0"/>
+              <w:bottom w:val="single" w:sz="8" w:color="334155" w:space="0"/>
+              <w:top w:val="single" w:sz="8" w:space="0" w:color="334155"/>
+              <w:left w:val="single" w:sz="8" w:space="0" w:color="334155"/>
+              <w:right w:val="single" w:sz="8" w:space="0" w:color="334155"/>
             </w:tcBorders>
           </w:tcPr>
           <w:p>
@@ -2756,7 +2885,10 @@
               <w:right w:w="60" w:type="dxa"/>
             </w:tcMar>
             <w:tcBorders>
-              <w:bottom w:val="single" w:sz="3" w:color="E2E8F0"/>
+              <w:bottom w:val="single" w:sz="8" w:color="334155" w:space="0"/>
+              <w:top w:val="single" w:sz="8" w:space="0" w:color="334155"/>
+              <w:left w:val="single" w:sz="8" w:space="0" w:color="334155"/>
+              <w:right w:val="single" w:sz="8" w:space="0" w:color="334155"/>
             </w:tcBorders>
           </w:tcPr>
           <w:p>
@@ -2784,7 +2916,10 @@
               <w:right w:w="60" w:type="dxa"/>
             </w:tcMar>
             <w:tcBorders>
-              <w:bottom w:val="single" w:sz="3" w:color="E2E8F0"/>
+              <w:bottom w:val="single" w:sz="8" w:color="334155" w:space="0"/>
+              <w:top w:val="single" w:sz="8" w:space="0" w:color="334155"/>
+              <w:left w:val="single" w:sz="8" w:space="0" w:color="334155"/>
+              <w:right w:val="single" w:sz="8" w:space="0" w:color="334155"/>
             </w:tcBorders>
           </w:tcPr>
           <w:p>
@@ -2807,7 +2942,10 @@
               <w:right w:w="60" w:type="dxa"/>
             </w:tcMar>
             <w:tcBorders>
-              <w:bottom w:val="single" w:sz="3" w:color="E2E8F0"/>
+              <w:bottom w:val="single" w:sz="8" w:color="334155" w:space="0"/>
+              <w:top w:val="single" w:sz="8" w:space="0" w:color="334155"/>
+              <w:left w:val="single" w:sz="8" w:space="0" w:color="334155"/>
+              <w:right w:val="single" w:sz="8" w:space="0" w:color="334155"/>
             </w:tcBorders>
           </w:tcPr>
           <w:p>
@@ -2835,7 +2973,10 @@
               <w:right w:w="60" w:type="dxa"/>
             </w:tcMar>
             <w:tcBorders>
-              <w:bottom w:val="single" w:sz="3" w:color="E2E8F0"/>
+              <w:bottom w:val="single" w:sz="8" w:color="334155" w:space="0"/>
+              <w:top w:val="single" w:sz="8" w:space="0" w:color="334155"/>
+              <w:left w:val="single" w:sz="8" w:space="0" w:color="334155"/>
+              <w:right w:val="single" w:sz="8" w:space="0" w:color="334155"/>
             </w:tcBorders>
           </w:tcPr>
           <w:p>
@@ -2858,7 +2999,10 @@
               <w:right w:w="60" w:type="dxa"/>
             </w:tcMar>
             <w:tcBorders>
-              <w:bottom w:val="single" w:sz="3" w:color="E2E8F0"/>
+              <w:bottom w:val="single" w:sz="8" w:color="334155" w:space="0"/>
+              <w:top w:val="single" w:sz="8" w:space="0" w:color="334155"/>
+              <w:left w:val="single" w:sz="8" w:space="0" w:color="334155"/>
+              <w:right w:val="single" w:sz="8" w:space="0" w:color="334155"/>
             </w:tcBorders>
           </w:tcPr>
           <w:p>
@@ -2920,7 +3064,10 @@
               <w:right w:w="60" w:type="dxa"/>
             </w:tcMar>
             <w:tcBorders>
-              <w:bottom w:val="single" w:sz="3" w:color="E2E8F0"/>
+              <w:bottom w:val="single" w:sz="8" w:color="334155" w:space="0"/>
+              <w:top w:val="single" w:sz="8" w:space="0" w:color="334155"/>
+              <w:left w:val="single" w:sz="8" w:space="0" w:color="334155"/>
+              <w:right w:val="single" w:sz="8" w:space="0" w:color="334155"/>
             </w:tcBorders>
           </w:tcPr>
           <w:p>
@@ -2943,7 +3090,10 @@
               <w:right w:w="60" w:type="dxa"/>
             </w:tcMar>
             <w:tcBorders>
-              <w:bottom w:val="single" w:sz="3" w:color="E2E8F0"/>
+              <w:bottom w:val="single" w:sz="8" w:color="334155" w:space="0"/>
+              <w:top w:val="single" w:sz="8" w:space="0" w:color="334155"/>
+              <w:left w:val="single" w:sz="8" w:space="0" w:color="334155"/>
+              <w:right w:val="single" w:sz="8" w:space="0" w:color="334155"/>
             </w:tcBorders>
           </w:tcPr>
           <w:p>
@@ -2971,7 +3121,10 @@
               <w:right w:w="60" w:type="dxa"/>
             </w:tcMar>
             <w:tcBorders>
-              <w:bottom w:val="single" w:sz="3" w:color="E2E8F0"/>
+              <w:bottom w:val="single" w:sz="8" w:color="334155" w:space="0"/>
+              <w:top w:val="single" w:sz="8" w:space="0" w:color="334155"/>
+              <w:left w:val="single" w:sz="8" w:space="0" w:color="334155"/>
+              <w:right w:val="single" w:sz="8" w:space="0" w:color="334155"/>
             </w:tcBorders>
           </w:tcPr>
           <w:p>
@@ -2994,7 +3147,10 @@
               <w:right w:w="60" w:type="dxa"/>
             </w:tcMar>
             <w:tcBorders>
-              <w:bottom w:val="single" w:sz="3" w:color="E2E8F0"/>
+              <w:bottom w:val="single" w:sz="8" w:color="334155" w:space="0"/>
+              <w:top w:val="single" w:sz="8" w:space="0" w:color="334155"/>
+              <w:left w:val="single" w:sz="8" w:space="0" w:color="334155"/>
+              <w:right w:val="single" w:sz="8" w:space="0" w:color="334155"/>
             </w:tcBorders>
           </w:tcPr>
           <w:p>
@@ -3022,7 +3178,10 @@
               <w:right w:w="60" w:type="dxa"/>
             </w:tcMar>
             <w:tcBorders>
-              <w:bottom w:val="single" w:sz="3" w:color="E2E8F0"/>
+              <w:bottom w:val="single" w:sz="8" w:color="334155" w:space="0"/>
+              <w:top w:val="single" w:sz="8" w:space="0" w:color="334155"/>
+              <w:left w:val="single" w:sz="8" w:space="0" w:color="334155"/>
+              <w:right w:val="single" w:sz="8" w:space="0" w:color="334155"/>
             </w:tcBorders>
           </w:tcPr>
           <w:p>
@@ -3045,7 +3204,10 @@
               <w:right w:w="60" w:type="dxa"/>
             </w:tcMar>
             <w:tcBorders>
-              <w:bottom w:val="single" w:sz="3" w:color="E2E8F0"/>
+              <w:bottom w:val="single" w:sz="8" w:color="334155" w:space="0"/>
+              <w:top w:val="single" w:sz="8" w:space="0" w:color="334155"/>
+              <w:left w:val="single" w:sz="8" w:space="0" w:color="334155"/>
+              <w:right w:val="single" w:sz="8" w:space="0" w:color="334155"/>
             </w:tcBorders>
           </w:tcPr>
           <w:p>
@@ -3125,7 +3287,7 @@
       <w:pPr>
         <w:spacing w:after="80" w:before="20" w:line="240" w:lineRule="auto"/>
         <w:pBdr>
-          <w:bottom w:val="single" w:sz="5" w:space="1" w:color="94A3B8"/>
+          <w:bottom w:val="single" w:sz="10" w:space="1" w:color="0F172A"/>
         </w:pBdr>
       </w:pPr>
     </w:p>
@@ -3133,7 +3295,7 @@
       <w:pPr>
         <w:spacing w:after="80" w:before="20" w:line="240" w:lineRule="auto"/>
         <w:pBdr>
-          <w:bottom w:val="single" w:sz="5" w:space="1" w:color="94A3B8"/>
+          <w:bottom w:val="single" w:sz="10" w:space="1" w:color="0F172A"/>
         </w:pBdr>
       </w:pPr>
     </w:p>
@@ -3149,7 +3311,7 @@
       <w:pPr>
         <w:spacing w:after="80" w:before="20" w:line="240" w:lineRule="auto"/>
         <w:pBdr>
-          <w:bottom w:val="single" w:sz="5" w:space="1" w:color="94A3B8"/>
+          <w:bottom w:val="single" w:sz="10" w:space="1" w:color="0F172A"/>
         </w:pBdr>
       </w:pPr>
     </w:p>
@@ -3260,7 +3422,7 @@
       <w:pPr>
         <w:spacing w:before="20" w:after="80" w:line="240" w:lineRule="auto"/>
         <w:pBdr>
-          <w:bottom w:val="single" w:sz="5" w:space="1" w:color="94A3B8"/>
+          <w:bottom w:val="single" w:sz="10" w:space="1" w:color="0F172A"/>
         </w:pBdr>
       </w:pPr>
     </w:p>
@@ -3310,7 +3472,7 @@
       <w:pPr>
         <w:spacing w:before="20" w:after="80" w:line="240" w:lineRule="auto"/>
         <w:pBdr>
-          <w:bottom w:val="single" w:sz="5" w:space="1" w:color="94A3B8"/>
+          <w:bottom w:val="single" w:sz="10" w:space="1" w:color="0F172A"/>
         </w:pBdr>
       </w:pPr>
     </w:p>

</xml_diff>

<commit_message>
sync: mirror ib2026/render into ib2027/render
</commit_message>
<xml_diff>
--- a/hw/P1.docx
+++ b/hw/P1.docx
@@ -106,7 +106,7 @@
             <w:pPr>
               <w:spacing w:before="20" w:after="20" w:line="240" w:lineRule="auto"/>
               <w:pBdr>
-                <w:bottom w:val="single" w:sz="5" w:space="1" w:color="CBD5E1"/>
+                <w:bottom w:val="single" w:sz="10" w:space="1" w:color="0F172A"/>
               </w:pBdr>
             </w:pPr>
           </w:p>
@@ -139,7 +139,7 @@
             <w:pPr>
               <w:spacing w:before="20" w:after="20" w:line="240" w:lineRule="auto"/>
               <w:pBdr>
-                <w:bottom w:val="single" w:sz="5" w:space="1" w:color="CBD5E1"/>
+                <w:bottom w:val="single" w:sz="10" w:space="1" w:color="0F172A"/>
               </w:pBdr>
             </w:pPr>
           </w:p>
@@ -172,7 +172,7 @@
             <w:pPr>
               <w:spacing w:before="20" w:after="20" w:line="240" w:lineRule="auto"/>
               <w:pBdr>
-                <w:bottom w:val="single" w:sz="5" w:space="1" w:color="CBD5E1"/>
+                <w:bottom w:val="single" w:sz="10" w:space="1" w:color="0F172A"/>
               </w:pBdr>
             </w:pPr>
           </w:p>
@@ -206,10 +206,10 @@
               <w:right w:w="120" w:type="dxa"/>
             </w:tcMar>
             <w:tcBorders>
-              <w:top w:val="single" w:sz="5" w:color="BFDBFE"/>
-              <w:left w:val="single" w:sz="5" w:color="BFDBFE"/>
-              <w:bottom w:val="single" w:sz="5" w:color="BFDBFE"/>
-              <w:right w:val="single" w:sz="5" w:color="BFDBFE"/>
+              <w:top w:val="single" w:sz="8" w:color="0F172A" w:space="0"/>
+              <w:left w:val="single" w:sz="8" w:color="0F172A" w:space="0"/>
+              <w:bottom w:val="single" w:sz="8" w:color="0F172A" w:space="0"/>
+              <w:right w:val="single" w:sz="8" w:color="0F172A" w:space="0"/>
             </w:tcBorders>
           </w:tcPr>
           <w:p>
@@ -246,10 +246,10 @@
               <w:right w:w="120" w:type="dxa"/>
             </w:tcMar>
             <w:tcBorders>
-              <w:top w:val="single" w:sz="5" w:color="BFDBFE"/>
-              <w:left w:val="single" w:sz="5" w:color="BFDBFE"/>
-              <w:bottom w:val="single" w:sz="5" w:color="BFDBFE"/>
-              <w:right w:val="single" w:sz="5" w:color="BFDBFE"/>
+              <w:top w:val="single" w:sz="8" w:color="0F172A" w:space="0"/>
+              <w:left w:val="single" w:sz="8" w:color="0F172A" w:space="0"/>
+              <w:bottom w:val="single" w:sz="8" w:color="0F172A" w:space="0"/>
+              <w:right w:val="single" w:sz="8" w:color="0F172A" w:space="0"/>
             </w:tcBorders>
           </w:tcPr>
           <w:p>
@@ -286,10 +286,10 @@
               <w:right w:w="120" w:type="dxa"/>
             </w:tcMar>
             <w:tcBorders>
-              <w:top w:val="single" w:sz="5" w:color="BFDBFE"/>
-              <w:left w:val="single" w:sz="5" w:color="BFDBFE"/>
-              <w:bottom w:val="single" w:sz="5" w:color="BFDBFE"/>
-              <w:right w:val="single" w:sz="5" w:color="BFDBFE"/>
+              <w:top w:val="single" w:sz="8" w:color="0F172A" w:space="0"/>
+              <w:left w:val="single" w:sz="8" w:color="0F172A" w:space="0"/>
+              <w:bottom w:val="single" w:sz="8" w:color="0F172A" w:space="0"/>
+              <w:right w:val="single" w:sz="8" w:color="0F172A" w:space="0"/>
             </w:tcBorders>
           </w:tcPr>
           <w:p>
@@ -1301,6 +1301,12 @@
               <w:bottom w:w="35" w:type="dxa"/>
               <w:right w:w="90" w:type="dxa"/>
             </w:tcMar>
+            <w:tcBorders>
+              <w:top w:val="single" w:sz="8" w:space="0" w:color="0F172A"/>
+              <w:left w:val="single" w:sz="8" w:space="0" w:color="0F172A"/>
+              <w:bottom w:val="single" w:sz="8" w:space="0" w:color="0F172A"/>
+              <w:right w:val="single" w:sz="8" w:space="0" w:color="0F172A"/>
+            </w:tcBorders>
           </w:tcPr>
           <w:p>
             <w:pPr>
@@ -1326,6 +1332,12 @@
               <w:bottom w:w="35" w:type="dxa"/>
               <w:right w:w="90" w:type="dxa"/>
             </w:tcMar>
+            <w:tcBorders>
+              <w:top w:val="single" w:sz="8" w:space="0" w:color="0F172A"/>
+              <w:left w:val="single" w:sz="8" w:space="0" w:color="0F172A"/>
+              <w:bottom w:val="single" w:sz="8" w:space="0" w:color="0F172A"/>
+              <w:right w:val="single" w:sz="8" w:space="0" w:color="0F172A"/>
+            </w:tcBorders>
           </w:tcPr>
           <w:p>
             <w:pPr>
@@ -1356,7 +1368,10 @@
               <w:right w:w="90" w:type="dxa"/>
             </w:tcMar>
             <w:tcBorders>
-              <w:bottom w:val="single" w:sz="4" w:color="CBD5E1"/>
+              <w:bottom w:val="single" w:sz="8" w:color="334155" w:space="0"/>
+              <w:top w:val="single" w:sz="8" w:space="0" w:color="334155"/>
+              <w:left w:val="single" w:sz="8" w:space="0" w:color="334155"/>
+              <w:right w:val="single" w:sz="8" w:space="0" w:color="334155"/>
             </w:tcBorders>
           </w:tcPr>
           <w:p>
@@ -1382,7 +1397,10 @@
               <w:right w:w="90" w:type="dxa"/>
             </w:tcMar>
             <w:tcBorders>
-              <w:bottom w:val="single" w:sz="4" w:color="CBD5E1"/>
+              <w:bottom w:val="single" w:sz="14" w:color="0F172A" w:space="0"/>
+              <w:top w:val="single" w:sz="14" w:space="0" w:color="0F172A"/>
+              <w:left w:val="single" w:sz="14" w:space="0" w:color="0F172A"/>
+              <w:right w:val="single" w:sz="14" w:space="0" w:color="0F172A"/>
             </w:tcBorders>
           </w:tcPr>
           <w:p>
@@ -1390,7 +1408,7 @@
               <w:spacing w:before="20" w:after="20" w:line="240" w:lineRule="auto"/>
               <w:jc w:val="center"/>
               <w:pBdr>
-                <w:bottom w:val="single" w:sz="5" w:space="1" w:color="CBD5E1"/>
+                <w:bottom w:val="single" w:sz="10" w:space="1" w:color="0F172A"/>
               </w:pBdr>
             </w:pPr>
           </w:p>
@@ -1410,7 +1428,10 @@
               <w:right w:w="90" w:type="dxa"/>
             </w:tcMar>
             <w:tcBorders>
-              <w:bottom w:val="single" w:sz="4" w:color="CBD5E1"/>
+              <w:bottom w:val="single" w:sz="8" w:color="334155" w:space="0"/>
+              <w:top w:val="single" w:sz="8" w:space="0" w:color="334155"/>
+              <w:left w:val="single" w:sz="8" w:space="0" w:color="334155"/>
+              <w:right w:val="single" w:sz="8" w:space="0" w:color="334155"/>
             </w:tcBorders>
           </w:tcPr>
           <w:p>
@@ -1436,7 +1457,10 @@
               <w:right w:w="90" w:type="dxa"/>
             </w:tcMar>
             <w:tcBorders>
-              <w:bottom w:val="single" w:sz="4" w:color="CBD5E1"/>
+              <w:bottom w:val="single" w:sz="14" w:color="0F172A" w:space="0"/>
+              <w:top w:val="single" w:sz="14" w:space="0" w:color="0F172A"/>
+              <w:left w:val="single" w:sz="14" w:space="0" w:color="0F172A"/>
+              <w:right w:val="single" w:sz="14" w:space="0" w:color="0F172A"/>
             </w:tcBorders>
           </w:tcPr>
           <w:p>
@@ -1444,7 +1468,7 @@
               <w:spacing w:before="20" w:after="20" w:line="240" w:lineRule="auto"/>
               <w:jc w:val="center"/>
               <w:pBdr>
-                <w:bottom w:val="single" w:sz="5" w:space="1" w:color="CBD5E1"/>
+                <w:bottom w:val="single" w:sz="10" w:space="1" w:color="0F172A"/>
               </w:pBdr>
             </w:pPr>
           </w:p>
@@ -1464,7 +1488,10 @@
               <w:right w:w="90" w:type="dxa"/>
             </w:tcMar>
             <w:tcBorders>
-              <w:bottom w:val="single" w:sz="4" w:color="CBD5E1"/>
+              <w:bottom w:val="single" w:sz="8" w:color="334155" w:space="0"/>
+              <w:top w:val="single" w:sz="8" w:space="0" w:color="334155"/>
+              <w:left w:val="single" w:sz="8" w:space="0" w:color="334155"/>
+              <w:right w:val="single" w:sz="8" w:space="0" w:color="334155"/>
             </w:tcBorders>
           </w:tcPr>
           <w:p>
@@ -1490,7 +1517,10 @@
               <w:right w:w="90" w:type="dxa"/>
             </w:tcMar>
             <w:tcBorders>
-              <w:bottom w:val="single" w:sz="4" w:color="CBD5E1"/>
+              <w:bottom w:val="single" w:sz="14" w:color="0F172A" w:space="0"/>
+              <w:top w:val="single" w:sz="14" w:space="0" w:color="0F172A"/>
+              <w:left w:val="single" w:sz="14" w:space="0" w:color="0F172A"/>
+              <w:right w:val="single" w:sz="14" w:space="0" w:color="0F172A"/>
             </w:tcBorders>
           </w:tcPr>
           <w:p>
@@ -1498,7 +1528,7 @@
               <w:spacing w:before="20" w:after="20" w:line="240" w:lineRule="auto"/>
               <w:jc w:val="center"/>
               <w:pBdr>
-                <w:bottom w:val="single" w:sz="5" w:space="1" w:color="CBD5E1"/>
+                <w:bottom w:val="single" w:sz="10" w:space="1" w:color="0F172A"/>
               </w:pBdr>
             </w:pPr>
           </w:p>
@@ -1518,7 +1548,10 @@
               <w:right w:w="90" w:type="dxa"/>
             </w:tcMar>
             <w:tcBorders>
-              <w:bottom w:val="single" w:sz="4" w:color="CBD5E1"/>
+              <w:bottom w:val="single" w:sz="8" w:color="334155" w:space="0"/>
+              <w:top w:val="single" w:sz="8" w:space="0" w:color="334155"/>
+              <w:left w:val="single" w:sz="8" w:space="0" w:color="334155"/>
+              <w:right w:val="single" w:sz="8" w:space="0" w:color="334155"/>
             </w:tcBorders>
           </w:tcPr>
           <w:p>
@@ -1544,7 +1577,10 @@
               <w:right w:w="90" w:type="dxa"/>
             </w:tcMar>
             <w:tcBorders>
-              <w:bottom w:val="single" w:sz="4" w:color="CBD5E1"/>
+              <w:bottom w:val="single" w:sz="14" w:color="0F172A" w:space="0"/>
+              <w:top w:val="single" w:sz="14" w:space="0" w:color="0F172A"/>
+              <w:left w:val="single" w:sz="14" w:space="0" w:color="0F172A"/>
+              <w:right w:val="single" w:sz="14" w:space="0" w:color="0F172A"/>
             </w:tcBorders>
           </w:tcPr>
           <w:p>
@@ -1552,7 +1588,7 @@
               <w:spacing w:before="20" w:after="20" w:line="240" w:lineRule="auto"/>
               <w:jc w:val="center"/>
               <w:pBdr>
-                <w:bottom w:val="single" w:sz="5" w:space="1" w:color="CBD5E1"/>
+                <w:bottom w:val="single" w:sz="10" w:space="1" w:color="0F172A"/>
               </w:pBdr>
             </w:pPr>
           </w:p>
@@ -1572,7 +1608,10 @@
               <w:right w:w="90" w:type="dxa"/>
             </w:tcMar>
             <w:tcBorders>
-              <w:bottom w:val="single" w:sz="4" w:color="CBD5E1"/>
+              <w:bottom w:val="single" w:sz="8" w:color="334155" w:space="0"/>
+              <w:top w:val="single" w:sz="8" w:space="0" w:color="334155"/>
+              <w:left w:val="single" w:sz="8" w:space="0" w:color="334155"/>
+              <w:right w:val="single" w:sz="8" w:space="0" w:color="334155"/>
             </w:tcBorders>
           </w:tcPr>
           <w:p>
@@ -1598,7 +1637,10 @@
               <w:right w:w="90" w:type="dxa"/>
             </w:tcMar>
             <w:tcBorders>
-              <w:bottom w:val="single" w:sz="4" w:color="CBD5E1"/>
+              <w:bottom w:val="single" w:sz="14" w:color="0F172A" w:space="0"/>
+              <w:top w:val="single" w:sz="14" w:space="0" w:color="0F172A"/>
+              <w:left w:val="single" w:sz="14" w:space="0" w:color="0F172A"/>
+              <w:right w:val="single" w:sz="14" w:space="0" w:color="0F172A"/>
             </w:tcBorders>
           </w:tcPr>
           <w:p>
@@ -1606,7 +1648,7 @@
               <w:spacing w:before="20" w:after="20" w:line="240" w:lineRule="auto"/>
               <w:jc w:val="center"/>
               <w:pBdr>
-                <w:bottom w:val="single" w:sz="5" w:space="1" w:color="CBD5E1"/>
+                <w:bottom w:val="single" w:sz="10" w:space="1" w:color="0F172A"/>
               </w:pBdr>
             </w:pPr>
           </w:p>
@@ -1626,7 +1668,10 @@
               <w:right w:w="90" w:type="dxa"/>
             </w:tcMar>
             <w:tcBorders>
-              <w:bottom w:val="single" w:sz="4" w:color="CBD5E1"/>
+              <w:bottom w:val="single" w:sz="8" w:color="334155" w:space="0"/>
+              <w:top w:val="single" w:sz="8" w:space="0" w:color="334155"/>
+              <w:left w:val="single" w:sz="8" w:space="0" w:color="334155"/>
+              <w:right w:val="single" w:sz="8" w:space="0" w:color="334155"/>
             </w:tcBorders>
           </w:tcPr>
           <w:p>
@@ -1652,7 +1697,10 @@
               <w:right w:w="90" w:type="dxa"/>
             </w:tcMar>
             <w:tcBorders>
-              <w:bottom w:val="single" w:sz="4" w:color="CBD5E1"/>
+              <w:bottom w:val="single" w:sz="14" w:color="0F172A" w:space="0"/>
+              <w:top w:val="single" w:sz="14" w:space="0" w:color="0F172A"/>
+              <w:left w:val="single" w:sz="14" w:space="0" w:color="0F172A"/>
+              <w:right w:val="single" w:sz="14" w:space="0" w:color="0F172A"/>
             </w:tcBorders>
           </w:tcPr>
           <w:p>
@@ -1660,7 +1708,7 @@
               <w:spacing w:before="20" w:after="20" w:line="240" w:lineRule="auto"/>
               <w:jc w:val="center"/>
               <w:pBdr>
-                <w:bottom w:val="single" w:sz="5" w:space="1" w:color="CBD5E1"/>
+                <w:bottom w:val="single" w:sz="10" w:space="1" w:color="0F172A"/>
               </w:pBdr>
             </w:pPr>
           </w:p>
@@ -1715,7 +1763,7 @@
       <w:pPr>
         <w:spacing w:after="80" w:before="20" w:line="240" w:lineRule="auto"/>
         <w:pBdr>
-          <w:bottom w:val="single" w:sz="5" w:space="1" w:color="94A3B8"/>
+          <w:bottom w:val="single" w:sz="10" w:space="1" w:color="0F172A"/>
         </w:pBdr>
       </w:pPr>
     </w:p>
@@ -1734,7 +1782,7 @@
       <w:pPr>
         <w:spacing w:after="80" w:before="20" w:line="240" w:lineRule="auto"/>
         <w:pBdr>
-          <w:bottom w:val="single" w:sz="5" w:space="1" w:color="94A3B8"/>
+          <w:bottom w:val="single" w:sz="10" w:space="1" w:color="0F172A"/>
         </w:pBdr>
       </w:pPr>
     </w:p>
@@ -1754,7 +1802,7 @@
       <w:pPr>
         <w:spacing w:after="80" w:before="20" w:line="240" w:lineRule="auto"/>
         <w:pBdr>
-          <w:bottom w:val="single" w:sz="5" w:space="1" w:color="94A3B8"/>
+          <w:bottom w:val="single" w:sz="10" w:space="1" w:color="0F172A"/>
         </w:pBdr>
       </w:pPr>
     </w:p>
@@ -1828,7 +1876,10 @@
               <w:right w:w="90" w:type="dxa"/>
             </w:tcMar>
             <w:tcBorders>
-              <w:bottom w:val="single" w:sz="4" w:color="CBD5E1"/>
+              <w:bottom w:val="single" w:sz="8" w:color="334155" w:space="0"/>
+              <w:top w:val="single" w:sz="8" w:space="0" w:color="334155"/>
+              <w:left w:val="single" w:sz="8" w:space="0" w:color="334155"/>
+              <w:right w:val="single" w:sz="8" w:space="0" w:color="334155"/>
             </w:tcBorders>
           </w:tcPr>
           <w:p>
@@ -1853,14 +1904,17 @@
               <w:right w:w="90" w:type="dxa"/>
             </w:tcMar>
             <w:tcBorders>
-              <w:bottom w:val="single" w:sz="4" w:color="CBD5E1"/>
+              <w:bottom w:val="single" w:sz="14" w:color="0F172A" w:space="0"/>
+              <w:top w:val="single" w:sz="14" w:space="0" w:color="0F172A"/>
+              <w:left w:val="single" w:sz="14" w:space="0" w:color="0F172A"/>
+              <w:right w:val="single" w:sz="14" w:space="0" w:color="0F172A"/>
             </w:tcBorders>
           </w:tcPr>
           <w:p>
             <w:pPr>
               <w:spacing w:before="20" w:after="20" w:line="240" w:lineRule="auto"/>
               <w:pBdr>
-                <w:bottom w:val="single" w:sz="5" w:space="1" w:color="CBD5E1"/>
+                <w:bottom w:val="single" w:sz="10" w:space="1" w:color="0F172A"/>
               </w:pBdr>
             </w:pPr>
           </w:p>
@@ -1880,7 +1934,10 @@
               <w:right w:w="90" w:type="dxa"/>
             </w:tcMar>
             <w:tcBorders>
-              <w:bottom w:val="single" w:sz="4" w:color="CBD5E1"/>
+              <w:bottom w:val="single" w:sz="8" w:color="334155" w:space="0"/>
+              <w:top w:val="single" w:sz="8" w:space="0" w:color="334155"/>
+              <w:left w:val="single" w:sz="8" w:space="0" w:color="334155"/>
+              <w:right w:val="single" w:sz="8" w:space="0" w:color="334155"/>
             </w:tcBorders>
           </w:tcPr>
           <w:p>
@@ -1905,14 +1962,17 @@
               <w:right w:w="90" w:type="dxa"/>
             </w:tcMar>
             <w:tcBorders>
-              <w:bottom w:val="single" w:sz="4" w:color="CBD5E1"/>
+              <w:bottom w:val="single" w:sz="14" w:color="0F172A" w:space="0"/>
+              <w:top w:val="single" w:sz="14" w:space="0" w:color="0F172A"/>
+              <w:left w:val="single" w:sz="14" w:space="0" w:color="0F172A"/>
+              <w:right w:val="single" w:sz="14" w:space="0" w:color="0F172A"/>
             </w:tcBorders>
           </w:tcPr>
           <w:p>
             <w:pPr>
               <w:spacing w:before="20" w:after="20" w:line="240" w:lineRule="auto"/>
               <w:pBdr>
-                <w:bottom w:val="single" w:sz="5" w:space="1" w:color="CBD5E1"/>
+                <w:bottom w:val="single" w:sz="10" w:space="1" w:color="0F172A"/>
               </w:pBdr>
             </w:pPr>
           </w:p>
@@ -1932,7 +1992,10 @@
               <w:right w:w="90" w:type="dxa"/>
             </w:tcMar>
             <w:tcBorders>
-              <w:bottom w:val="single" w:sz="4" w:color="CBD5E1"/>
+              <w:bottom w:val="single" w:sz="8" w:color="334155" w:space="0"/>
+              <w:top w:val="single" w:sz="8" w:space="0" w:color="334155"/>
+              <w:left w:val="single" w:sz="8" w:space="0" w:color="334155"/>
+              <w:right w:val="single" w:sz="8" w:space="0" w:color="334155"/>
             </w:tcBorders>
           </w:tcPr>
           <w:p>
@@ -1957,14 +2020,17 @@
               <w:right w:w="90" w:type="dxa"/>
             </w:tcMar>
             <w:tcBorders>
-              <w:bottom w:val="single" w:sz="4" w:color="CBD5E1"/>
+              <w:bottom w:val="single" w:sz="14" w:color="0F172A" w:space="0"/>
+              <w:top w:val="single" w:sz="14" w:space="0" w:color="0F172A"/>
+              <w:left w:val="single" w:sz="14" w:space="0" w:color="0F172A"/>
+              <w:right w:val="single" w:sz="14" w:space="0" w:color="0F172A"/>
             </w:tcBorders>
           </w:tcPr>
           <w:p>
             <w:pPr>
               <w:spacing w:before="20" w:after="20" w:line="240" w:lineRule="auto"/>
               <w:pBdr>
-                <w:bottom w:val="single" w:sz="5" w:space="1" w:color="CBD5E1"/>
+                <w:bottom w:val="single" w:sz="10" w:space="1" w:color="0F172A"/>
               </w:pBdr>
             </w:pPr>
           </w:p>
@@ -1984,7 +2050,10 @@
               <w:right w:w="90" w:type="dxa"/>
             </w:tcMar>
             <w:tcBorders>
-              <w:bottom w:val="single" w:sz="4" w:color="CBD5E1"/>
+              <w:bottom w:val="single" w:sz="8" w:color="334155" w:space="0"/>
+              <w:top w:val="single" w:sz="8" w:space="0" w:color="334155"/>
+              <w:left w:val="single" w:sz="8" w:space="0" w:color="334155"/>
+              <w:right w:val="single" w:sz="8" w:space="0" w:color="334155"/>
             </w:tcBorders>
           </w:tcPr>
           <w:p>
@@ -2009,14 +2078,17 @@
               <w:right w:w="90" w:type="dxa"/>
             </w:tcMar>
             <w:tcBorders>
-              <w:bottom w:val="single" w:sz="4" w:color="CBD5E1"/>
+              <w:bottom w:val="single" w:sz="14" w:color="0F172A" w:space="0"/>
+              <w:top w:val="single" w:sz="14" w:space="0" w:color="0F172A"/>
+              <w:left w:val="single" w:sz="14" w:space="0" w:color="0F172A"/>
+              <w:right w:val="single" w:sz="14" w:space="0" w:color="0F172A"/>
             </w:tcBorders>
           </w:tcPr>
           <w:p>
             <w:pPr>
               <w:spacing w:before="20" w:after="20" w:line="240" w:lineRule="auto"/>
               <w:pBdr>
-                <w:bottom w:val="single" w:sz="5" w:space="1" w:color="CBD5E1"/>
+                <w:bottom w:val="single" w:sz="10" w:space="1" w:color="0F172A"/>
               </w:pBdr>
             </w:pPr>
           </w:p>
@@ -2036,7 +2108,10 @@
               <w:right w:w="90" w:type="dxa"/>
             </w:tcMar>
             <w:tcBorders>
-              <w:bottom w:val="single" w:sz="4" w:color="CBD5E1"/>
+              <w:bottom w:val="single" w:sz="8" w:color="334155" w:space="0"/>
+              <w:top w:val="single" w:sz="8" w:space="0" w:color="334155"/>
+              <w:left w:val="single" w:sz="8" w:space="0" w:color="334155"/>
+              <w:right w:val="single" w:sz="8" w:space="0" w:color="334155"/>
             </w:tcBorders>
           </w:tcPr>
           <w:p>
@@ -2061,14 +2136,17 @@
               <w:right w:w="90" w:type="dxa"/>
             </w:tcMar>
             <w:tcBorders>
-              <w:bottom w:val="single" w:sz="4" w:color="CBD5E1"/>
+              <w:bottom w:val="single" w:sz="14" w:color="0F172A" w:space="0"/>
+              <w:top w:val="single" w:sz="14" w:space="0" w:color="0F172A"/>
+              <w:left w:val="single" w:sz="14" w:space="0" w:color="0F172A"/>
+              <w:right w:val="single" w:sz="14" w:space="0" w:color="0F172A"/>
             </w:tcBorders>
           </w:tcPr>
           <w:p>
             <w:pPr>
               <w:spacing w:before="20" w:after="20" w:line="240" w:lineRule="auto"/>
               <w:pBdr>
-                <w:bottom w:val="single" w:sz="5" w:space="1" w:color="CBD5E1"/>
+                <w:bottom w:val="single" w:sz="10" w:space="1" w:color="0F172A"/>
               </w:pBdr>
             </w:pPr>
           </w:p>
@@ -2088,7 +2166,10 @@
               <w:right w:w="90" w:type="dxa"/>
             </w:tcMar>
             <w:tcBorders>
-              <w:bottom w:val="single" w:sz="4" w:color="CBD5E1"/>
+              <w:bottom w:val="single" w:sz="8" w:color="334155" w:space="0"/>
+              <w:top w:val="single" w:sz="8" w:space="0" w:color="334155"/>
+              <w:left w:val="single" w:sz="8" w:space="0" w:color="334155"/>
+              <w:right w:val="single" w:sz="8" w:space="0" w:color="334155"/>
             </w:tcBorders>
           </w:tcPr>
           <w:p>
@@ -2113,14 +2194,17 @@
               <w:right w:w="90" w:type="dxa"/>
             </w:tcMar>
             <w:tcBorders>
-              <w:bottom w:val="single" w:sz="4" w:color="CBD5E1"/>
+              <w:bottom w:val="single" w:sz="14" w:color="0F172A" w:space="0"/>
+              <w:top w:val="single" w:sz="14" w:space="0" w:color="0F172A"/>
+              <w:left w:val="single" w:sz="14" w:space="0" w:color="0F172A"/>
+              <w:right w:val="single" w:sz="14" w:space="0" w:color="0F172A"/>
             </w:tcBorders>
           </w:tcPr>
           <w:p>
             <w:pPr>
               <w:spacing w:before="20" w:after="20" w:line="240" w:lineRule="auto"/>
               <w:pBdr>
-                <w:bottom w:val="single" w:sz="5" w:space="1" w:color="CBD5E1"/>
+                <w:bottom w:val="single" w:sz="10" w:space="1" w:color="0F172A"/>
               </w:pBdr>
             </w:pPr>
           </w:p>
@@ -2245,7 +2329,7 @@
       <w:pPr>
         <w:spacing w:after="80" w:before="20" w:line="240" w:lineRule="auto"/>
         <w:pBdr>
-          <w:bottom w:val="single" w:sz="5" w:space="1" w:color="94A3B8"/>
+          <w:bottom w:val="single" w:sz="10" w:space="1" w:color="0F172A"/>
         </w:pBdr>
       </w:pPr>
     </w:p>
@@ -2261,7 +2345,7 @@
       <w:pPr>
         <w:spacing w:after="80" w:before="20" w:line="240" w:lineRule="auto"/>
         <w:pBdr>
-          <w:bottom w:val="single" w:sz="5" w:space="1" w:color="94A3B8"/>
+          <w:bottom w:val="single" w:sz="10" w:space="1" w:color="0F172A"/>
         </w:pBdr>
       </w:pPr>
     </w:p>
@@ -2323,6 +2407,12 @@
               <w:bottom w:w="90" w:type="dxa"/>
               <w:right w:w="100" w:type="dxa"/>
             </w:tcMar>
+            <w:tcBorders>
+              <w:top w:val="single" w:sz="8" w:space="0" w:color="0F172A"/>
+              <w:left w:val="single" w:sz="8" w:space="0" w:color="0F172A"/>
+              <w:bottom w:val="single" w:sz="8" w:space="0" w:color="0F172A"/>
+              <w:right w:val="single" w:sz="8" w:space="0" w:color="0F172A"/>
+            </w:tcBorders>
           </w:tcPr>
           <w:p>
             <w:pPr>
@@ -2348,6 +2438,12 @@
               <w:bottom w:w="90" w:type="dxa"/>
               <w:right w:w="100" w:type="dxa"/>
             </w:tcMar>
+            <w:tcBorders>
+              <w:top w:val="single" w:sz="8" w:space="0" w:color="0F172A"/>
+              <w:left w:val="single" w:sz="8" w:space="0" w:color="0F172A"/>
+              <w:bottom w:val="single" w:sz="8" w:space="0" w:color="0F172A"/>
+              <w:right w:val="single" w:sz="8" w:space="0" w:color="0F172A"/>
+            </w:tcBorders>
           </w:tcPr>
           <w:p>
             <w:pPr>
@@ -2378,6 +2474,12 @@
               <w:bottom w:w="120" w:type="dxa"/>
               <w:right w:w="140" w:type="dxa"/>
             </w:tcMar>
+            <w:tcBorders>
+              <w:top w:val="single" w:sz="8" w:space="0" w:color="0F172A"/>
+              <w:left w:val="single" w:sz="8" w:space="0" w:color="0F172A"/>
+              <w:bottom w:val="single" w:sz="8" w:space="0" w:color="0F172A"/>
+              <w:right w:val="single" w:sz="8" w:space="0" w:color="0F172A"/>
+            </w:tcBorders>
           </w:tcPr>
           <w:p>
             <w:pPr>
@@ -2408,6 +2510,12 @@
               <w:bottom w:w="120" w:type="dxa"/>
               <w:right w:w="140" w:type="dxa"/>
             </w:tcMar>
+            <w:tcBorders>
+              <w:top w:val="single" w:sz="8" w:space="0" w:color="0F172A"/>
+              <w:left w:val="single" w:sz="8" w:space="0" w:color="0F172A"/>
+              <w:bottom w:val="single" w:sz="8" w:space="0" w:color="0F172A"/>
+              <w:right w:val="single" w:sz="8" w:space="0" w:color="0F172A"/>
+            </w:tcBorders>
           </w:tcPr>
           <w:p>
             <w:pPr>
@@ -2454,7 +2562,7 @@
       <w:pPr>
         <w:spacing w:after="80" w:before="20" w:line="240" w:lineRule="auto"/>
         <w:pBdr>
-          <w:bottom w:val="single" w:sz="5" w:space="1" w:color="94A3B8"/>
+          <w:bottom w:val="single" w:sz="10" w:space="1" w:color="0F172A"/>
         </w:pBdr>
       </w:pPr>
     </w:p>
@@ -2462,7 +2570,7 @@
       <w:pPr>
         <w:spacing w:after="80" w:before="20" w:line="240" w:lineRule="auto"/>
         <w:pBdr>
-          <w:bottom w:val="single" w:sz="5" w:space="1" w:color="94A3B8"/>
+          <w:bottom w:val="single" w:sz="10" w:space="1" w:color="0F172A"/>
         </w:pBdr>
       </w:pPr>
     </w:p>
@@ -2546,7 +2654,10 @@
               <w:right w:w="60" w:type="dxa"/>
             </w:tcMar>
             <w:tcBorders>
-              <w:bottom w:val="single" w:sz="3" w:color="E2E8F0"/>
+              <w:bottom w:val="single" w:sz="8" w:color="334155" w:space="0"/>
+              <w:top w:val="single" w:sz="8" w:space="0" w:color="334155"/>
+              <w:left w:val="single" w:sz="8" w:space="0" w:color="334155"/>
+              <w:right w:val="single" w:sz="8" w:space="0" w:color="334155"/>
             </w:tcBorders>
           </w:tcPr>
           <w:p>
@@ -2569,7 +2680,10 @@
               <w:right w:w="60" w:type="dxa"/>
             </w:tcMar>
             <w:tcBorders>
-              <w:bottom w:val="single" w:sz="3" w:color="E2E8F0"/>
+              <w:bottom w:val="single" w:sz="8" w:color="334155" w:space="0"/>
+              <w:top w:val="single" w:sz="8" w:space="0" w:color="334155"/>
+              <w:left w:val="single" w:sz="8" w:space="0" w:color="334155"/>
+              <w:right w:val="single" w:sz="8" w:space="0" w:color="334155"/>
             </w:tcBorders>
           </w:tcPr>
           <w:p>
@@ -2597,7 +2711,10 @@
               <w:right w:w="60" w:type="dxa"/>
             </w:tcMar>
             <w:tcBorders>
-              <w:bottom w:val="single" w:sz="3" w:color="E2E8F0"/>
+              <w:bottom w:val="single" w:sz="8" w:color="334155" w:space="0"/>
+              <w:top w:val="single" w:sz="8" w:space="0" w:color="334155"/>
+              <w:left w:val="single" w:sz="8" w:space="0" w:color="334155"/>
+              <w:right w:val="single" w:sz="8" w:space="0" w:color="334155"/>
             </w:tcBorders>
           </w:tcPr>
           <w:p>
@@ -2620,7 +2737,10 @@
               <w:right w:w="60" w:type="dxa"/>
             </w:tcMar>
             <w:tcBorders>
-              <w:bottom w:val="single" w:sz="3" w:color="E2E8F0"/>
+              <w:bottom w:val="single" w:sz="8" w:color="334155" w:space="0"/>
+              <w:top w:val="single" w:sz="8" w:space="0" w:color="334155"/>
+              <w:left w:val="single" w:sz="8" w:space="0" w:color="334155"/>
+              <w:right w:val="single" w:sz="8" w:space="0" w:color="334155"/>
             </w:tcBorders>
           </w:tcPr>
           <w:p>
@@ -2648,7 +2768,10 @@
               <w:right w:w="60" w:type="dxa"/>
             </w:tcMar>
             <w:tcBorders>
-              <w:bottom w:val="single" w:sz="3" w:color="E2E8F0"/>
+              <w:bottom w:val="single" w:sz="8" w:color="334155" w:space="0"/>
+              <w:top w:val="single" w:sz="8" w:space="0" w:color="334155"/>
+              <w:left w:val="single" w:sz="8" w:space="0" w:color="334155"/>
+              <w:right w:val="single" w:sz="8" w:space="0" w:color="334155"/>
             </w:tcBorders>
           </w:tcPr>
           <w:p>
@@ -2671,7 +2794,10 @@
               <w:right w:w="60" w:type="dxa"/>
             </w:tcMar>
             <w:tcBorders>
-              <w:bottom w:val="single" w:sz="3" w:color="E2E8F0"/>
+              <w:bottom w:val="single" w:sz="8" w:color="334155" w:space="0"/>
+              <w:top w:val="single" w:sz="8" w:space="0" w:color="334155"/>
+              <w:left w:val="single" w:sz="8" w:space="0" w:color="334155"/>
+              <w:right w:val="single" w:sz="8" w:space="0" w:color="334155"/>
             </w:tcBorders>
           </w:tcPr>
           <w:p>
@@ -2733,7 +2859,10 @@
               <w:right w:w="60" w:type="dxa"/>
             </w:tcMar>
             <w:tcBorders>
-              <w:bottom w:val="single" w:sz="3" w:color="E2E8F0"/>
+              <w:bottom w:val="single" w:sz="8" w:color="334155" w:space="0"/>
+              <w:top w:val="single" w:sz="8" w:space="0" w:color="334155"/>
+              <w:left w:val="single" w:sz="8" w:space="0" w:color="334155"/>
+              <w:right w:val="single" w:sz="8" w:space="0" w:color="334155"/>
             </w:tcBorders>
           </w:tcPr>
           <w:p>
@@ -2756,7 +2885,10 @@
               <w:right w:w="60" w:type="dxa"/>
             </w:tcMar>
             <w:tcBorders>
-              <w:bottom w:val="single" w:sz="3" w:color="E2E8F0"/>
+              <w:bottom w:val="single" w:sz="8" w:color="334155" w:space="0"/>
+              <w:top w:val="single" w:sz="8" w:space="0" w:color="334155"/>
+              <w:left w:val="single" w:sz="8" w:space="0" w:color="334155"/>
+              <w:right w:val="single" w:sz="8" w:space="0" w:color="334155"/>
             </w:tcBorders>
           </w:tcPr>
           <w:p>
@@ -2784,7 +2916,10 @@
               <w:right w:w="60" w:type="dxa"/>
             </w:tcMar>
             <w:tcBorders>
-              <w:bottom w:val="single" w:sz="3" w:color="E2E8F0"/>
+              <w:bottom w:val="single" w:sz="8" w:color="334155" w:space="0"/>
+              <w:top w:val="single" w:sz="8" w:space="0" w:color="334155"/>
+              <w:left w:val="single" w:sz="8" w:space="0" w:color="334155"/>
+              <w:right w:val="single" w:sz="8" w:space="0" w:color="334155"/>
             </w:tcBorders>
           </w:tcPr>
           <w:p>
@@ -2807,7 +2942,10 @@
               <w:right w:w="60" w:type="dxa"/>
             </w:tcMar>
             <w:tcBorders>
-              <w:bottom w:val="single" w:sz="3" w:color="E2E8F0"/>
+              <w:bottom w:val="single" w:sz="8" w:color="334155" w:space="0"/>
+              <w:top w:val="single" w:sz="8" w:space="0" w:color="334155"/>
+              <w:left w:val="single" w:sz="8" w:space="0" w:color="334155"/>
+              <w:right w:val="single" w:sz="8" w:space="0" w:color="334155"/>
             </w:tcBorders>
           </w:tcPr>
           <w:p>
@@ -2835,7 +2973,10 @@
               <w:right w:w="60" w:type="dxa"/>
             </w:tcMar>
             <w:tcBorders>
-              <w:bottom w:val="single" w:sz="3" w:color="E2E8F0"/>
+              <w:bottom w:val="single" w:sz="8" w:color="334155" w:space="0"/>
+              <w:top w:val="single" w:sz="8" w:space="0" w:color="334155"/>
+              <w:left w:val="single" w:sz="8" w:space="0" w:color="334155"/>
+              <w:right w:val="single" w:sz="8" w:space="0" w:color="334155"/>
             </w:tcBorders>
           </w:tcPr>
           <w:p>
@@ -2858,7 +2999,10 @@
               <w:right w:w="60" w:type="dxa"/>
             </w:tcMar>
             <w:tcBorders>
-              <w:bottom w:val="single" w:sz="3" w:color="E2E8F0"/>
+              <w:bottom w:val="single" w:sz="8" w:color="334155" w:space="0"/>
+              <w:top w:val="single" w:sz="8" w:space="0" w:color="334155"/>
+              <w:left w:val="single" w:sz="8" w:space="0" w:color="334155"/>
+              <w:right w:val="single" w:sz="8" w:space="0" w:color="334155"/>
             </w:tcBorders>
           </w:tcPr>
           <w:p>
@@ -2920,7 +3064,10 @@
               <w:right w:w="60" w:type="dxa"/>
             </w:tcMar>
             <w:tcBorders>
-              <w:bottom w:val="single" w:sz="3" w:color="E2E8F0"/>
+              <w:bottom w:val="single" w:sz="8" w:color="334155" w:space="0"/>
+              <w:top w:val="single" w:sz="8" w:space="0" w:color="334155"/>
+              <w:left w:val="single" w:sz="8" w:space="0" w:color="334155"/>
+              <w:right w:val="single" w:sz="8" w:space="0" w:color="334155"/>
             </w:tcBorders>
           </w:tcPr>
           <w:p>
@@ -2943,7 +3090,10 @@
               <w:right w:w="60" w:type="dxa"/>
             </w:tcMar>
             <w:tcBorders>
-              <w:bottom w:val="single" w:sz="3" w:color="E2E8F0"/>
+              <w:bottom w:val="single" w:sz="8" w:color="334155" w:space="0"/>
+              <w:top w:val="single" w:sz="8" w:space="0" w:color="334155"/>
+              <w:left w:val="single" w:sz="8" w:space="0" w:color="334155"/>
+              <w:right w:val="single" w:sz="8" w:space="0" w:color="334155"/>
             </w:tcBorders>
           </w:tcPr>
           <w:p>
@@ -2971,7 +3121,10 @@
               <w:right w:w="60" w:type="dxa"/>
             </w:tcMar>
             <w:tcBorders>
-              <w:bottom w:val="single" w:sz="3" w:color="E2E8F0"/>
+              <w:bottom w:val="single" w:sz="8" w:color="334155" w:space="0"/>
+              <w:top w:val="single" w:sz="8" w:space="0" w:color="334155"/>
+              <w:left w:val="single" w:sz="8" w:space="0" w:color="334155"/>
+              <w:right w:val="single" w:sz="8" w:space="0" w:color="334155"/>
             </w:tcBorders>
           </w:tcPr>
           <w:p>
@@ -2994,7 +3147,10 @@
               <w:right w:w="60" w:type="dxa"/>
             </w:tcMar>
             <w:tcBorders>
-              <w:bottom w:val="single" w:sz="3" w:color="E2E8F0"/>
+              <w:bottom w:val="single" w:sz="8" w:color="334155" w:space="0"/>
+              <w:top w:val="single" w:sz="8" w:space="0" w:color="334155"/>
+              <w:left w:val="single" w:sz="8" w:space="0" w:color="334155"/>
+              <w:right w:val="single" w:sz="8" w:space="0" w:color="334155"/>
             </w:tcBorders>
           </w:tcPr>
           <w:p>
@@ -3022,7 +3178,10 @@
               <w:right w:w="60" w:type="dxa"/>
             </w:tcMar>
             <w:tcBorders>
-              <w:bottom w:val="single" w:sz="3" w:color="E2E8F0"/>
+              <w:bottom w:val="single" w:sz="8" w:color="334155" w:space="0"/>
+              <w:top w:val="single" w:sz="8" w:space="0" w:color="334155"/>
+              <w:left w:val="single" w:sz="8" w:space="0" w:color="334155"/>
+              <w:right w:val="single" w:sz="8" w:space="0" w:color="334155"/>
             </w:tcBorders>
           </w:tcPr>
           <w:p>
@@ -3045,7 +3204,10 @@
               <w:right w:w="60" w:type="dxa"/>
             </w:tcMar>
             <w:tcBorders>
-              <w:bottom w:val="single" w:sz="3" w:color="E2E8F0"/>
+              <w:bottom w:val="single" w:sz="8" w:color="334155" w:space="0"/>
+              <w:top w:val="single" w:sz="8" w:space="0" w:color="334155"/>
+              <w:left w:val="single" w:sz="8" w:space="0" w:color="334155"/>
+              <w:right w:val="single" w:sz="8" w:space="0" w:color="334155"/>
             </w:tcBorders>
           </w:tcPr>
           <w:p>
@@ -3125,7 +3287,7 @@
       <w:pPr>
         <w:spacing w:after="80" w:before="20" w:line="240" w:lineRule="auto"/>
         <w:pBdr>
-          <w:bottom w:val="single" w:sz="5" w:space="1" w:color="94A3B8"/>
+          <w:bottom w:val="single" w:sz="10" w:space="1" w:color="0F172A"/>
         </w:pBdr>
       </w:pPr>
     </w:p>
@@ -3133,7 +3295,7 @@
       <w:pPr>
         <w:spacing w:after="80" w:before="20" w:line="240" w:lineRule="auto"/>
         <w:pBdr>
-          <w:bottom w:val="single" w:sz="5" w:space="1" w:color="94A3B8"/>
+          <w:bottom w:val="single" w:sz="10" w:space="1" w:color="0F172A"/>
         </w:pBdr>
       </w:pPr>
     </w:p>
@@ -3149,7 +3311,7 @@
       <w:pPr>
         <w:spacing w:after="80" w:before="20" w:line="240" w:lineRule="auto"/>
         <w:pBdr>
-          <w:bottom w:val="single" w:sz="5" w:space="1" w:color="94A3B8"/>
+          <w:bottom w:val="single" w:sz="10" w:space="1" w:color="0F172A"/>
         </w:pBdr>
       </w:pPr>
     </w:p>
@@ -3260,7 +3422,7 @@
       <w:pPr>
         <w:spacing w:before="20" w:after="80" w:line="240" w:lineRule="auto"/>
         <w:pBdr>
-          <w:bottom w:val="single" w:sz="5" w:space="1" w:color="94A3B8"/>
+          <w:bottom w:val="single" w:sz="10" w:space="1" w:color="0F172A"/>
         </w:pBdr>
       </w:pPr>
     </w:p>
@@ -3310,7 +3472,7 @@
       <w:pPr>
         <w:spacing w:before="20" w:after="80" w:line="240" w:lineRule="auto"/>
         <w:pBdr>
-          <w:bottom w:val="single" w:sz="5" w:space="1" w:color="94A3B8"/>
+          <w:bottom w:val="single" w:sz="10" w:space="1" w:color="0F172A"/>
         </w:pBdr>
       </w:pPr>
     </w:p>

</xml_diff>

<commit_message>
sync: mirror ib2026/main into ib2027/main
</commit_message>
<xml_diff>
--- a/hw/P1.docx
+++ b/hw/P1.docx
@@ -106,7 +106,7 @@
             <w:pPr>
               <w:spacing w:before="20" w:after="20" w:line="240" w:lineRule="auto"/>
               <w:pBdr>
-                <w:bottom w:val="single" w:sz="5" w:space="1" w:color="CBD5E1"/>
+                <w:bottom w:val="single" w:sz="10" w:space="1" w:color="0F172A"/>
               </w:pBdr>
             </w:pPr>
           </w:p>
@@ -139,7 +139,7 @@
             <w:pPr>
               <w:spacing w:before="20" w:after="20" w:line="240" w:lineRule="auto"/>
               <w:pBdr>
-                <w:bottom w:val="single" w:sz="5" w:space="1" w:color="CBD5E1"/>
+                <w:bottom w:val="single" w:sz="10" w:space="1" w:color="0F172A"/>
               </w:pBdr>
             </w:pPr>
           </w:p>
@@ -172,7 +172,7 @@
             <w:pPr>
               <w:spacing w:before="20" w:after="20" w:line="240" w:lineRule="auto"/>
               <w:pBdr>
-                <w:bottom w:val="single" w:sz="5" w:space="1" w:color="CBD5E1"/>
+                <w:bottom w:val="single" w:sz="10" w:space="1" w:color="0F172A"/>
               </w:pBdr>
             </w:pPr>
           </w:p>
@@ -206,10 +206,10 @@
               <w:right w:w="120" w:type="dxa"/>
             </w:tcMar>
             <w:tcBorders>
-              <w:top w:val="single" w:sz="5" w:color="BFDBFE"/>
-              <w:left w:val="single" w:sz="5" w:color="BFDBFE"/>
-              <w:bottom w:val="single" w:sz="5" w:color="BFDBFE"/>
-              <w:right w:val="single" w:sz="5" w:color="BFDBFE"/>
+              <w:top w:val="single" w:sz="8" w:color="0F172A" w:space="0"/>
+              <w:left w:val="single" w:sz="8" w:color="0F172A" w:space="0"/>
+              <w:bottom w:val="single" w:sz="8" w:color="0F172A" w:space="0"/>
+              <w:right w:val="single" w:sz="8" w:color="0F172A" w:space="0"/>
             </w:tcBorders>
           </w:tcPr>
           <w:p>
@@ -246,10 +246,10 @@
               <w:right w:w="120" w:type="dxa"/>
             </w:tcMar>
             <w:tcBorders>
-              <w:top w:val="single" w:sz="5" w:color="BFDBFE"/>
-              <w:left w:val="single" w:sz="5" w:color="BFDBFE"/>
-              <w:bottom w:val="single" w:sz="5" w:color="BFDBFE"/>
-              <w:right w:val="single" w:sz="5" w:color="BFDBFE"/>
+              <w:top w:val="single" w:sz="8" w:color="0F172A" w:space="0"/>
+              <w:left w:val="single" w:sz="8" w:color="0F172A" w:space="0"/>
+              <w:bottom w:val="single" w:sz="8" w:color="0F172A" w:space="0"/>
+              <w:right w:val="single" w:sz="8" w:color="0F172A" w:space="0"/>
             </w:tcBorders>
           </w:tcPr>
           <w:p>
@@ -286,10 +286,10 @@
               <w:right w:w="120" w:type="dxa"/>
             </w:tcMar>
             <w:tcBorders>
-              <w:top w:val="single" w:sz="5" w:color="BFDBFE"/>
-              <w:left w:val="single" w:sz="5" w:color="BFDBFE"/>
-              <w:bottom w:val="single" w:sz="5" w:color="BFDBFE"/>
-              <w:right w:val="single" w:sz="5" w:color="BFDBFE"/>
+              <w:top w:val="single" w:sz="8" w:color="0F172A" w:space="0"/>
+              <w:left w:val="single" w:sz="8" w:color="0F172A" w:space="0"/>
+              <w:bottom w:val="single" w:sz="8" w:color="0F172A" w:space="0"/>
+              <w:right w:val="single" w:sz="8" w:color="0F172A" w:space="0"/>
             </w:tcBorders>
           </w:tcPr>
           <w:p>
@@ -1301,6 +1301,12 @@
               <w:bottom w:w="35" w:type="dxa"/>
               <w:right w:w="90" w:type="dxa"/>
             </w:tcMar>
+            <w:tcBorders>
+              <w:top w:val="single" w:sz="8" w:space="0" w:color="0F172A"/>
+              <w:left w:val="single" w:sz="8" w:space="0" w:color="0F172A"/>
+              <w:bottom w:val="single" w:sz="8" w:space="0" w:color="0F172A"/>
+              <w:right w:val="single" w:sz="8" w:space="0" w:color="0F172A"/>
+            </w:tcBorders>
           </w:tcPr>
           <w:p>
             <w:pPr>
@@ -1326,6 +1332,12 @@
               <w:bottom w:w="35" w:type="dxa"/>
               <w:right w:w="90" w:type="dxa"/>
             </w:tcMar>
+            <w:tcBorders>
+              <w:top w:val="single" w:sz="8" w:space="0" w:color="0F172A"/>
+              <w:left w:val="single" w:sz="8" w:space="0" w:color="0F172A"/>
+              <w:bottom w:val="single" w:sz="8" w:space="0" w:color="0F172A"/>
+              <w:right w:val="single" w:sz="8" w:space="0" w:color="0F172A"/>
+            </w:tcBorders>
           </w:tcPr>
           <w:p>
             <w:pPr>
@@ -1356,7 +1368,10 @@
               <w:right w:w="90" w:type="dxa"/>
             </w:tcMar>
             <w:tcBorders>
-              <w:bottom w:val="single" w:sz="4" w:color="CBD5E1"/>
+              <w:bottom w:val="single" w:sz="8" w:color="334155" w:space="0"/>
+              <w:top w:val="single" w:sz="8" w:space="0" w:color="334155"/>
+              <w:left w:val="single" w:sz="8" w:space="0" w:color="334155"/>
+              <w:right w:val="single" w:sz="8" w:space="0" w:color="334155"/>
             </w:tcBorders>
           </w:tcPr>
           <w:p>
@@ -1382,7 +1397,10 @@
               <w:right w:w="90" w:type="dxa"/>
             </w:tcMar>
             <w:tcBorders>
-              <w:bottom w:val="single" w:sz="4" w:color="CBD5E1"/>
+              <w:bottom w:val="single" w:sz="14" w:color="0F172A" w:space="0"/>
+              <w:top w:val="single" w:sz="14" w:space="0" w:color="0F172A"/>
+              <w:left w:val="single" w:sz="14" w:space="0" w:color="0F172A"/>
+              <w:right w:val="single" w:sz="14" w:space="0" w:color="0F172A"/>
             </w:tcBorders>
           </w:tcPr>
           <w:p>
@@ -1390,7 +1408,7 @@
               <w:spacing w:before="20" w:after="20" w:line="240" w:lineRule="auto"/>
               <w:jc w:val="center"/>
               <w:pBdr>
-                <w:bottom w:val="single" w:sz="5" w:space="1" w:color="CBD5E1"/>
+                <w:bottom w:val="single" w:sz="10" w:space="1" w:color="0F172A"/>
               </w:pBdr>
             </w:pPr>
           </w:p>
@@ -1410,7 +1428,10 @@
               <w:right w:w="90" w:type="dxa"/>
             </w:tcMar>
             <w:tcBorders>
-              <w:bottom w:val="single" w:sz="4" w:color="CBD5E1"/>
+              <w:bottom w:val="single" w:sz="8" w:color="334155" w:space="0"/>
+              <w:top w:val="single" w:sz="8" w:space="0" w:color="334155"/>
+              <w:left w:val="single" w:sz="8" w:space="0" w:color="334155"/>
+              <w:right w:val="single" w:sz="8" w:space="0" w:color="334155"/>
             </w:tcBorders>
           </w:tcPr>
           <w:p>
@@ -1436,7 +1457,10 @@
               <w:right w:w="90" w:type="dxa"/>
             </w:tcMar>
             <w:tcBorders>
-              <w:bottom w:val="single" w:sz="4" w:color="CBD5E1"/>
+              <w:bottom w:val="single" w:sz="14" w:color="0F172A" w:space="0"/>
+              <w:top w:val="single" w:sz="14" w:space="0" w:color="0F172A"/>
+              <w:left w:val="single" w:sz="14" w:space="0" w:color="0F172A"/>
+              <w:right w:val="single" w:sz="14" w:space="0" w:color="0F172A"/>
             </w:tcBorders>
           </w:tcPr>
           <w:p>
@@ -1444,7 +1468,7 @@
               <w:spacing w:before="20" w:after="20" w:line="240" w:lineRule="auto"/>
               <w:jc w:val="center"/>
               <w:pBdr>
-                <w:bottom w:val="single" w:sz="5" w:space="1" w:color="CBD5E1"/>
+                <w:bottom w:val="single" w:sz="10" w:space="1" w:color="0F172A"/>
               </w:pBdr>
             </w:pPr>
           </w:p>
@@ -1464,7 +1488,10 @@
               <w:right w:w="90" w:type="dxa"/>
             </w:tcMar>
             <w:tcBorders>
-              <w:bottom w:val="single" w:sz="4" w:color="CBD5E1"/>
+              <w:bottom w:val="single" w:sz="8" w:color="334155" w:space="0"/>
+              <w:top w:val="single" w:sz="8" w:space="0" w:color="334155"/>
+              <w:left w:val="single" w:sz="8" w:space="0" w:color="334155"/>
+              <w:right w:val="single" w:sz="8" w:space="0" w:color="334155"/>
             </w:tcBorders>
           </w:tcPr>
           <w:p>
@@ -1490,7 +1517,10 @@
               <w:right w:w="90" w:type="dxa"/>
             </w:tcMar>
             <w:tcBorders>
-              <w:bottom w:val="single" w:sz="4" w:color="CBD5E1"/>
+              <w:bottom w:val="single" w:sz="14" w:color="0F172A" w:space="0"/>
+              <w:top w:val="single" w:sz="14" w:space="0" w:color="0F172A"/>
+              <w:left w:val="single" w:sz="14" w:space="0" w:color="0F172A"/>
+              <w:right w:val="single" w:sz="14" w:space="0" w:color="0F172A"/>
             </w:tcBorders>
           </w:tcPr>
           <w:p>
@@ -1498,7 +1528,7 @@
               <w:spacing w:before="20" w:after="20" w:line="240" w:lineRule="auto"/>
               <w:jc w:val="center"/>
               <w:pBdr>
-                <w:bottom w:val="single" w:sz="5" w:space="1" w:color="CBD5E1"/>
+                <w:bottom w:val="single" w:sz="10" w:space="1" w:color="0F172A"/>
               </w:pBdr>
             </w:pPr>
           </w:p>
@@ -1518,7 +1548,10 @@
               <w:right w:w="90" w:type="dxa"/>
             </w:tcMar>
             <w:tcBorders>
-              <w:bottom w:val="single" w:sz="4" w:color="CBD5E1"/>
+              <w:bottom w:val="single" w:sz="8" w:color="334155" w:space="0"/>
+              <w:top w:val="single" w:sz="8" w:space="0" w:color="334155"/>
+              <w:left w:val="single" w:sz="8" w:space="0" w:color="334155"/>
+              <w:right w:val="single" w:sz="8" w:space="0" w:color="334155"/>
             </w:tcBorders>
           </w:tcPr>
           <w:p>
@@ -1544,7 +1577,10 @@
               <w:right w:w="90" w:type="dxa"/>
             </w:tcMar>
             <w:tcBorders>
-              <w:bottom w:val="single" w:sz="4" w:color="CBD5E1"/>
+              <w:bottom w:val="single" w:sz="14" w:color="0F172A" w:space="0"/>
+              <w:top w:val="single" w:sz="14" w:space="0" w:color="0F172A"/>
+              <w:left w:val="single" w:sz="14" w:space="0" w:color="0F172A"/>
+              <w:right w:val="single" w:sz="14" w:space="0" w:color="0F172A"/>
             </w:tcBorders>
           </w:tcPr>
           <w:p>
@@ -1552,7 +1588,7 @@
               <w:spacing w:before="20" w:after="20" w:line="240" w:lineRule="auto"/>
               <w:jc w:val="center"/>
               <w:pBdr>
-                <w:bottom w:val="single" w:sz="5" w:space="1" w:color="CBD5E1"/>
+                <w:bottom w:val="single" w:sz="10" w:space="1" w:color="0F172A"/>
               </w:pBdr>
             </w:pPr>
           </w:p>
@@ -1572,7 +1608,10 @@
               <w:right w:w="90" w:type="dxa"/>
             </w:tcMar>
             <w:tcBorders>
-              <w:bottom w:val="single" w:sz="4" w:color="CBD5E1"/>
+              <w:bottom w:val="single" w:sz="8" w:color="334155" w:space="0"/>
+              <w:top w:val="single" w:sz="8" w:space="0" w:color="334155"/>
+              <w:left w:val="single" w:sz="8" w:space="0" w:color="334155"/>
+              <w:right w:val="single" w:sz="8" w:space="0" w:color="334155"/>
             </w:tcBorders>
           </w:tcPr>
           <w:p>
@@ -1598,7 +1637,10 @@
               <w:right w:w="90" w:type="dxa"/>
             </w:tcMar>
             <w:tcBorders>
-              <w:bottom w:val="single" w:sz="4" w:color="CBD5E1"/>
+              <w:bottom w:val="single" w:sz="14" w:color="0F172A" w:space="0"/>
+              <w:top w:val="single" w:sz="14" w:space="0" w:color="0F172A"/>
+              <w:left w:val="single" w:sz="14" w:space="0" w:color="0F172A"/>
+              <w:right w:val="single" w:sz="14" w:space="0" w:color="0F172A"/>
             </w:tcBorders>
           </w:tcPr>
           <w:p>
@@ -1606,7 +1648,7 @@
               <w:spacing w:before="20" w:after="20" w:line="240" w:lineRule="auto"/>
               <w:jc w:val="center"/>
               <w:pBdr>
-                <w:bottom w:val="single" w:sz="5" w:space="1" w:color="CBD5E1"/>
+                <w:bottom w:val="single" w:sz="10" w:space="1" w:color="0F172A"/>
               </w:pBdr>
             </w:pPr>
           </w:p>
@@ -1626,7 +1668,10 @@
               <w:right w:w="90" w:type="dxa"/>
             </w:tcMar>
             <w:tcBorders>
-              <w:bottom w:val="single" w:sz="4" w:color="CBD5E1"/>
+              <w:bottom w:val="single" w:sz="8" w:color="334155" w:space="0"/>
+              <w:top w:val="single" w:sz="8" w:space="0" w:color="334155"/>
+              <w:left w:val="single" w:sz="8" w:space="0" w:color="334155"/>
+              <w:right w:val="single" w:sz="8" w:space="0" w:color="334155"/>
             </w:tcBorders>
           </w:tcPr>
           <w:p>
@@ -1652,7 +1697,10 @@
               <w:right w:w="90" w:type="dxa"/>
             </w:tcMar>
             <w:tcBorders>
-              <w:bottom w:val="single" w:sz="4" w:color="CBD5E1"/>
+              <w:bottom w:val="single" w:sz="14" w:color="0F172A" w:space="0"/>
+              <w:top w:val="single" w:sz="14" w:space="0" w:color="0F172A"/>
+              <w:left w:val="single" w:sz="14" w:space="0" w:color="0F172A"/>
+              <w:right w:val="single" w:sz="14" w:space="0" w:color="0F172A"/>
             </w:tcBorders>
           </w:tcPr>
           <w:p>
@@ -1660,7 +1708,7 @@
               <w:spacing w:before="20" w:after="20" w:line="240" w:lineRule="auto"/>
               <w:jc w:val="center"/>
               <w:pBdr>
-                <w:bottom w:val="single" w:sz="5" w:space="1" w:color="CBD5E1"/>
+                <w:bottom w:val="single" w:sz="10" w:space="1" w:color="0F172A"/>
               </w:pBdr>
             </w:pPr>
           </w:p>
@@ -1715,7 +1763,7 @@
       <w:pPr>
         <w:spacing w:after="80" w:before="20" w:line="240" w:lineRule="auto"/>
         <w:pBdr>
-          <w:bottom w:val="single" w:sz="5" w:space="1" w:color="94A3B8"/>
+          <w:bottom w:val="single" w:sz="10" w:space="1" w:color="0F172A"/>
         </w:pBdr>
       </w:pPr>
     </w:p>
@@ -1734,7 +1782,7 @@
       <w:pPr>
         <w:spacing w:after="80" w:before="20" w:line="240" w:lineRule="auto"/>
         <w:pBdr>
-          <w:bottom w:val="single" w:sz="5" w:space="1" w:color="94A3B8"/>
+          <w:bottom w:val="single" w:sz="10" w:space="1" w:color="0F172A"/>
         </w:pBdr>
       </w:pPr>
     </w:p>
@@ -1754,7 +1802,7 @@
       <w:pPr>
         <w:spacing w:after="80" w:before="20" w:line="240" w:lineRule="auto"/>
         <w:pBdr>
-          <w:bottom w:val="single" w:sz="5" w:space="1" w:color="94A3B8"/>
+          <w:bottom w:val="single" w:sz="10" w:space="1" w:color="0F172A"/>
         </w:pBdr>
       </w:pPr>
     </w:p>
@@ -1828,7 +1876,10 @@
               <w:right w:w="90" w:type="dxa"/>
             </w:tcMar>
             <w:tcBorders>
-              <w:bottom w:val="single" w:sz="4" w:color="CBD5E1"/>
+              <w:bottom w:val="single" w:sz="8" w:color="334155" w:space="0"/>
+              <w:top w:val="single" w:sz="8" w:space="0" w:color="334155"/>
+              <w:left w:val="single" w:sz="8" w:space="0" w:color="334155"/>
+              <w:right w:val="single" w:sz="8" w:space="0" w:color="334155"/>
             </w:tcBorders>
           </w:tcPr>
           <w:p>
@@ -1853,14 +1904,17 @@
               <w:right w:w="90" w:type="dxa"/>
             </w:tcMar>
             <w:tcBorders>
-              <w:bottom w:val="single" w:sz="4" w:color="CBD5E1"/>
+              <w:bottom w:val="single" w:sz="14" w:color="0F172A" w:space="0"/>
+              <w:top w:val="single" w:sz="14" w:space="0" w:color="0F172A"/>
+              <w:left w:val="single" w:sz="14" w:space="0" w:color="0F172A"/>
+              <w:right w:val="single" w:sz="14" w:space="0" w:color="0F172A"/>
             </w:tcBorders>
           </w:tcPr>
           <w:p>
             <w:pPr>
               <w:spacing w:before="20" w:after="20" w:line="240" w:lineRule="auto"/>
               <w:pBdr>
-                <w:bottom w:val="single" w:sz="5" w:space="1" w:color="CBD5E1"/>
+                <w:bottom w:val="single" w:sz="10" w:space="1" w:color="0F172A"/>
               </w:pBdr>
             </w:pPr>
           </w:p>
@@ -1880,7 +1934,10 @@
               <w:right w:w="90" w:type="dxa"/>
             </w:tcMar>
             <w:tcBorders>
-              <w:bottom w:val="single" w:sz="4" w:color="CBD5E1"/>
+              <w:bottom w:val="single" w:sz="8" w:color="334155" w:space="0"/>
+              <w:top w:val="single" w:sz="8" w:space="0" w:color="334155"/>
+              <w:left w:val="single" w:sz="8" w:space="0" w:color="334155"/>
+              <w:right w:val="single" w:sz="8" w:space="0" w:color="334155"/>
             </w:tcBorders>
           </w:tcPr>
           <w:p>
@@ -1905,14 +1962,17 @@
               <w:right w:w="90" w:type="dxa"/>
             </w:tcMar>
             <w:tcBorders>
-              <w:bottom w:val="single" w:sz="4" w:color="CBD5E1"/>
+              <w:bottom w:val="single" w:sz="14" w:color="0F172A" w:space="0"/>
+              <w:top w:val="single" w:sz="14" w:space="0" w:color="0F172A"/>
+              <w:left w:val="single" w:sz="14" w:space="0" w:color="0F172A"/>
+              <w:right w:val="single" w:sz="14" w:space="0" w:color="0F172A"/>
             </w:tcBorders>
           </w:tcPr>
           <w:p>
             <w:pPr>
               <w:spacing w:before="20" w:after="20" w:line="240" w:lineRule="auto"/>
               <w:pBdr>
-                <w:bottom w:val="single" w:sz="5" w:space="1" w:color="CBD5E1"/>
+                <w:bottom w:val="single" w:sz="10" w:space="1" w:color="0F172A"/>
               </w:pBdr>
             </w:pPr>
           </w:p>
@@ -1932,7 +1992,10 @@
               <w:right w:w="90" w:type="dxa"/>
             </w:tcMar>
             <w:tcBorders>
-              <w:bottom w:val="single" w:sz="4" w:color="CBD5E1"/>
+              <w:bottom w:val="single" w:sz="8" w:color="334155" w:space="0"/>
+              <w:top w:val="single" w:sz="8" w:space="0" w:color="334155"/>
+              <w:left w:val="single" w:sz="8" w:space="0" w:color="334155"/>
+              <w:right w:val="single" w:sz="8" w:space="0" w:color="334155"/>
             </w:tcBorders>
           </w:tcPr>
           <w:p>
@@ -1957,14 +2020,17 @@
               <w:right w:w="90" w:type="dxa"/>
             </w:tcMar>
             <w:tcBorders>
-              <w:bottom w:val="single" w:sz="4" w:color="CBD5E1"/>
+              <w:bottom w:val="single" w:sz="14" w:color="0F172A" w:space="0"/>
+              <w:top w:val="single" w:sz="14" w:space="0" w:color="0F172A"/>
+              <w:left w:val="single" w:sz="14" w:space="0" w:color="0F172A"/>
+              <w:right w:val="single" w:sz="14" w:space="0" w:color="0F172A"/>
             </w:tcBorders>
           </w:tcPr>
           <w:p>
             <w:pPr>
               <w:spacing w:before="20" w:after="20" w:line="240" w:lineRule="auto"/>
               <w:pBdr>
-                <w:bottom w:val="single" w:sz="5" w:space="1" w:color="CBD5E1"/>
+                <w:bottom w:val="single" w:sz="10" w:space="1" w:color="0F172A"/>
               </w:pBdr>
             </w:pPr>
           </w:p>
@@ -1984,7 +2050,10 @@
               <w:right w:w="90" w:type="dxa"/>
             </w:tcMar>
             <w:tcBorders>
-              <w:bottom w:val="single" w:sz="4" w:color="CBD5E1"/>
+              <w:bottom w:val="single" w:sz="8" w:color="334155" w:space="0"/>
+              <w:top w:val="single" w:sz="8" w:space="0" w:color="334155"/>
+              <w:left w:val="single" w:sz="8" w:space="0" w:color="334155"/>
+              <w:right w:val="single" w:sz="8" w:space="0" w:color="334155"/>
             </w:tcBorders>
           </w:tcPr>
           <w:p>
@@ -2009,14 +2078,17 @@
               <w:right w:w="90" w:type="dxa"/>
             </w:tcMar>
             <w:tcBorders>
-              <w:bottom w:val="single" w:sz="4" w:color="CBD5E1"/>
+              <w:bottom w:val="single" w:sz="14" w:color="0F172A" w:space="0"/>
+              <w:top w:val="single" w:sz="14" w:space="0" w:color="0F172A"/>
+              <w:left w:val="single" w:sz="14" w:space="0" w:color="0F172A"/>
+              <w:right w:val="single" w:sz="14" w:space="0" w:color="0F172A"/>
             </w:tcBorders>
           </w:tcPr>
           <w:p>
             <w:pPr>
               <w:spacing w:before="20" w:after="20" w:line="240" w:lineRule="auto"/>
               <w:pBdr>
-                <w:bottom w:val="single" w:sz="5" w:space="1" w:color="CBD5E1"/>
+                <w:bottom w:val="single" w:sz="10" w:space="1" w:color="0F172A"/>
               </w:pBdr>
             </w:pPr>
           </w:p>
@@ -2036,7 +2108,10 @@
               <w:right w:w="90" w:type="dxa"/>
             </w:tcMar>
             <w:tcBorders>
-              <w:bottom w:val="single" w:sz="4" w:color="CBD5E1"/>
+              <w:bottom w:val="single" w:sz="8" w:color="334155" w:space="0"/>
+              <w:top w:val="single" w:sz="8" w:space="0" w:color="334155"/>
+              <w:left w:val="single" w:sz="8" w:space="0" w:color="334155"/>
+              <w:right w:val="single" w:sz="8" w:space="0" w:color="334155"/>
             </w:tcBorders>
           </w:tcPr>
           <w:p>
@@ -2061,14 +2136,17 @@
               <w:right w:w="90" w:type="dxa"/>
             </w:tcMar>
             <w:tcBorders>
-              <w:bottom w:val="single" w:sz="4" w:color="CBD5E1"/>
+              <w:bottom w:val="single" w:sz="14" w:color="0F172A" w:space="0"/>
+              <w:top w:val="single" w:sz="14" w:space="0" w:color="0F172A"/>
+              <w:left w:val="single" w:sz="14" w:space="0" w:color="0F172A"/>
+              <w:right w:val="single" w:sz="14" w:space="0" w:color="0F172A"/>
             </w:tcBorders>
           </w:tcPr>
           <w:p>
             <w:pPr>
               <w:spacing w:before="20" w:after="20" w:line="240" w:lineRule="auto"/>
               <w:pBdr>
-                <w:bottom w:val="single" w:sz="5" w:space="1" w:color="CBD5E1"/>
+                <w:bottom w:val="single" w:sz="10" w:space="1" w:color="0F172A"/>
               </w:pBdr>
             </w:pPr>
           </w:p>
@@ -2088,7 +2166,10 @@
               <w:right w:w="90" w:type="dxa"/>
             </w:tcMar>
             <w:tcBorders>
-              <w:bottom w:val="single" w:sz="4" w:color="CBD5E1"/>
+              <w:bottom w:val="single" w:sz="8" w:color="334155" w:space="0"/>
+              <w:top w:val="single" w:sz="8" w:space="0" w:color="334155"/>
+              <w:left w:val="single" w:sz="8" w:space="0" w:color="334155"/>
+              <w:right w:val="single" w:sz="8" w:space="0" w:color="334155"/>
             </w:tcBorders>
           </w:tcPr>
           <w:p>
@@ -2113,14 +2194,17 @@
               <w:right w:w="90" w:type="dxa"/>
             </w:tcMar>
             <w:tcBorders>
-              <w:bottom w:val="single" w:sz="4" w:color="CBD5E1"/>
+              <w:bottom w:val="single" w:sz="14" w:color="0F172A" w:space="0"/>
+              <w:top w:val="single" w:sz="14" w:space="0" w:color="0F172A"/>
+              <w:left w:val="single" w:sz="14" w:space="0" w:color="0F172A"/>
+              <w:right w:val="single" w:sz="14" w:space="0" w:color="0F172A"/>
             </w:tcBorders>
           </w:tcPr>
           <w:p>
             <w:pPr>
               <w:spacing w:before="20" w:after="20" w:line="240" w:lineRule="auto"/>
               <w:pBdr>
-                <w:bottom w:val="single" w:sz="5" w:space="1" w:color="CBD5E1"/>
+                <w:bottom w:val="single" w:sz="10" w:space="1" w:color="0F172A"/>
               </w:pBdr>
             </w:pPr>
           </w:p>
@@ -2245,7 +2329,7 @@
       <w:pPr>
         <w:spacing w:after="80" w:before="20" w:line="240" w:lineRule="auto"/>
         <w:pBdr>
-          <w:bottom w:val="single" w:sz="5" w:space="1" w:color="94A3B8"/>
+          <w:bottom w:val="single" w:sz="10" w:space="1" w:color="0F172A"/>
         </w:pBdr>
       </w:pPr>
     </w:p>
@@ -2261,7 +2345,7 @@
       <w:pPr>
         <w:spacing w:after="80" w:before="20" w:line="240" w:lineRule="auto"/>
         <w:pBdr>
-          <w:bottom w:val="single" w:sz="5" w:space="1" w:color="94A3B8"/>
+          <w:bottom w:val="single" w:sz="10" w:space="1" w:color="0F172A"/>
         </w:pBdr>
       </w:pPr>
     </w:p>
@@ -2323,6 +2407,12 @@
               <w:bottom w:w="90" w:type="dxa"/>
               <w:right w:w="100" w:type="dxa"/>
             </w:tcMar>
+            <w:tcBorders>
+              <w:top w:val="single" w:sz="8" w:space="0" w:color="0F172A"/>
+              <w:left w:val="single" w:sz="8" w:space="0" w:color="0F172A"/>
+              <w:bottom w:val="single" w:sz="8" w:space="0" w:color="0F172A"/>
+              <w:right w:val="single" w:sz="8" w:space="0" w:color="0F172A"/>
+            </w:tcBorders>
           </w:tcPr>
           <w:p>
             <w:pPr>
@@ -2348,6 +2438,12 @@
               <w:bottom w:w="90" w:type="dxa"/>
               <w:right w:w="100" w:type="dxa"/>
             </w:tcMar>
+            <w:tcBorders>
+              <w:top w:val="single" w:sz="8" w:space="0" w:color="0F172A"/>
+              <w:left w:val="single" w:sz="8" w:space="0" w:color="0F172A"/>
+              <w:bottom w:val="single" w:sz="8" w:space="0" w:color="0F172A"/>
+              <w:right w:val="single" w:sz="8" w:space="0" w:color="0F172A"/>
+            </w:tcBorders>
           </w:tcPr>
           <w:p>
             <w:pPr>
@@ -2378,6 +2474,12 @@
               <w:bottom w:w="120" w:type="dxa"/>
               <w:right w:w="140" w:type="dxa"/>
             </w:tcMar>
+            <w:tcBorders>
+              <w:top w:val="single" w:sz="8" w:space="0" w:color="0F172A"/>
+              <w:left w:val="single" w:sz="8" w:space="0" w:color="0F172A"/>
+              <w:bottom w:val="single" w:sz="8" w:space="0" w:color="0F172A"/>
+              <w:right w:val="single" w:sz="8" w:space="0" w:color="0F172A"/>
+            </w:tcBorders>
           </w:tcPr>
           <w:p>
             <w:pPr>
@@ -2408,6 +2510,12 @@
               <w:bottom w:w="120" w:type="dxa"/>
               <w:right w:w="140" w:type="dxa"/>
             </w:tcMar>
+            <w:tcBorders>
+              <w:top w:val="single" w:sz="8" w:space="0" w:color="0F172A"/>
+              <w:left w:val="single" w:sz="8" w:space="0" w:color="0F172A"/>
+              <w:bottom w:val="single" w:sz="8" w:space="0" w:color="0F172A"/>
+              <w:right w:val="single" w:sz="8" w:space="0" w:color="0F172A"/>
+            </w:tcBorders>
           </w:tcPr>
           <w:p>
             <w:pPr>
@@ -2454,7 +2562,7 @@
       <w:pPr>
         <w:spacing w:after="80" w:before="20" w:line="240" w:lineRule="auto"/>
         <w:pBdr>
-          <w:bottom w:val="single" w:sz="5" w:space="1" w:color="94A3B8"/>
+          <w:bottom w:val="single" w:sz="10" w:space="1" w:color="0F172A"/>
         </w:pBdr>
       </w:pPr>
     </w:p>
@@ -2462,7 +2570,7 @@
       <w:pPr>
         <w:spacing w:after="80" w:before="20" w:line="240" w:lineRule="auto"/>
         <w:pBdr>
-          <w:bottom w:val="single" w:sz="5" w:space="1" w:color="94A3B8"/>
+          <w:bottom w:val="single" w:sz="10" w:space="1" w:color="0F172A"/>
         </w:pBdr>
       </w:pPr>
     </w:p>
@@ -2546,7 +2654,10 @@
               <w:right w:w="60" w:type="dxa"/>
             </w:tcMar>
             <w:tcBorders>
-              <w:bottom w:val="single" w:sz="3" w:color="E2E8F0"/>
+              <w:bottom w:val="single" w:sz="8" w:color="334155" w:space="0"/>
+              <w:top w:val="single" w:sz="8" w:space="0" w:color="334155"/>
+              <w:left w:val="single" w:sz="8" w:space="0" w:color="334155"/>
+              <w:right w:val="single" w:sz="8" w:space="0" w:color="334155"/>
             </w:tcBorders>
           </w:tcPr>
           <w:p>
@@ -2569,7 +2680,10 @@
               <w:right w:w="60" w:type="dxa"/>
             </w:tcMar>
             <w:tcBorders>
-              <w:bottom w:val="single" w:sz="3" w:color="E2E8F0"/>
+              <w:bottom w:val="single" w:sz="8" w:color="334155" w:space="0"/>
+              <w:top w:val="single" w:sz="8" w:space="0" w:color="334155"/>
+              <w:left w:val="single" w:sz="8" w:space="0" w:color="334155"/>
+              <w:right w:val="single" w:sz="8" w:space="0" w:color="334155"/>
             </w:tcBorders>
           </w:tcPr>
           <w:p>
@@ -2597,7 +2711,10 @@
               <w:right w:w="60" w:type="dxa"/>
             </w:tcMar>
             <w:tcBorders>
-              <w:bottom w:val="single" w:sz="3" w:color="E2E8F0"/>
+              <w:bottom w:val="single" w:sz="8" w:color="334155" w:space="0"/>
+              <w:top w:val="single" w:sz="8" w:space="0" w:color="334155"/>
+              <w:left w:val="single" w:sz="8" w:space="0" w:color="334155"/>
+              <w:right w:val="single" w:sz="8" w:space="0" w:color="334155"/>
             </w:tcBorders>
           </w:tcPr>
           <w:p>
@@ -2620,7 +2737,10 @@
               <w:right w:w="60" w:type="dxa"/>
             </w:tcMar>
             <w:tcBorders>
-              <w:bottom w:val="single" w:sz="3" w:color="E2E8F0"/>
+              <w:bottom w:val="single" w:sz="8" w:color="334155" w:space="0"/>
+              <w:top w:val="single" w:sz="8" w:space="0" w:color="334155"/>
+              <w:left w:val="single" w:sz="8" w:space="0" w:color="334155"/>
+              <w:right w:val="single" w:sz="8" w:space="0" w:color="334155"/>
             </w:tcBorders>
           </w:tcPr>
           <w:p>
@@ -2648,7 +2768,10 @@
               <w:right w:w="60" w:type="dxa"/>
             </w:tcMar>
             <w:tcBorders>
-              <w:bottom w:val="single" w:sz="3" w:color="E2E8F0"/>
+              <w:bottom w:val="single" w:sz="8" w:color="334155" w:space="0"/>
+              <w:top w:val="single" w:sz="8" w:space="0" w:color="334155"/>
+              <w:left w:val="single" w:sz="8" w:space="0" w:color="334155"/>
+              <w:right w:val="single" w:sz="8" w:space="0" w:color="334155"/>
             </w:tcBorders>
           </w:tcPr>
           <w:p>
@@ -2671,7 +2794,10 @@
               <w:right w:w="60" w:type="dxa"/>
             </w:tcMar>
             <w:tcBorders>
-              <w:bottom w:val="single" w:sz="3" w:color="E2E8F0"/>
+              <w:bottom w:val="single" w:sz="8" w:color="334155" w:space="0"/>
+              <w:top w:val="single" w:sz="8" w:space="0" w:color="334155"/>
+              <w:left w:val="single" w:sz="8" w:space="0" w:color="334155"/>
+              <w:right w:val="single" w:sz="8" w:space="0" w:color="334155"/>
             </w:tcBorders>
           </w:tcPr>
           <w:p>
@@ -2733,7 +2859,10 @@
               <w:right w:w="60" w:type="dxa"/>
             </w:tcMar>
             <w:tcBorders>
-              <w:bottom w:val="single" w:sz="3" w:color="E2E8F0"/>
+              <w:bottom w:val="single" w:sz="8" w:color="334155" w:space="0"/>
+              <w:top w:val="single" w:sz="8" w:space="0" w:color="334155"/>
+              <w:left w:val="single" w:sz="8" w:space="0" w:color="334155"/>
+              <w:right w:val="single" w:sz="8" w:space="0" w:color="334155"/>
             </w:tcBorders>
           </w:tcPr>
           <w:p>
@@ -2756,7 +2885,10 @@
               <w:right w:w="60" w:type="dxa"/>
             </w:tcMar>
             <w:tcBorders>
-              <w:bottom w:val="single" w:sz="3" w:color="E2E8F0"/>
+              <w:bottom w:val="single" w:sz="8" w:color="334155" w:space="0"/>
+              <w:top w:val="single" w:sz="8" w:space="0" w:color="334155"/>
+              <w:left w:val="single" w:sz="8" w:space="0" w:color="334155"/>
+              <w:right w:val="single" w:sz="8" w:space="0" w:color="334155"/>
             </w:tcBorders>
           </w:tcPr>
           <w:p>
@@ -2784,7 +2916,10 @@
               <w:right w:w="60" w:type="dxa"/>
             </w:tcMar>
             <w:tcBorders>
-              <w:bottom w:val="single" w:sz="3" w:color="E2E8F0"/>
+              <w:bottom w:val="single" w:sz="8" w:color="334155" w:space="0"/>
+              <w:top w:val="single" w:sz="8" w:space="0" w:color="334155"/>
+              <w:left w:val="single" w:sz="8" w:space="0" w:color="334155"/>
+              <w:right w:val="single" w:sz="8" w:space="0" w:color="334155"/>
             </w:tcBorders>
           </w:tcPr>
           <w:p>
@@ -2807,7 +2942,10 @@
               <w:right w:w="60" w:type="dxa"/>
             </w:tcMar>
             <w:tcBorders>
-              <w:bottom w:val="single" w:sz="3" w:color="E2E8F0"/>
+              <w:bottom w:val="single" w:sz="8" w:color="334155" w:space="0"/>
+              <w:top w:val="single" w:sz="8" w:space="0" w:color="334155"/>
+              <w:left w:val="single" w:sz="8" w:space="0" w:color="334155"/>
+              <w:right w:val="single" w:sz="8" w:space="0" w:color="334155"/>
             </w:tcBorders>
           </w:tcPr>
           <w:p>
@@ -2835,7 +2973,10 @@
               <w:right w:w="60" w:type="dxa"/>
             </w:tcMar>
             <w:tcBorders>
-              <w:bottom w:val="single" w:sz="3" w:color="E2E8F0"/>
+              <w:bottom w:val="single" w:sz="8" w:color="334155" w:space="0"/>
+              <w:top w:val="single" w:sz="8" w:space="0" w:color="334155"/>
+              <w:left w:val="single" w:sz="8" w:space="0" w:color="334155"/>
+              <w:right w:val="single" w:sz="8" w:space="0" w:color="334155"/>
             </w:tcBorders>
           </w:tcPr>
           <w:p>
@@ -2858,7 +2999,10 @@
               <w:right w:w="60" w:type="dxa"/>
             </w:tcMar>
             <w:tcBorders>
-              <w:bottom w:val="single" w:sz="3" w:color="E2E8F0"/>
+              <w:bottom w:val="single" w:sz="8" w:color="334155" w:space="0"/>
+              <w:top w:val="single" w:sz="8" w:space="0" w:color="334155"/>
+              <w:left w:val="single" w:sz="8" w:space="0" w:color="334155"/>
+              <w:right w:val="single" w:sz="8" w:space="0" w:color="334155"/>
             </w:tcBorders>
           </w:tcPr>
           <w:p>
@@ -2920,7 +3064,10 @@
               <w:right w:w="60" w:type="dxa"/>
             </w:tcMar>
             <w:tcBorders>
-              <w:bottom w:val="single" w:sz="3" w:color="E2E8F0"/>
+              <w:bottom w:val="single" w:sz="8" w:color="334155" w:space="0"/>
+              <w:top w:val="single" w:sz="8" w:space="0" w:color="334155"/>
+              <w:left w:val="single" w:sz="8" w:space="0" w:color="334155"/>
+              <w:right w:val="single" w:sz="8" w:space="0" w:color="334155"/>
             </w:tcBorders>
           </w:tcPr>
           <w:p>
@@ -2943,7 +3090,10 @@
               <w:right w:w="60" w:type="dxa"/>
             </w:tcMar>
             <w:tcBorders>
-              <w:bottom w:val="single" w:sz="3" w:color="E2E8F0"/>
+              <w:bottom w:val="single" w:sz="8" w:color="334155" w:space="0"/>
+              <w:top w:val="single" w:sz="8" w:space="0" w:color="334155"/>
+              <w:left w:val="single" w:sz="8" w:space="0" w:color="334155"/>
+              <w:right w:val="single" w:sz="8" w:space="0" w:color="334155"/>
             </w:tcBorders>
           </w:tcPr>
           <w:p>
@@ -2971,7 +3121,10 @@
               <w:right w:w="60" w:type="dxa"/>
             </w:tcMar>
             <w:tcBorders>
-              <w:bottom w:val="single" w:sz="3" w:color="E2E8F0"/>
+              <w:bottom w:val="single" w:sz="8" w:color="334155" w:space="0"/>
+              <w:top w:val="single" w:sz="8" w:space="0" w:color="334155"/>
+              <w:left w:val="single" w:sz="8" w:space="0" w:color="334155"/>
+              <w:right w:val="single" w:sz="8" w:space="0" w:color="334155"/>
             </w:tcBorders>
           </w:tcPr>
           <w:p>
@@ -2994,7 +3147,10 @@
               <w:right w:w="60" w:type="dxa"/>
             </w:tcMar>
             <w:tcBorders>
-              <w:bottom w:val="single" w:sz="3" w:color="E2E8F0"/>
+              <w:bottom w:val="single" w:sz="8" w:color="334155" w:space="0"/>
+              <w:top w:val="single" w:sz="8" w:space="0" w:color="334155"/>
+              <w:left w:val="single" w:sz="8" w:space="0" w:color="334155"/>
+              <w:right w:val="single" w:sz="8" w:space="0" w:color="334155"/>
             </w:tcBorders>
           </w:tcPr>
           <w:p>
@@ -3022,7 +3178,10 @@
               <w:right w:w="60" w:type="dxa"/>
             </w:tcMar>
             <w:tcBorders>
-              <w:bottom w:val="single" w:sz="3" w:color="E2E8F0"/>
+              <w:bottom w:val="single" w:sz="8" w:color="334155" w:space="0"/>
+              <w:top w:val="single" w:sz="8" w:space="0" w:color="334155"/>
+              <w:left w:val="single" w:sz="8" w:space="0" w:color="334155"/>
+              <w:right w:val="single" w:sz="8" w:space="0" w:color="334155"/>
             </w:tcBorders>
           </w:tcPr>
           <w:p>
@@ -3045,7 +3204,10 @@
               <w:right w:w="60" w:type="dxa"/>
             </w:tcMar>
             <w:tcBorders>
-              <w:bottom w:val="single" w:sz="3" w:color="E2E8F0"/>
+              <w:bottom w:val="single" w:sz="8" w:color="334155" w:space="0"/>
+              <w:top w:val="single" w:sz="8" w:space="0" w:color="334155"/>
+              <w:left w:val="single" w:sz="8" w:space="0" w:color="334155"/>
+              <w:right w:val="single" w:sz="8" w:space="0" w:color="334155"/>
             </w:tcBorders>
           </w:tcPr>
           <w:p>
@@ -3125,7 +3287,7 @@
       <w:pPr>
         <w:spacing w:after="80" w:before="20" w:line="240" w:lineRule="auto"/>
         <w:pBdr>
-          <w:bottom w:val="single" w:sz="5" w:space="1" w:color="94A3B8"/>
+          <w:bottom w:val="single" w:sz="10" w:space="1" w:color="0F172A"/>
         </w:pBdr>
       </w:pPr>
     </w:p>
@@ -3133,7 +3295,7 @@
       <w:pPr>
         <w:spacing w:after="80" w:before="20" w:line="240" w:lineRule="auto"/>
         <w:pBdr>
-          <w:bottom w:val="single" w:sz="5" w:space="1" w:color="94A3B8"/>
+          <w:bottom w:val="single" w:sz="10" w:space="1" w:color="0F172A"/>
         </w:pBdr>
       </w:pPr>
     </w:p>
@@ -3149,7 +3311,7 @@
       <w:pPr>
         <w:spacing w:after="80" w:before="20" w:line="240" w:lineRule="auto"/>
         <w:pBdr>
-          <w:bottom w:val="single" w:sz="5" w:space="1" w:color="94A3B8"/>
+          <w:bottom w:val="single" w:sz="10" w:space="1" w:color="0F172A"/>
         </w:pBdr>
       </w:pPr>
     </w:p>
@@ -3260,7 +3422,7 @@
       <w:pPr>
         <w:spacing w:before="20" w:after="80" w:line="240" w:lineRule="auto"/>
         <w:pBdr>
-          <w:bottom w:val="single" w:sz="5" w:space="1" w:color="94A3B8"/>
+          <w:bottom w:val="single" w:sz="10" w:space="1" w:color="0F172A"/>
         </w:pBdr>
       </w:pPr>
     </w:p>
@@ -3310,7 +3472,7 @@
       <w:pPr>
         <w:spacing w:before="20" w:after="80" w:line="240" w:lineRule="auto"/>
         <w:pBdr>
-          <w:bottom w:val="single" w:sz="5" w:space="1" w:color="94A3B8"/>
+          <w:bottom w:val="single" w:sz="10" w:space="1" w:color="0F172A"/>
         </w:pBdr>
       </w:pPr>
     </w:p>

</xml_diff>